<commit_message>
feat(master-doc): CR Art 11 — Hsieh & Chen 2011
Strategic Fit Triad (Porter generics × HR strategy × reward system)
conceptual review; all 5 sub-sections within ±15% word targets;
build confirms 1 missing section (Art 12 pending).
</commit_message>
<xml_diff>
--- a/01079_Dzaki Muhammad Yusfian_Master Consolidated Study Document.docx
+++ b/01079_Dzaki Muhammad Yusfian_Master Consolidated Study Document.docx
@@ -38998,6 +38998,3877 @@
     <w:bookmarkEnd w:id="181"/>
     <w:bookmarkEnd w:id="182"/>
     <w:bookmarkEnd w:id="183"/>
+    <w:bookmarkStart w:id="190" w:name="bagian-iii-critical-review-artikel-10"/>
+    <w:p>
+      <w:pPr>
+        <w:pStyle w:val="Heading1"/>
+      </w:pPr>
+      <w:r>
+        <w:t xml:space="preserve">BAGIAN III — CRITICAL REVIEW ARTIKEL 10</w:t>
+      </w:r>
+    </w:p>
+    <w:bookmarkStart w:id="189" w:name="Xbf447e242074d791b7882d3a31469e20f007252"/>
+    <w:p>
+      <w:pPr>
+        <w:pStyle w:val="Heading2"/>
+      </w:pPr>
+      <w:r>
+        <w:t xml:space="preserve">Onditi, E. O. (2018) —</w:t>
+      </w:r>
+      <w:r>
+        <w:t xml:space="preserve"> </w:t>
+      </w:r>
+      <w:r>
+        <w:rPr>
+          <w:i/>
+          <w:iCs/>
+        </w:rPr>
+        <w:t xml:space="preserve">Competitive Strategies and Firm Performance: A Review of Literature</w:t>
+      </w:r>
+    </w:p>
+    <w:p>
+      <w:pPr>
+        <w:pStyle w:val="FirstParagraph"/>
+      </w:pPr>
+      <w:r>
+        <w:rPr>
+          <w:b/>
+          <w:bCs/>
+        </w:rPr>
+        <w:t xml:space="preserve">Sitasi lengkap:</w:t>
+      </w:r>
+      <w:r>
+        <w:t xml:space="preserve"> </w:t>
+      </w:r>
+      <w:r>
+        <w:t xml:space="preserve">Onditi, E. O. (2018). Competitive Strategies and Firm Performance: A Review of Literature.</w:t>
+      </w:r>
+      <w:r>
+        <w:t xml:space="preserve"> </w:t>
+      </w:r>
+      <w:r>
+        <w:rPr>
+          <w:i/>
+          <w:iCs/>
+        </w:rPr>
+        <w:t xml:space="preserve">Strategic Journals</w:t>
+      </w:r>
+      <w:r>
+        <w:t xml:space="preserve">, 5(4), 1869–1879.</w:t>
+      </w:r>
+    </w:p>
+    <w:p>
+      <w:r>
+        <w:pict>
+          <v:rect style="width:0;height:1.5pt" o:hralign="center" o:hrstd="t" o:hr="t"/>
+        </w:pict>
+      </w:r>
+    </w:p>
+    <w:bookmarkStart w:id="184" w:name="ringkasan-inti-9"/>
+    <w:p>
+      <w:pPr>
+        <w:pStyle w:val="Heading3"/>
+      </w:pPr>
+      <w:r>
+        <w:t xml:space="preserve">Ringkasan Inti</w:t>
+      </w:r>
+    </w:p>
+    <w:p>
+      <w:pPr>
+        <w:pStyle w:val="FirstParagraph"/>
+      </w:pPr>
+      <w:r>
+        <w:t xml:space="preserve">Onditi (2018) menyajikan tinjauan literatur konseptual (</w:t>
+      </w:r>
+      <w:r>
+        <w:rPr>
+          <w:i/>
+          <w:iCs/>
+        </w:rPr>
+        <w:t xml:space="preserve">conceptual literature review</w:t>
+      </w:r>
+      <w:r>
+        <w:t xml:space="preserve">) yang bertujuan mengevaluasi hubungan antara</w:t>
+      </w:r>
+      <w:r>
+        <w:t xml:space="preserve"> </w:t>
+      </w:r>
+      <w:r>
+        <w:rPr>
+          <w:b/>
+          <w:bCs/>
+        </w:rPr>
+        <w:t xml:space="preserve">strategi kompetitif</w:t>
+      </w:r>
+      <w:r>
+        <w:t xml:space="preserve"> </w:t>
+      </w:r>
+      <w:r>
+        <w:t xml:space="preserve">dan</w:t>
+      </w:r>
+      <w:r>
+        <w:t xml:space="preserve"> </w:t>
+      </w:r>
+      <w:r>
+        <w:rPr>
+          <w:b/>
+          <w:bCs/>
+        </w:rPr>
+        <w:t xml:space="preserve">kinerja perusahaan</w:t>
+      </w:r>
+      <w:r>
+        <w:t xml:space="preserve"> </w:t>
+      </w:r>
+      <w:r>
+        <w:t xml:space="preserve">melalui sintesis literatur yang ada. Diterbitkan di</w:t>
+      </w:r>
+      <w:r>
+        <w:t xml:space="preserve"> </w:t>
+      </w:r>
+      <w:r>
+        <w:rPr>
+          <w:i/>
+          <w:iCs/>
+        </w:rPr>
+        <w:t xml:space="preserve">The Strategic Journal of Business &amp; Change Management</w:t>
+      </w:r>
+      <w:r>
+        <w:t xml:space="preserve"> </w:t>
+      </w:r>
+      <w:r>
+        <w:t xml:space="preserve">Vol. 5 No. 4, artikel ini berasal dari konteks akademik Afrika Timur — penulis berafiliasi dengan Jaffery Institute of Professional Studies, Mombasa, Kenya. Artikel ini tidak menghasilkan data empiris primer; kontribusinya terletak pada pemetaan lanskap teoritis dan empiris, identifikasi kesenjangan pengetahuan, serta proposisi model konseptual untuk penelitian lanjutan.</w:t>
+      </w:r>
+    </w:p>
+    <w:p>
+      <w:pPr>
+        <w:pStyle w:val="BodyText"/>
+      </w:pPr>
+      <w:r>
+        <w:t xml:space="preserve">Onditi memulai dengan premis bahwa intensitas persaingan pasar yang semakin tinggi memaksa perusahaan untuk memilih strategi yang sesuai dengan kemampuan mereka. Ia mengintegrasikan dua kerangka strategi utama: tiga strategi generik Porter (1980) —</w:t>
+      </w:r>
+      <w:r>
+        <w:t xml:space="preserve"> </w:t>
+      </w:r>
+      <w:r>
+        <w:rPr>
+          <w:i/>
+          <w:iCs/>
+        </w:rPr>
+        <w:t xml:space="preserve">cost leadership</w:t>
+      </w:r>
+      <w:r>
+        <w:t xml:space="preserve">,</w:t>
+      </w:r>
+      <w:r>
+        <w:t xml:space="preserve"> </w:t>
+      </w:r>
+      <w:r>
+        <w:rPr>
+          <w:i/>
+          <w:iCs/>
+        </w:rPr>
+        <w:t xml:space="preserve">differentiation</w:t>
+      </w:r>
+      <w:r>
+        <w:t xml:space="preserve">, dan</w:t>
+      </w:r>
+      <w:r>
+        <w:t xml:space="preserve"> </w:t>
+      </w:r>
+      <w:r>
+        <w:rPr>
+          <w:i/>
+          <w:iCs/>
+        </w:rPr>
+        <w:t xml:space="preserve">focus</w:t>
+      </w:r>
+      <w:r>
+        <w:t xml:space="preserve"> </w:t>
+      </w:r>
+      <w:r>
+        <w:t xml:space="preserve">— serta model</w:t>
+      </w:r>
+      <w:r>
+        <w:t xml:space="preserve"> </w:t>
+      </w:r>
+      <w:r>
+        <w:rPr>
+          <w:i/>
+          <w:iCs/>
+        </w:rPr>
+        <w:t xml:space="preserve">value disciplines</w:t>
+      </w:r>
+      <w:r>
+        <w:t xml:space="preserve"> </w:t>
+      </w:r>
+      <w:r>
+        <w:t xml:space="preserve">Treacy dan Wiersema (1993) yang terdiri dari</w:t>
+      </w:r>
+      <w:r>
+        <w:t xml:space="preserve"> </w:t>
+      </w:r>
+      <w:r>
+        <w:rPr>
+          <w:i/>
+          <w:iCs/>
+        </w:rPr>
+        <w:t xml:space="preserve">operational excellence</w:t>
+      </w:r>
+      <w:r>
+        <w:t xml:space="preserve">,</w:t>
+      </w:r>
+      <w:r>
+        <w:t xml:space="preserve"> </w:t>
+      </w:r>
+      <w:r>
+        <w:rPr>
+          <w:i/>
+          <w:iCs/>
+        </w:rPr>
+        <w:t xml:space="preserve">product leadership</w:t>
+      </w:r>
+      <w:r>
+        <w:t xml:space="preserve">, dan</w:t>
+      </w:r>
+      <w:r>
+        <w:t xml:space="preserve"> </w:t>
+      </w:r>
+      <w:r>
+        <w:rPr>
+          <w:i/>
+          <w:iCs/>
+        </w:rPr>
+        <w:t xml:space="preserve">customer intimacy</w:t>
+      </w:r>
+      <w:r>
+        <w:t xml:space="preserve">. Kerangka Treacy-Wiersema diposisikan sebagai alternatif yang lebih fleksibel dibandingkan tipologi Porter yang kaku.</w:t>
+      </w:r>
+    </w:p>
+    <w:p>
+      <w:pPr>
+        <w:pStyle w:val="BodyText"/>
+      </w:pPr>
+      <w:r>
+        <w:t xml:space="preserve">Untuk menjelaskan mekanisme kausal di balik hubungan strategi–kinerja, Onditi mengintegrasikan tiga perspektif teoretis:</w:t>
+      </w:r>
+      <w:r>
+        <w:t xml:space="preserve"> </w:t>
+      </w:r>
+      <w:r>
+        <w:rPr>
+          <w:b/>
+          <w:bCs/>
+        </w:rPr>
+        <w:t xml:space="preserve">Resource-Based View</w:t>
+      </w:r>
+      <w:r>
+        <w:t xml:space="preserve"> </w:t>
+      </w:r>
+      <w:r>
+        <w:t xml:space="preserve">(RBV, Wernerfelt 1984; Barney 1991) yang menekankan sumber daya internal sebagai sumber keunggulan kompetitif;</w:t>
+      </w:r>
+      <w:r>
+        <w:t xml:space="preserve"> </w:t>
+      </w:r>
+      <w:r>
+        <w:rPr>
+          <w:b/>
+          <w:bCs/>
+        </w:rPr>
+        <w:t xml:space="preserve">Capability-Based View</w:t>
+      </w:r>
+      <w:r>
+        <w:t xml:space="preserve"> </w:t>
+      </w:r>
+      <w:r>
+        <w:t xml:space="preserve">(KBV, Grant 1991; Teece et al. 1997) yang berfokus pada kemampuan dinamis; dan</w:t>
+      </w:r>
+      <w:r>
+        <w:t xml:space="preserve"> </w:t>
+      </w:r>
+      <w:r>
+        <w:rPr>
+          <w:b/>
+          <w:bCs/>
+        </w:rPr>
+        <w:t xml:space="preserve">Market-Based View</w:t>
+      </w:r>
+      <w:r>
+        <w:t xml:space="preserve"> </w:t>
+      </w:r>
+      <w:r>
+        <w:t xml:space="preserve">(MBV, Porter 1985; Peteraf 1993) yang menempatkan faktor industri dan orientasi pasar eksternal sebagai penentu kinerja. Integrasi ketiga perspektif ini adalah nilai tambah utama dibandingkan tinjauan literatur sebelumnya yang umumnya hanya mengandalkan satu perspektif.</w:t>
+      </w:r>
+    </w:p>
+    <w:p>
+      <w:pPr>
+        <w:pStyle w:val="BodyText"/>
+      </w:pPr>
+      <w:r>
+        <w:t xml:space="preserve">Berdasarkan identifikasi kesenjangan dalam literatur, Onditi mengusulkan model konseptual yang menempatkan</w:t>
+      </w:r>
+      <w:r>
+        <w:t xml:space="preserve"> </w:t>
+      </w:r>
+      <w:r>
+        <w:rPr>
+          <w:b/>
+          <w:bCs/>
+        </w:rPr>
+        <w:t xml:space="preserve">karakteristik perusahaan</w:t>
+      </w:r>
+      <w:r>
+        <w:t xml:space="preserve"> </w:t>
+      </w:r>
+      <w:r>
+        <w:t xml:space="preserve">(</w:t>
+      </w:r>
+      <w:r>
+        <w:rPr>
+          <w:i/>
+          <w:iCs/>
+        </w:rPr>
+        <w:t xml:space="preserve">firm characteristics</w:t>
+      </w:r>
+      <w:r>
+        <w:t xml:space="preserve">) sebagai variabel moderasi dalam hubungan strategi kompetitif dan kinerja. Dua hipotesis konseptual diajukan: H1 bahwa strategi kompetitif secara signifikan mempengaruhi kinerja, dan H2 bahwa karakteristik perusahaan secara signifikan memoderasi hubungan tersebut. Kedua hipotesis ini tidak diuji secara empiris dalam paper; artikel ini adalah</w:t>
+      </w:r>
+      <w:r>
+        <w:t xml:space="preserve"> </w:t>
+      </w:r>
+      <w:r>
+        <w:rPr>
+          <w:i/>
+          <w:iCs/>
+        </w:rPr>
+        <w:t xml:space="preserve">agenda setter</w:t>
+      </w:r>
+      <w:r>
+        <w:t xml:space="preserve"> </w:t>
+      </w:r>
+      <w:r>
+        <w:t xml:space="preserve">untuk penelitian berikutnya, bukan pengujian hipotesis.</w:t>
+      </w:r>
+    </w:p>
+    <w:p>
+      <w:r>
+        <w:pict>
+          <v:rect style="width:0;height:1.5pt" o:hralign="center" o:hrstd="t" o:hr="t"/>
+        </w:pict>
+      </w:r>
+    </w:p>
+    <w:bookmarkEnd w:id="184"/>
+    <w:bookmarkStart w:id="185" w:name="temuan-utama-9"/>
+    <w:p>
+      <w:pPr>
+        <w:pStyle w:val="Heading3"/>
+      </w:pPr>
+      <w:r>
+        <w:t xml:space="preserve">Temuan Utama</w:t>
+      </w:r>
+    </w:p>
+    <w:p>
+      <w:pPr>
+        <w:pStyle w:val="FirstParagraph"/>
+      </w:pPr>
+      <w:r>
+        <w:rPr>
+          <w:b/>
+          <w:bCs/>
+        </w:rPr>
+        <w:t xml:space="preserve">Strategi Generik Porter dan Kinerja.</w:t>
+      </w:r>
+      <w:r>
+        <w:t xml:space="preserve"> </w:t>
+      </w:r>
+      <w:r>
+        <w:t xml:space="preserve">Onditi mensintesis bahwa ketiga strategi generik Porter secara umum berkorelasi positif dengan kinerja, namun pola hubungannya sangat tidak konsisten antar-studi.</w:t>
+      </w:r>
+      <w:r>
+        <w:t xml:space="preserve"> </w:t>
+      </w:r>
+      <w:r>
+        <w:rPr>
+          <w:i/>
+          <w:iCs/>
+        </w:rPr>
+        <w:t xml:space="preserve">Cost leadership</w:t>
+      </w:r>
+      <w:r>
+        <w:t xml:space="preserve"> </w:t>
+      </w:r>
+      <w:r>
+        <w:t xml:space="preserve">didukung secara positif oleh lima studi (antara lain Yamin et al. 1999; Allen &amp; Helms 2006; Parnell 2010; Teeratansirikool et al. 2013), tetapi ditolak oleh dua studi lain (Yasar 2010; Akbolat &amp; Isik 2012).</w:t>
+      </w:r>
+      <w:r>
+        <w:t xml:space="preserve"> </w:t>
+      </w:r>
+      <w:r>
+        <w:rPr>
+          <w:i/>
+          <w:iCs/>
+        </w:rPr>
+        <w:t xml:space="preserve">Differentiation</w:t>
+      </w:r>
+      <w:r>
+        <w:t xml:space="preserve"> </w:t>
+      </w:r>
+      <w:r>
+        <w:t xml:space="preserve">menunjukkan pola serupa — dua studi mendukung (Parnell 2011; Teeratansirikool et al. 2013), dua menolak. Strategi</w:t>
+      </w:r>
+      <w:r>
+        <w:t xml:space="preserve"> </w:t>
+      </w:r>
+      <w:r>
+        <w:rPr>
+          <w:i/>
+          <w:iCs/>
+        </w:rPr>
+        <w:t xml:space="preserve">focus</w:t>
+      </w:r>
+      <w:r>
+        <w:t xml:space="preserve"> </w:t>
+      </w:r>
+      <w:r>
+        <w:t xml:space="preserve">menghadapi hasil paling inkonsisten: tiga studi menolak pengaruh positifnya. Onditi mengakui:</w:t>
+      </w:r>
+      <w:r>
+        <w:t xml:space="preserve"> </w:t>
+      </w:r>
+      <w:r>
+        <w:rPr>
+          <w:i/>
+          <w:iCs/>
+        </w:rPr>
+        <w:t xml:space="preserve">“the studies had also yielded inconsistent results on the generic strategies – firm performance relationship”</w:t>
+      </w:r>
+      <w:r>
+        <w:t xml:space="preserve"> </w:t>
+      </w:r>
+      <w:r>
+        <w:t xml:space="preserve">(p. 1875). Tampilan tabular (Tabel 1 artikel) berfungsi sebagai peta literatur yang berguna, meski inkonsistensinya tidak dijelaskan secara teoretis.</w:t>
+      </w:r>
+    </w:p>
+    <w:p>
+      <w:pPr>
+        <w:pStyle w:val="BodyText"/>
+      </w:pPr>
+      <w:r>
+        <w:rPr>
+          <w:b/>
+          <w:bCs/>
+        </w:rPr>
+        <w:t xml:space="preserve">Perdebatan Hybrid vs. Pure Strategy.</w:t>
+      </w:r>
+      <w:r>
+        <w:t xml:space="preserve"> </w:t>
+      </w:r>
+      <w:r>
+        <w:t xml:space="preserve">Onditi mendokumentasikan kontestasi antara Porter (1985) yang mempertahankan perlunya memilih satu strategi — mengejar dua sekaligus berisiko berakhir di posisi</w:t>
+      </w:r>
+      <w:r>
+        <w:t xml:space="preserve"> </w:t>
+      </w:r>
+      <w:r>
+        <w:rPr>
+          <w:i/>
+          <w:iCs/>
+        </w:rPr>
+        <w:t xml:space="preserve">stuck in the middle</w:t>
+      </w:r>
+      <w:r>
+        <w:t xml:space="preserve"> </w:t>
+      </w:r>
+      <w:r>
+        <w:t xml:space="preserve">— dengan serangkaian studi yang lebih baru. Spanos et al. (2004) di Yunani, Pertusa-Ortega et al. (2009) di Spanyol, Oyedijo (2012) di Nigeria, serta Miller dan Dess (1993) secara konsisten menemukan bahwa</w:t>
+      </w:r>
+      <w:r>
+        <w:t xml:space="preserve"> </w:t>
+      </w:r>
+      <w:r>
+        <w:rPr>
+          <w:b/>
+          <w:bCs/>
+        </w:rPr>
+        <w:t xml:space="preserve">strategi hybrid</w:t>
+      </w:r>
+      <w:r>
+        <w:t xml:space="preserve"> </w:t>
+      </w:r>
+      <w:r>
+        <w:t xml:space="preserve">yang menggabungkan elemen</w:t>
+      </w:r>
+      <w:r>
+        <w:t xml:space="preserve"> </w:t>
+      </w:r>
+      <w:r>
+        <w:rPr>
+          <w:i/>
+          <w:iCs/>
+        </w:rPr>
+        <w:t xml:space="preserve">cost</w:t>
+      </w:r>
+      <w:r>
+        <w:t xml:space="preserve"> </w:t>
+      </w:r>
+      <w:r>
+        <w:t xml:space="preserve">dan</w:t>
+      </w:r>
+      <w:r>
+        <w:t xml:space="preserve"> </w:t>
+      </w:r>
+      <w:r>
+        <w:rPr>
+          <w:i/>
+          <w:iCs/>
+        </w:rPr>
+        <w:t xml:space="preserve">differentiation</w:t>
+      </w:r>
+      <w:r>
+        <w:t xml:space="preserve"> </w:t>
+      </w:r>
+      <w:r>
+        <w:t xml:space="preserve">dapat menghasilkan kinerja superior dibandingkan strategi</w:t>
+      </w:r>
+      <w:r>
+        <w:t xml:space="preserve"> </w:t>
+      </w:r>
+      <w:r>
+        <w:rPr>
+          <w:i/>
+          <w:iCs/>
+        </w:rPr>
+        <w:t xml:space="preserve">pure</w:t>
+      </w:r>
+      <w:r>
+        <w:t xml:space="preserve">. Onditi menyimpulkan bahwa strategi hybrid</w:t>
+      </w:r>
+      <w:r>
+        <w:t xml:space="preserve"> </w:t>
+      </w:r>
+      <w:r>
+        <w:rPr>
+          <w:i/>
+          <w:iCs/>
+        </w:rPr>
+        <w:t xml:space="preserve">“have been shown to be viable and profitable”</w:t>
+      </w:r>
+      <w:r>
+        <w:t xml:space="preserve"> </w:t>
+      </w:r>
+      <w:r>
+        <w:t xml:space="preserve">(p. 1873), namun tidak menawarkan kerangka teoretis untuk menentukan kondisi di mana</w:t>
+      </w:r>
+      <w:r>
+        <w:t xml:space="preserve"> </w:t>
+      </w:r>
+      <w:r>
+        <w:rPr>
+          <w:i/>
+          <w:iCs/>
+        </w:rPr>
+        <w:t xml:space="preserve">pure</w:t>
+      </w:r>
+      <w:r>
+        <w:t xml:space="preserve"> </w:t>
+      </w:r>
+      <w:r>
+        <w:t xml:space="preserve">versus</w:t>
+      </w:r>
+      <w:r>
+        <w:t xml:space="preserve"> </w:t>
+      </w:r>
+      <w:r>
+        <w:rPr>
+          <w:i/>
+          <w:iCs/>
+        </w:rPr>
+        <w:t xml:space="preserve">hybrid</w:t>
+      </w:r>
+      <w:r>
+        <w:t xml:space="preserve"> </w:t>
+      </w:r>
+      <w:r>
+        <w:t xml:space="preserve">lebih sesuai.</w:t>
+      </w:r>
+    </w:p>
+    <w:p>
+      <w:pPr>
+        <w:pStyle w:val="BodyText"/>
+      </w:pPr>
+      <w:r>
+        <w:rPr>
+          <w:b/>
+          <w:bCs/>
+        </w:rPr>
+        <w:t xml:space="preserve">Model Value Disciplines Treacy-Wiersema.</w:t>
+      </w:r>
+      <w:r>
+        <w:t xml:space="preserve"> </w:t>
+      </w:r>
+      <w:r>
+        <w:rPr>
+          <w:i/>
+          <w:iCs/>
+        </w:rPr>
+        <w:t xml:space="preserve">Operational excellence</w:t>
+      </w:r>
+      <w:r>
+        <w:t xml:space="preserve"> </w:t>
+      </w:r>
+      <w:r>
+        <w:t xml:space="preserve">berfokus pada produksi dan pengiriman yang andal dengan biaya minimal;</w:t>
+      </w:r>
+      <w:r>
+        <w:t xml:space="preserve"> </w:t>
+      </w:r>
+      <w:r>
+        <w:rPr>
+          <w:i/>
+          <w:iCs/>
+        </w:rPr>
+        <w:t xml:space="preserve">product leadership</w:t>
+      </w:r>
+      <w:r>
+        <w:t xml:space="preserve"> </w:t>
+      </w:r>
+      <w:r>
+        <w:t xml:space="preserve">menuntut inovasi berkelanjutan agar produk pesaing menjadi usang;</w:t>
+      </w:r>
+      <w:r>
+        <w:t xml:space="preserve"> </w:t>
+      </w:r>
+      <w:r>
+        <w:rPr>
+          <w:i/>
+          <w:iCs/>
+        </w:rPr>
+        <w:t xml:space="preserve">customer intimacy</w:t>
+      </w:r>
+      <w:r>
+        <w:t xml:space="preserve"> </w:t>
+      </w:r>
+      <w:r>
+        <w:t xml:space="preserve">mensyaratkan pemahaman mendalam tentang kebutuhan spesifik segmen pelanggan yang sangat tersegmentasi. Onditi menekankan bahwa perusahaan yang gagal mengidentifikasi dan mematuhi satu</w:t>
+      </w:r>
+      <w:r>
+        <w:t xml:space="preserve"> </w:t>
+      </w:r>
+      <w:r>
+        <w:rPr>
+          <w:i/>
+          <w:iCs/>
+        </w:rPr>
+        <w:t xml:space="preserve">value discipline</w:t>
+      </w:r>
+      <w:r>
+        <w:t xml:space="preserve"> </w:t>
+      </w:r>
+      <w:r>
+        <w:t xml:space="preserve">cenderung kehilangan arah strategis karena mengejar inisiatif yang tidak konsisten.</w:t>
+      </w:r>
+    </w:p>
+    <w:p>
+      <w:pPr>
+        <w:pStyle w:val="BodyText"/>
+      </w:pPr>
+      <w:r>
+        <w:rPr>
+          <w:b/>
+          <w:bCs/>
+        </w:rPr>
+        <w:t xml:space="preserve">Tiga Perspektif Teoretis (RBV, KBV, MBV).</w:t>
+      </w:r>
+      <w:r>
+        <w:t xml:space="preserve"> </w:t>
+      </w:r>
+      <w:r>
+        <w:t xml:space="preserve">RBV (Wernerfelt 1984; Barney 1991) menempatkan sumber daya</w:t>
+      </w:r>
+      <w:r>
+        <w:t xml:space="preserve"> </w:t>
+      </w:r>
+      <w:r>
+        <w:rPr>
+          <w:i/>
+          <w:iCs/>
+        </w:rPr>
+        <w:t xml:space="preserve">VRIN</w:t>
+      </w:r>
+      <w:r>
+        <w:t xml:space="preserve"> </w:t>
+      </w:r>
+      <w:r>
+        <w:t xml:space="preserve">— bernilai, langka, tidak dapat ditiru, tidak dapat disubstitusi — sebagai sumber keunggulan kompetitif berkelanjutan. KBV (Grant 1991; Teece et al. 1997) memperhalus RBV dengan menekankan</w:t>
+      </w:r>
+      <w:r>
+        <w:t xml:space="preserve"> </w:t>
+      </w:r>
+      <w:r>
+        <w:rPr>
+          <w:i/>
+          <w:iCs/>
+        </w:rPr>
+        <w:t xml:space="preserve">dynamic capabilities</w:t>
+      </w:r>
+      <w:r>
+        <w:t xml:space="preserve">: kemampuan mengintegrasikan dan mengkonfigurasi ulang kompetensi untuk merespons perubahan cepat. MBV (Porter 1985; Peteraf 1993) menggeser perhatian ke luar: struktur industri melalui</w:t>
+      </w:r>
+      <w:r>
+        <w:t xml:space="preserve"> </w:t>
+      </w:r>
+      <w:r>
+        <w:rPr>
+          <w:i/>
+          <w:iCs/>
+        </w:rPr>
+        <w:t xml:space="preserve">five forces</w:t>
+      </w:r>
+      <w:r>
+        <w:t xml:space="preserve"> </w:t>
+      </w:r>
+      <w:r>
+        <w:t xml:space="preserve">— persaingan, hambatan masuk, ancaman substitusi, daya tawar pemasok dan pembeli — menentukan posisi kompetitif dan kinerja.</w:t>
+      </w:r>
+    </w:p>
+    <w:p>
+      <w:pPr>
+        <w:pStyle w:val="BodyText"/>
+      </w:pPr>
+      <w:r>
+        <w:rPr>
+          <w:b/>
+          <w:bCs/>
+        </w:rPr>
+        <w:t xml:space="preserve">Pengukuran Kinerja dan Model Konseptual.</w:t>
+      </w:r>
+      <w:r>
+        <w:t xml:space="preserve"> </w:t>
+      </w:r>
+      <w:r>
+        <w:t xml:space="preserve">Onditi membahas perdebatan ukuran kinerja:</w:t>
+      </w:r>
+      <w:r>
+        <w:t xml:space="preserve"> </w:t>
+      </w:r>
+      <w:r>
+        <w:rPr>
+          <w:b/>
+          <w:bCs/>
+        </w:rPr>
+        <w:t xml:space="preserve">ukuran objektif</w:t>
+      </w:r>
+      <w:r>
+        <w:t xml:space="preserve"> </w:t>
+      </w:r>
+      <w:r>
+        <w:t xml:space="preserve">mencakup ROA, ROE, dan pertumbuhan penjualan;</w:t>
+      </w:r>
+      <w:r>
+        <w:t xml:space="preserve"> </w:t>
+      </w:r>
+      <w:r>
+        <w:rPr>
+          <w:b/>
+          <w:bCs/>
+        </w:rPr>
+        <w:t xml:space="preserve">ukuran subjektif</w:t>
+      </w:r>
+      <w:r>
+        <w:t xml:space="preserve"> </w:t>
+      </w:r>
+      <w:r>
+        <w:t xml:space="preserve">meliputi kepuasan pelanggan dan retensi (Ittner &amp; Lacker 2003). Tidak ada konsensus tentang ukuran terbaik (Carton 1996). Model konseptual yang diusulkan (Gambar 2) menempatkan tiga strategi generik → kinerja, dimoderasi oleh karakteristik perusahaan.</w:t>
+      </w:r>
+      <w:r>
+        <w:t xml:space="preserve"> </w:t>
+      </w:r>
+      <w:r>
+        <w:rPr>
+          <w:b/>
+          <w:bCs/>
+        </w:rPr>
+        <w:t xml:space="preserve">H1</w:t>
+      </w:r>
+      <w:r>
+        <w:t xml:space="preserve">: strategi kompetitif mempengaruhi kinerja secara signifikan;</w:t>
+      </w:r>
+      <w:r>
+        <w:t xml:space="preserve"> </w:t>
+      </w:r>
+      <w:r>
+        <w:rPr>
+          <w:b/>
+          <w:bCs/>
+        </w:rPr>
+        <w:t xml:space="preserve">H2</w:t>
+      </w:r>
+      <w:r>
+        <w:t xml:space="preserve">: karakteristik perusahaan memoderasi hubungan tersebut secara signifikan. Kedua hipotesis bersifat konseptual dan tidak diuji empiris dalam artikel ini.</w:t>
+      </w:r>
+    </w:p>
+    <w:p>
+      <w:r>
+        <w:pict>
+          <v:rect style="width:0;height:1.5pt" o:hralign="center" o:hrstd="t" o:hr="t"/>
+        </w:pict>
+      </w:r>
+    </w:p>
+    <w:bookmarkEnd w:id="185"/>
+    <w:bookmarkStart w:id="186" w:name="kelebihan-9"/>
+    <w:p>
+      <w:pPr>
+        <w:pStyle w:val="Heading3"/>
+      </w:pPr>
+      <w:r>
+        <w:t xml:space="preserve">Kelebihan</w:t>
+      </w:r>
+    </w:p>
+    <w:p>
+      <w:pPr>
+        <w:pStyle w:val="FirstParagraph"/>
+      </w:pPr>
+      <w:r>
+        <w:rPr>
+          <w:b/>
+          <w:bCs/>
+        </w:rPr>
+        <w:t xml:space="preserve">Cakupan teoretis yang komprehensif.</w:t>
+      </w:r>
+      <w:r>
+        <w:t xml:space="preserve"> </w:t>
+      </w:r>
+      <w:r>
+        <w:t xml:space="preserve">Kekuatan paling menonjol adalah integrasi Porter, Treacy-Wiersema, RBV, KBV, dan MBV dalam satu kerangka sintesis. Review yang hanya mengandalkan tipologi Porter akan melewatkan dimensi kapabilitas (KBV) dan faktor struktural industri (MBV) yang sama-sama relevan. Dengan mengintegrasikan kelimanya, Onditi memberikan gambaran multi-perspektif yang lebih kaya untuk pembaca yang baru memasuki literatur strategi.</w:t>
+      </w:r>
+    </w:p>
+    <w:p>
+      <w:pPr>
+        <w:pStyle w:val="BodyText"/>
+      </w:pPr>
+      <w:r>
+        <w:rPr>
+          <w:b/>
+          <w:bCs/>
+        </w:rPr>
+        <w:t xml:space="preserve">Identifikasi kesenjangan penelitian yang actionable.</w:t>
+      </w:r>
+      <w:r>
+        <w:t xml:space="preserve"> </w:t>
+      </w:r>
+      <w:r>
+        <w:t xml:space="preserve">Onditi mengidentifikasi tiga kesenjangan yang konkret: kebutuhan studi tentang efek</w:t>
+      </w:r>
+      <w:r>
+        <w:t xml:space="preserve"> </w:t>
+      </w:r>
+      <w:r>
+        <w:rPr>
+          <w:i/>
+          <w:iCs/>
+        </w:rPr>
+        <w:t xml:space="preserve">hybrid strategies</w:t>
+      </w:r>
+      <w:r>
+        <w:t xml:space="preserve">; peran karakteristik perusahaan sebagai moderator yang masih</w:t>
+      </w:r>
+      <w:r>
+        <w:t xml:space="preserve"> </w:t>
+      </w:r>
+      <w:r>
+        <w:rPr>
+          <w:i/>
+          <w:iCs/>
+        </w:rPr>
+        <w:t xml:space="preserve">underspecified</w:t>
+      </w:r>
+      <w:r>
+        <w:t xml:space="preserve">; dan perlunya menguji kerangka Treacy-Wiersema sebagai alternatif Porter dalam konteks yang berbeda dari studi asal. Ketiga kesenjangan ini relevan dan berpotensi menjadi pertanyaan penelitian tingkat Magister.</w:t>
+      </w:r>
+    </w:p>
+    <w:p>
+      <w:pPr>
+        <w:pStyle w:val="BodyText"/>
+      </w:pPr>
+      <w:r>
+        <w:rPr>
+          <w:b/>
+          <w:bCs/>
+        </w:rPr>
+        <w:t xml:space="preserve">Cakupan geografis yang beragam.</w:t>
+      </w:r>
+      <w:r>
+        <w:t xml:space="preserve"> </w:t>
+      </w:r>
+      <w:r>
+        <w:t xml:space="preserve">Dengan mengintegrasikan studi dari Kenya, Spanyol, Yunani, Turki, Malaysia, Nigeria, Argentina, dan Amerika Serikat, Onditi melampaui bias Anglo-Saxon yang sering mendominasi tinjauan literatur strategi. Ini memperluas relevansi sintesisnya ke konteks pasar berkembang, termasuk ASEAN.</w:t>
+      </w:r>
+    </w:p>
+    <w:p>
+      <w:pPr>
+        <w:pStyle w:val="BodyText"/>
+      </w:pPr>
+      <w:r>
+        <w:rPr>
+          <w:b/>
+          <w:bCs/>
+        </w:rPr>
+        <w:t xml:space="preserve">Proposisi model moderasi yang mengisi kekosongan.</w:t>
+      </w:r>
+      <w:r>
+        <w:t xml:space="preserve"> </w:t>
+      </w:r>
+      <w:r>
+        <w:t xml:space="preserve">Sebagian besar tinjauan sebelumnya berhenti pada pelaporan inkonsistensi hasil empiris. Onditi melangkah lebih jauh dengan mengusulkan kerangka moderasi — meskipun belum dioperasionalisasi secara penuh — yang memberikan arah riset yang jelas bagi peneliti selanjutnya yang ingin menguji kondisi batas (</w:t>
+      </w:r>
+      <w:r>
+        <w:rPr>
+          <w:i/>
+          <w:iCs/>
+        </w:rPr>
+        <w:t xml:space="preserve">boundary conditions</w:t>
+      </w:r>
+      <w:r>
+        <w:t xml:space="preserve">) strategi generik.</w:t>
+      </w:r>
+    </w:p>
+    <w:p>
+      <w:r>
+        <w:pict>
+          <v:rect style="width:0;height:1.5pt" o:hralign="center" o:hrstd="t" o:hr="t"/>
+        </w:pict>
+      </w:r>
+    </w:p>
+    <w:bookmarkEnd w:id="186"/>
+    <w:bookmarkStart w:id="187" w:name="kekurangan-9"/>
+    <w:p>
+      <w:pPr>
+        <w:pStyle w:val="Heading3"/>
+      </w:pPr>
+      <w:r>
+        <w:t xml:space="preserve">Kekurangan</w:t>
+      </w:r>
+    </w:p>
+    <w:p>
+      <w:pPr>
+        <w:pStyle w:val="FirstParagraph"/>
+      </w:pPr>
+      <w:r>
+        <w:rPr>
+          <w:b/>
+          <w:bCs/>
+        </w:rPr>
+        <w:t xml:space="preserve">Sintesis deskriptif, bukan analitis.</w:t>
+      </w:r>
+      <w:r>
+        <w:t xml:space="preserve"> </w:t>
+      </w:r>
+      <w:r>
+        <w:t xml:space="preserve">Kelemahan paling mendasar adalah bahwa paper ini melaporkan kontestasi tanpa menyelesaikannya. Tiga tema utama — strategi vs. kinerja; konteks sebagai moderator; perdebatan</w:t>
+      </w:r>
+      <w:r>
+        <w:t xml:space="preserve"> </w:t>
+      </w:r>
+      <w:r>
+        <w:rPr>
+          <w:i/>
+          <w:iCs/>
+        </w:rPr>
+        <w:t xml:space="preserve">hybrid</w:t>
+      </w:r>
+      <w:r>
+        <w:t xml:space="preserve"> </w:t>
+      </w:r>
+      <w:r>
+        <w:t xml:space="preserve">— adalah kategori untuk mengorganisasi temuan, bukan kerangka analitis yang menjelaskan</w:t>
+      </w:r>
+      <w:r>
+        <w:t xml:space="preserve"> </w:t>
+      </w:r>
+      <w:r>
+        <w:rPr>
+          <w:i/>
+          <w:iCs/>
+        </w:rPr>
+        <w:t xml:space="preserve">mengapa</w:t>
+      </w:r>
+      <w:r>
+        <w:t xml:space="preserve"> </w:t>
+      </w:r>
+      <w:r>
+        <w:t xml:space="preserve">studi menghasilkan hasil berbeda. Bandingkan dengan Campbell-Hunt (2000) yang menggunakan meta-analisis kuantitatif untuk menghasilkan estimasi</w:t>
+      </w:r>
+      <w:r>
+        <w:t xml:space="preserve"> </w:t>
+      </w:r>
+      <w:r>
+        <w:rPr>
+          <w:i/>
+          <w:iCs/>
+        </w:rPr>
+        <w:t xml:space="preserve">effect-size</w:t>
+      </w:r>
+      <w:r>
+        <w:t xml:space="preserve"> </w:t>
+      </w:r>
+      <w:r>
+        <w:t xml:space="preserve">yang dapat diuji statistik; Onditi mencakup studi yang lebih baru tetapi dengan teknik yang jauh kurang ketat.</w:t>
+      </w:r>
+    </w:p>
+    <w:p>
+      <w:pPr>
+        <w:pStyle w:val="BodyText"/>
+      </w:pPr>
+      <w:r>
+        <w:rPr>
+          <w:b/>
+          <w:bCs/>
+        </w:rPr>
+        <w:t xml:space="preserve">Metodologi pencarian tidak transparan dan tidak ada PRISMA.</w:t>
+      </w:r>
+      <w:r>
+        <w:t xml:space="preserve"> </w:t>
+      </w:r>
+      <w:r>
+        <w:t xml:space="preserve">Artikel tidak menjelaskan basis data, kata kunci pencarian, kriteria inklusi/eksklusi, atau rentang tahun yang disasar secara sistematis. Tanpa transparansi ini, pembaca tidak dapat menilai apakah inkonsistensi temuan adalah gambaran jujur dari literatur atau artefak</w:t>
+      </w:r>
+      <w:r>
+        <w:t xml:space="preserve"> </w:t>
+      </w:r>
+      <w:r>
+        <w:rPr>
+          <w:i/>
+          <w:iCs/>
+        </w:rPr>
+        <w:t xml:space="preserve">selection bias</w:t>
+      </w:r>
+      <w:r>
+        <w:t xml:space="preserve"> </w:t>
+      </w:r>
+      <w:r>
+        <w:t xml:space="preserve">penulis.</w:t>
+      </w:r>
+    </w:p>
+    <w:p>
+      <w:pPr>
+        <w:pStyle w:val="BodyText"/>
+      </w:pPr>
+      <w:r>
+        <w:rPr>
+          <w:b/>
+          <w:bCs/>
+        </w:rPr>
+        <w:t xml:space="preserve">Kekhawatiran kredibilitas jurnal.</w:t>
+      </w:r>
+      <w:r>
+        <w:t xml:space="preserve"> </w:t>
+      </w:r>
+      <w:r>
+        <w:rPr>
+          <w:i/>
+          <w:iCs/>
+        </w:rPr>
+        <w:t xml:space="preserve">Strategic Journals</w:t>
+      </w:r>
+      <w:r>
+        <w:t xml:space="preserve"> </w:t>
+      </w:r>
+      <w:r>
+        <w:t xml:space="preserve">adalah jurnal</w:t>
+      </w:r>
+      <w:r>
+        <w:t xml:space="preserve"> </w:t>
+      </w:r>
+      <w:r>
+        <w:rPr>
+          <w:i/>
+          <w:iCs/>
+        </w:rPr>
+        <w:t xml:space="preserve">open access</w:t>
+      </w:r>
+      <w:r>
+        <w:t xml:space="preserve"> </w:t>
+      </w:r>
+      <w:r>
+        <w:t xml:space="preserve">berbasis Afrika Timur yang proses</w:t>
+      </w:r>
+      <w:r>
+        <w:t xml:space="preserve"> </w:t>
+      </w:r>
+      <w:r>
+        <w:rPr>
+          <w:i/>
+          <w:iCs/>
+        </w:rPr>
+        <w:t xml:space="preserve">peer review</w:t>
+      </w:r>
+      <w:r>
+        <w:t xml:space="preserve">-nya tidak transparan. Terdapat kesalahan kutipan yang signifikan: Porter dikutip sebagai</w:t>
+      </w:r>
+      <w:r>
+        <w:t xml:space="preserve"> </w:t>
+      </w:r>
+      <w:r>
+        <w:t xml:space="preserve">“1930”</w:t>
+      </w:r>
+      <w:r>
+        <w:t xml:space="preserve"> </w:t>
+      </w:r>
+      <w:r>
+        <w:t xml:space="preserve">—</w:t>
+      </w:r>
+      <w:r>
+        <w:t xml:space="preserve"> </w:t>
+      </w:r>
+      <w:r>
+        <w:rPr>
+          <w:i/>
+          <w:iCs/>
+        </w:rPr>
+        <w:t xml:space="preserve">typo</w:t>
+      </w:r>
+      <w:r>
+        <w:t xml:space="preserve"> </w:t>
+      </w:r>
+      <w:r>
+        <w:t xml:space="preserve">yang seharusnya 1980 — sebuah kesalahan yang tidak mungkin lolos proses</w:t>
+      </w:r>
+      <w:r>
+        <w:t xml:space="preserve"> </w:t>
+      </w:r>
+      <w:r>
+        <w:rPr>
+          <w:i/>
+          <w:iCs/>
+        </w:rPr>
+        <w:t xml:space="preserve">peer review</w:t>
+      </w:r>
+      <w:r>
+        <w:t xml:space="preserve"> </w:t>
+      </w:r>
+      <w:r>
+        <w:t xml:space="preserve">ketat dan meragukan kualitas editorial artikel secara keseluruhan.</w:t>
+      </w:r>
+    </w:p>
+    <w:p>
+      <w:pPr>
+        <w:pStyle w:val="BodyText"/>
+      </w:pPr>
+      <w:r>
+        <w:rPr>
+          <w:b/>
+          <w:bCs/>
+        </w:rPr>
+        <w:t xml:space="preserve">Hipotesis moderasi</w:t>
+      </w:r>
+      <w:r>
+        <w:t xml:space="preserve"> </w:t>
+      </w:r>
+      <w:r>
+        <w:rPr>
+          <w:b/>
+          <w:bCs/>
+          <w:i/>
+          <w:iCs/>
+        </w:rPr>
+        <w:t xml:space="preserve">underspecified</w:t>
+      </w:r>
+      <w:r>
+        <w:t xml:space="preserve"> </w:t>
+      </w:r>
+      <w:r>
+        <w:rPr>
+          <w:b/>
+          <w:bCs/>
+        </w:rPr>
+        <w:t xml:space="preserve">dan absennya engagement dengan</w:t>
+      </w:r>
+      <w:r>
+        <w:t xml:space="preserve"> </w:t>
+      </w:r>
+      <w:r>
+        <w:rPr>
+          <w:b/>
+          <w:bCs/>
+          <w:i/>
+          <w:iCs/>
+        </w:rPr>
+        <w:t xml:space="preserve">measurement artifact</w:t>
+      </w:r>
+      <w:r>
+        <w:rPr>
+          <w:b/>
+          <w:bCs/>
+        </w:rPr>
+        <w:t xml:space="preserve">.</w:t>
+      </w:r>
+      <w:r>
+        <w:t xml:space="preserve"> </w:t>
+      </w:r>
+      <w:r>
+        <w:t xml:space="preserve">H2 menyatakan</w:t>
+      </w:r>
+      <w:r>
+        <w:t xml:space="preserve"> </w:t>
+      </w:r>
+      <w:r>
+        <w:rPr>
+          <w:i/>
+          <w:iCs/>
+        </w:rPr>
+        <w:t xml:space="preserve">firm characteristics</w:t>
+      </w:r>
+      <w:r>
+        <w:t xml:space="preserve"> </w:t>
+      </w:r>
+      <w:r>
+        <w:t xml:space="preserve">sebagai moderator tetapi tidak dioperasionalisasi — apakah ukuran, usia, struktur kepemilikan, atau</w:t>
+      </w:r>
+      <w:r>
+        <w:t xml:space="preserve"> </w:t>
+      </w:r>
+      <w:r>
+        <w:rPr>
+          <w:i/>
+          <w:iCs/>
+        </w:rPr>
+        <w:t xml:space="preserve">institutional voids</w:t>
+      </w:r>
+      <w:r>
+        <w:t xml:space="preserve"> </w:t>
+      </w:r>
+      <w:r>
+        <w:t xml:space="preserve">(Khanna &amp; Palepu 2000)? Selain itu, sebagian besar studi yang dirujuk menggunakan instrumen</w:t>
+      </w:r>
+      <w:r>
+        <w:t xml:space="preserve"> </w:t>
+      </w:r>
+      <w:r>
+        <w:rPr>
+          <w:i/>
+          <w:iCs/>
+        </w:rPr>
+        <w:t xml:space="preserve">self-report</w:t>
+      </w:r>
+      <w:r>
+        <w:t xml:space="preserve"> </w:t>
+      </w:r>
+      <w:r>
+        <w:t xml:space="preserve">yang reliabilitasnya dipertanyakan (Cronbach α</w:t>
+      </w:r>
+      <w:r>
+        <w:t xml:space="preserve"> </w:t>
+      </w:r>
+      <w:r>
+        <w:rPr>
+          <w:i/>
+          <w:iCs/>
+        </w:rPr>
+        <w:t xml:space="preserve">cost leadership</w:t>
+      </w:r>
+      <w:r>
+        <w:t xml:space="preserve"> </w:t>
+      </w:r>
+      <w:r>
+        <w:t xml:space="preserve">= 0,54 di Artikel 9). Sintesis yang tidak mengoreksi</w:t>
+      </w:r>
+      <w:r>
+        <w:t xml:space="preserve"> </w:t>
+      </w:r>
+      <w:r>
+        <w:rPr>
+          <w:i/>
+          <w:iCs/>
+        </w:rPr>
+        <w:t xml:space="preserve">measurement artifact</w:t>
+      </w:r>
+      <w:r>
+        <w:t xml:space="preserve"> </w:t>
+      </w:r>
+      <w:r>
+        <w:t xml:space="preserve">berisiko melaporkan inkonsistensi yang sebagian bersifat metodologis, bukan substantif.</w:t>
+      </w:r>
+    </w:p>
+    <w:p>
+      <w:r>
+        <w:pict>
+          <v:rect style="width:0;height:1.5pt" o:hralign="center" o:hrstd="t" o:hr="t"/>
+        </w:pict>
+      </w:r>
+    </w:p>
+    <w:bookmarkEnd w:id="187"/>
+    <w:bookmarkStart w:id="188" w:name="posisi-dalam-kerangka-mata-kuliah-9"/>
+    <w:p>
+      <w:pPr>
+        <w:pStyle w:val="Heading3"/>
+      </w:pPr>
+      <w:r>
+        <w:t xml:space="preserve">Posisi dalam Kerangka Mata Kuliah</w:t>
+      </w:r>
+    </w:p>
+    <w:p>
+      <w:pPr>
+        <w:pStyle w:val="FirstParagraph"/>
+      </w:pPr>
+      <w:r>
+        <w:t xml:space="preserve">Artikel Onditi (2018) berfungsi sebagai</w:t>
+      </w:r>
+      <w:r>
+        <w:t xml:space="preserve"> </w:t>
+      </w:r>
+      <w:r>
+        <w:rPr>
+          <w:b/>
+          <w:bCs/>
+        </w:rPr>
+        <w:t xml:space="preserve">lensa sintesis teoretis</w:t>
+      </w:r>
+      <w:r>
+        <w:t xml:space="preserve"> </w:t>
+      </w:r>
+      <w:r>
+        <w:t xml:space="preserve">yang memetakan keterkaitan antar-pertemuan dalam kurikulum MSK304. Tiga perspektif yang diintegrasikan Onditi — RBV, KBV, dan MBV — secara langsung berkorespondensi dengan tiga pertemuan berbeda dalam silabus.</w:t>
+      </w:r>
+      <w:r>
+        <w:t xml:space="preserve"> </w:t>
+      </w:r>
+      <w:r>
+        <w:rPr>
+          <w:b/>
+          <w:bCs/>
+        </w:rPr>
+        <w:t xml:space="preserve">Pertemuan 4</w:t>
+      </w:r>
+      <w:r>
+        <w:t xml:space="preserve"> </w:t>
+      </w:r>
+      <w:r>
+        <w:t xml:space="preserve">(TPGS Bab 4) mengakar pada</w:t>
+      </w:r>
+      <w:r>
+        <w:t xml:space="preserve"> </w:t>
+      </w:r>
+      <w:r>
+        <w:rPr>
+          <w:b/>
+          <w:bCs/>
+        </w:rPr>
+        <w:t xml:space="preserve">RBV</w:t>
+      </w:r>
+      <w:r>
+        <w:t xml:space="preserve">: sumber daya internal sebagai fondasi keunggulan kompetitif berkelanjutan, yang dioperasionalisasi melalui kerangka</w:t>
+      </w:r>
+      <w:r>
+        <w:t xml:space="preserve"> </w:t>
+      </w:r>
+      <w:r>
+        <w:rPr>
+          <w:i/>
+          <w:iCs/>
+        </w:rPr>
+        <w:t xml:space="preserve">VRIN</w:t>
+      </w:r>
+      <w:r>
+        <w:t xml:space="preserve"> </w:t>
+      </w:r>
+      <w:r>
+        <w:t xml:space="preserve">Barney (1991).</w:t>
+      </w:r>
+      <w:r>
+        <w:t xml:space="preserve"> </w:t>
+      </w:r>
+      <w:r>
+        <w:rPr>
+          <w:b/>
+          <w:bCs/>
+        </w:rPr>
+        <w:t xml:space="preserve">Pertemuan 5</w:t>
+      </w:r>
+      <w:r>
+        <w:t xml:space="preserve"> </w:t>
+      </w:r>
+      <w:r>
+        <w:t xml:space="preserve">(TPGS Bab 5) mengakar pada</w:t>
+      </w:r>
+      <w:r>
+        <w:t xml:space="preserve"> </w:t>
+      </w:r>
+      <w:r>
+        <w:rPr>
+          <w:b/>
+          <w:bCs/>
+        </w:rPr>
+        <w:t xml:space="preserve">MBV</w:t>
+      </w:r>
+      <w:r>
+        <w:t xml:space="preserve">: strategi generik Porter sebagai respons terhadap struktur industri</w:t>
+      </w:r>
+      <w:r>
+        <w:t xml:space="preserve"> </w:t>
+      </w:r>
+      <w:r>
+        <w:rPr>
+          <w:i/>
+          <w:iCs/>
+        </w:rPr>
+        <w:t xml:space="preserve">five forces</w:t>
+      </w:r>
+      <w:r>
+        <w:t xml:space="preserve">, menempatkan positioning pasar sebagai mekanisme utama pencapaian kinerja.</w:t>
+      </w:r>
+      <w:r>
+        <w:t xml:space="preserve"> </w:t>
+      </w:r>
+      <w:r>
+        <w:rPr>
+          <w:b/>
+          <w:bCs/>
+        </w:rPr>
+        <w:t xml:space="preserve">Pertemuan 6</w:t>
+      </w:r>
+      <w:r>
+        <w:t xml:space="preserve"> </w:t>
+      </w:r>
+      <w:r>
+        <w:t xml:space="preserve">(TPGS Bab 6) memperluas dengan</w:t>
+      </w:r>
+      <w:r>
+        <w:t xml:space="preserve"> </w:t>
+      </w:r>
+      <w:r>
+        <w:rPr>
+          <w:b/>
+          <w:bCs/>
+        </w:rPr>
+        <w:t xml:space="preserve">KBV</w:t>
+      </w:r>
+      <w:r>
+        <w:t xml:space="preserve">:</w:t>
+      </w:r>
+      <w:r>
+        <w:t xml:space="preserve"> </w:t>
+      </w:r>
+      <w:r>
+        <w:rPr>
+          <w:i/>
+          <w:iCs/>
+        </w:rPr>
+        <w:t xml:space="preserve">dynamic capabilities</w:t>
+      </w:r>
+      <w:r>
+        <w:t xml:space="preserve"> </w:t>
+      </w:r>
+      <w:r>
+        <w:t xml:space="preserve">Teece et al. (1997) sebagai suplemen yang menjelaskan bagaimana perusahaan membangun dan mengkonfigurasi ulang kompetensi seiring perubahan lingkungan kompetitif.</w:t>
+      </w:r>
+    </w:p>
+    <w:p>
+      <w:pPr>
+        <w:pStyle w:val="BodyText"/>
+      </w:pPr>
+      <w:r>
+        <w:t xml:space="preserve">Onditi berguna sebagai referensi kursus justru karena ia tidak berpihak pada satu perspektif — ia menunjukkan bahwa RBV, KBV, dan MBV adalah lensa komplementer, bukan alternatif yang saling mengeksklusikan. Batasan utamanya untuk tujuan akademik senior adalah kedalaman analitisnya yang terbatas: artikel ini adalah</w:t>
+      </w:r>
+      <w:r>
+        <w:t xml:space="preserve"> </w:t>
+      </w:r>
+      <w:r>
+        <w:rPr>
+          <w:i/>
+          <w:iCs/>
+        </w:rPr>
+        <w:t xml:space="preserve">literature map</w:t>
+      </w:r>
+      <w:r>
+        <w:t xml:space="preserve"> </w:t>
+      </w:r>
+      <w:r>
+        <w:t xml:space="preserve">yang baik, bukan</w:t>
+      </w:r>
+      <w:r>
+        <w:t xml:space="preserve"> </w:t>
+      </w:r>
+      <w:r>
+        <w:rPr>
+          <w:i/>
+          <w:iCs/>
+        </w:rPr>
+        <w:t xml:space="preserve">theoretical synthesis</w:t>
+      </w:r>
+      <w:r>
+        <w:t xml:space="preserve"> </w:t>
+      </w:r>
+      <w:r>
+        <w:t xml:space="preserve">yang memajukan disiplin. Untuk pembaca MSK304, Onditi paling tepat dibaca setelah TPGS Bab 4-6, sebagai konfirmasi bahwa ketiga perspektif yang dipelajari di kelas memang diakui dan diperdebatkan secara aktif dalam literatur empiris internasional.</w:t>
+      </w:r>
+    </w:p>
+    <w:p>
+      <w:pPr>
+        <w:pStyle w:val="BodyText"/>
+      </w:pPr>
+      <w:r>
+        <w:rPr>
+          <w:b/>
+          <w:bCs/>
+        </w:rPr>
+        <w:t xml:space="preserve">Penerapan di Indonesia</w:t>
+      </w:r>
+      <w:r>
+        <w:t xml:space="preserve"> </w:t>
+      </w:r>
+      <w:r>
+        <w:t xml:space="preserve">paling konkret melalui kerangka Treacy-Wiersema. Tiga</w:t>
+      </w:r>
+      <w:r>
+        <w:t xml:space="preserve"> </w:t>
+      </w:r>
+      <w:r>
+        <w:rPr>
+          <w:i/>
+          <w:iCs/>
+        </w:rPr>
+        <w:t xml:space="preserve">value disciplines</w:t>
+      </w:r>
+      <w:r>
+        <w:t xml:space="preserve"> </w:t>
+      </w:r>
+      <w:r>
+        <w:t xml:space="preserve">dapat dipetakan ke perusahaan-perusahaan besar Indonesia:</w:t>
+      </w:r>
+      <w:r>
+        <w:t xml:space="preserve"> </w:t>
+      </w:r>
+      <w:r>
+        <w:rPr>
+          <w:b/>
+          <w:bCs/>
+        </w:rPr>
+        <w:t xml:space="preserve">BCA</w:t>
+      </w:r>
+      <w:r>
+        <w:t xml:space="preserve"> </w:t>
+      </w:r>
+      <w:r>
+        <w:t xml:space="preserve">mengeksekusi</w:t>
+      </w:r>
+      <w:r>
+        <w:t xml:space="preserve"> </w:t>
+      </w:r>
+      <w:r>
+        <w:rPr>
+          <w:i/>
+          <w:iCs/>
+        </w:rPr>
+        <w:t xml:space="preserve">operational excellence</w:t>
+      </w:r>
+      <w:r>
+        <w:t xml:space="preserve"> </w:t>
+      </w:r>
+      <w:r>
+        <w:t xml:space="preserve">secara konsisten — infrastruktur digital yang andal, antrean minimal, dan biaya transaksi rendah menjadi fondasi kinerja</w:t>
+      </w:r>
+      <w:r>
+        <w:t xml:space="preserve"> </w:t>
+      </w:r>
+      <w:r>
+        <w:rPr>
+          <w:i/>
+          <w:iCs/>
+        </w:rPr>
+        <w:t xml:space="preserve">retail banking</w:t>
+      </w:r>
+      <w:r>
+        <w:t xml:space="preserve">-nya yang superior.</w:t>
+      </w:r>
+      <w:r>
+        <w:t xml:space="preserve"> </w:t>
+      </w:r>
+      <w:r>
+        <w:rPr>
+          <w:b/>
+          <w:bCs/>
+        </w:rPr>
+        <w:t xml:space="preserve">Tokopedia</w:t>
+      </w:r>
+      <w:r>
+        <w:t xml:space="preserve"> </w:t>
+      </w:r>
+      <w:r>
+        <w:t xml:space="preserve">(kini bagian TikTok Shop) menjalankan</w:t>
+      </w:r>
+      <w:r>
+        <w:t xml:space="preserve"> </w:t>
+      </w:r>
+      <w:r>
+        <w:rPr>
+          <w:i/>
+          <w:iCs/>
+        </w:rPr>
+        <w:t xml:space="preserve">customer intimacy</w:t>
+      </w:r>
+      <w:r>
+        <w:t xml:space="preserve"> </w:t>
+      </w:r>
+      <w:r>
+        <w:t xml:space="preserve">melalui sistem rekomendasi berbasis data dan program loyalitas pedagang kecil yang sangat tersegmentasi.</w:t>
+      </w:r>
+      <w:r>
+        <w:t xml:space="preserve"> </w:t>
+      </w:r>
+      <w:r>
+        <w:rPr>
+          <w:b/>
+          <w:bCs/>
+        </w:rPr>
+        <w:t xml:space="preserve">Telkomsel</w:t>
+      </w:r>
+      <w:r>
+        <w:t xml:space="preserve"> </w:t>
+      </w:r>
+      <w:r>
+        <w:t xml:space="preserve">mempertahankan posisi</w:t>
+      </w:r>
+      <w:r>
+        <w:t xml:space="preserve"> </w:t>
+      </w:r>
+      <w:r>
+        <w:rPr>
+          <w:i/>
+          <w:iCs/>
+        </w:rPr>
+        <w:t xml:space="preserve">product leadership</w:t>
+      </w:r>
+      <w:r>
+        <w:t xml:space="preserve"> </w:t>
+      </w:r>
+      <w:r>
+        <w:t xml:space="preserve">di telekomunikasi Indonesia melalui investasi berkelanjutan dalam infrastruktur jaringan 4G/5G dan portofolio layanan digital. Pemetaan ini menunjukkan bahwa kerangka Treacy-Wiersema lebih</w:t>
+      </w:r>
+      <w:r>
+        <w:t xml:space="preserve"> </w:t>
+      </w:r>
+      <w:r>
+        <w:rPr>
+          <w:i/>
+          <w:iCs/>
+        </w:rPr>
+        <w:t xml:space="preserve">fit</w:t>
+      </w:r>
+      <w:r>
+        <w:t xml:space="preserve"> </w:t>
+      </w:r>
+      <w:r>
+        <w:t xml:space="preserve">untuk mendeskripsikan strategi perusahaan jasa Indonesia dibandingkan tipologi Porter yang dirancang untuk industri manufaktur dengan batas segmen yang lebih tegas. Dengan demikian, Onditi menyediakan fondasi konseptual yang praktis bagi mahasiswa MSK304 untuk menghubungkan teori strategi dengan realitas kompetitif perusahaan Indonesia kontemporer.</w:t>
+      </w:r>
+    </w:p>
+    <w:bookmarkEnd w:id="188"/>
+    <w:bookmarkEnd w:id="189"/>
+    <w:bookmarkEnd w:id="190"/>
+    <w:bookmarkStart w:id="197" w:name="bagian-iii-critical-review-artikel-11"/>
+    <w:p>
+      <w:pPr>
+        <w:pStyle w:val="Heading1"/>
+      </w:pPr>
+      <w:r>
+        <w:t xml:space="preserve">BAGIAN III — CRITICAL REVIEW ARTIKEL 11</w:t>
+      </w:r>
+    </w:p>
+    <w:bookmarkStart w:id="196" w:name="Xbb08702d6ddf3c58c6c5155f1f6408ed4d92fde"/>
+    <w:p>
+      <w:pPr>
+        <w:pStyle w:val="Heading2"/>
+      </w:pPr>
+      <w:r>
+        <w:t xml:space="preserve">Y. H. Hsieh &amp; H. M. Chen (2011) —</w:t>
+      </w:r>
+      <w:r>
+        <w:t xml:space="preserve"> </w:t>
+      </w:r>
+      <w:r>
+        <w:rPr>
+          <w:i/>
+          <w:iCs/>
+        </w:rPr>
+        <w:t xml:space="preserve">Strategic Fit among Business Competitive Strategy, Human Resource Strategy, and Reward System</w:t>
+      </w:r>
+    </w:p>
+    <w:p>
+      <w:pPr>
+        <w:pStyle w:val="FirstParagraph"/>
+      </w:pPr>
+      <w:r>
+        <w:rPr>
+          <w:b/>
+          <w:bCs/>
+        </w:rPr>
+        <w:t xml:space="preserve">Sitasi lengkap:</w:t>
+      </w:r>
+      <w:r>
+        <w:t xml:space="preserve"> </w:t>
+      </w:r>
+      <w:r>
+        <w:t xml:space="preserve">Hsieh, Y. H., &amp; Chen, H. M. (2011). Strategic Fit among Business Competitive Strategy, Human Resource Strategy, and Reward System.</w:t>
+      </w:r>
+      <w:r>
+        <w:t xml:space="preserve"> </w:t>
+      </w:r>
+      <w:r>
+        <w:rPr>
+          <w:i/>
+          <w:iCs/>
+        </w:rPr>
+        <w:t xml:space="preserve">Academy of Strategic Management Journal</w:t>
+      </w:r>
+      <w:r>
+        <w:t xml:space="preserve">, 10(2), 11–32.</w:t>
+      </w:r>
+    </w:p>
+    <w:p>
+      <w:r>
+        <w:pict>
+          <v:rect style="width:0;height:1.5pt" o:hralign="center" o:hrstd="t" o:hr="t"/>
+        </w:pict>
+      </w:r>
+    </w:p>
+    <w:bookmarkStart w:id="191" w:name="ringkasan-inti-10"/>
+    <w:p>
+      <w:pPr>
+        <w:pStyle w:val="Heading3"/>
+      </w:pPr>
+      <w:r>
+        <w:t xml:space="preserve">Ringkasan Inti</w:t>
+      </w:r>
+    </w:p>
+    <w:p>
+      <w:pPr>
+        <w:pStyle w:val="FirstParagraph"/>
+      </w:pPr>
+      <w:r>
+        <w:t xml:space="preserve">Hsieh dan Chen (2011) menyajikan sebuah</w:t>
+      </w:r>
+      <w:r>
+        <w:t xml:space="preserve"> </w:t>
+      </w:r>
+      <w:r>
+        <w:rPr>
+          <w:i/>
+          <w:iCs/>
+        </w:rPr>
+        <w:t xml:space="preserve">conceptual paper</w:t>
+      </w:r>
+      <w:r>
+        <w:t xml:space="preserve"> </w:t>
+      </w:r>
+      <w:r>
+        <w:t xml:space="preserve">yang mengintegrasikan tiga domain literatur —</w:t>
+      </w:r>
+      <w:r>
+        <w:t xml:space="preserve"> </w:t>
+      </w:r>
+      <w:r>
+        <w:rPr>
+          <w:b/>
+          <w:bCs/>
+        </w:rPr>
+        <w:t xml:space="preserve">strategi kompetitif bisnis</w:t>
+      </w:r>
+      <w:r>
+        <w:t xml:space="preserve">,</w:t>
+      </w:r>
+      <w:r>
+        <w:t xml:space="preserve"> </w:t>
+      </w:r>
+      <w:r>
+        <w:rPr>
+          <w:b/>
+          <w:bCs/>
+        </w:rPr>
+        <w:t xml:space="preserve">strategi sumber daya manusia (SDM)</w:t>
+      </w:r>
+      <w:r>
+        <w:t xml:space="preserve">, dan</w:t>
+      </w:r>
+      <w:r>
+        <w:t xml:space="preserve"> </w:t>
+      </w:r>
+      <w:r>
+        <w:rPr>
+          <w:b/>
+          <w:bCs/>
+        </w:rPr>
+        <w:t xml:space="preserve">sistem penghargaan</w:t>
+      </w:r>
+      <w:r>
+        <w:t xml:space="preserve"> </w:t>
+      </w:r>
+      <w:r>
+        <w:t xml:space="preserve">(</w:t>
+      </w:r>
+      <w:r>
+        <w:rPr>
+          <w:i/>
+          <w:iCs/>
+        </w:rPr>
+        <w:t xml:space="preserve">reward system</w:t>
+      </w:r>
+      <w:r>
+        <w:t xml:space="preserve">) — ke dalam satu kerangka</w:t>
+      </w:r>
+      <w:r>
+        <w:t xml:space="preserve"> </w:t>
+      </w:r>
+      <w:r>
+        <w:rPr>
+          <w:i/>
+          <w:iCs/>
+        </w:rPr>
+        <w:t xml:space="preserve">strategic fit</w:t>
+      </w:r>
+      <w:r>
+        <w:t xml:space="preserve"> </w:t>
+      </w:r>
+      <w:r>
+        <w:t xml:space="preserve">terpadu. Artikel ini diterbitkan di</w:t>
+      </w:r>
+      <w:r>
+        <w:t xml:space="preserve"> </w:t>
+      </w:r>
+      <w:r>
+        <w:rPr>
+          <w:i/>
+          <w:iCs/>
+        </w:rPr>
+        <w:t xml:space="preserve">Academy of Strategic Management Journal</w:t>
+      </w:r>
+      <w:r>
+        <w:t xml:space="preserve"> </w:t>
+      </w:r>
+      <w:r>
+        <w:t xml:space="preserve">Vol. 10 No. 2 dan sepenuhnya bersifat konseptual: tidak ada survei, eksperimen, maupun analisis data sekunder. Kontribusinya terletak pada sintesis tiga aliran literatur yang selama ini berkembang secara paralel menjadi sebuah konfigurasi</w:t>
+      </w:r>
+      <w:r>
+        <w:t xml:space="preserve"> </w:t>
+      </w:r>
+      <w:r>
+        <w:rPr>
+          <w:i/>
+          <w:iCs/>
+        </w:rPr>
+        <w:t xml:space="preserve">triad fit</w:t>
+      </w:r>
+      <w:r>
+        <w:t xml:space="preserve"> </w:t>
+      </w:r>
+      <w:r>
+        <w:t xml:space="preserve">yang ditampilkan dalam Tabel 1 (hlm. 26).</w:t>
+      </w:r>
+    </w:p>
+    <w:p>
+      <w:pPr>
+        <w:pStyle w:val="BodyText"/>
+      </w:pPr>
+      <w:r>
+        <w:t xml:space="preserve">Landasan teoretis artikel ini bersandar pada dua pilar utama. Pertama,</w:t>
+      </w:r>
+      <w:r>
+        <w:t xml:space="preserve"> </w:t>
+      </w:r>
+      <w:r>
+        <w:rPr>
+          <w:b/>
+          <w:bCs/>
+        </w:rPr>
+        <w:t xml:space="preserve">Resource-Based View</w:t>
+      </w:r>
+      <w:r>
+        <w:t xml:space="preserve"> </w:t>
+      </w:r>
+      <w:r>
+        <w:t xml:space="preserve">(RBV) — merujuk Wernerfelt (1984), Barney (1991), dan Peteraf (1993) — yang menegaskan bahwa kapabilitas internal yang sulit ditiru dapat menjadi sumber keunggulan kompetitif berkelanjutan. Kedua,</w:t>
+      </w:r>
+      <w:r>
+        <w:t xml:space="preserve"> </w:t>
+      </w:r>
+      <w:r>
+        <w:rPr>
+          <w:i/>
+          <w:iCs/>
+        </w:rPr>
+        <w:t xml:space="preserve">contingency theory</w:t>
+      </w:r>
+      <w:r>
+        <w:t xml:space="preserve"> </w:t>
+      </w:r>
+      <w:r>
+        <w:t xml:space="preserve">yang dibawa Mintzberg (1979) dan dikembangkan Hambrick (1983, 1984), yang berargumen bahwa tidak ada satu konfigurasi terbaik yang berlaku universal; semua tergantung pada keadaan khusus yang dihadapi organisasi. Perpaduan dua pilar ini memberikan justifikasi teoretis mengapa</w:t>
+      </w:r>
+      <w:r>
+        <w:t xml:space="preserve"> </w:t>
+      </w:r>
+      <w:r>
+        <w:rPr>
+          <w:i/>
+          <w:iCs/>
+        </w:rPr>
+        <w:t xml:space="preserve">fit</w:t>
+      </w:r>
+      <w:r>
+        <w:t xml:space="preserve"> </w:t>
+      </w:r>
+      <w:r>
+        <w:t xml:space="preserve">antara strategi, HR, dan</w:t>
+      </w:r>
+      <w:r>
+        <w:t xml:space="preserve"> </w:t>
+      </w:r>
+      <w:r>
+        <w:rPr>
+          <w:i/>
+          <w:iCs/>
+        </w:rPr>
+        <w:t xml:space="preserve">reward</w:t>
+      </w:r>
+      <w:r>
+        <w:t xml:space="preserve"> </w:t>
+      </w:r>
+      <w:r>
+        <w:t xml:space="preserve">penting: konfigurasi yang selaras sulit ditiru kompetitor karena bersifat</w:t>
+      </w:r>
+      <w:r>
+        <w:t xml:space="preserve"> </w:t>
+      </w:r>
+      <w:r>
+        <w:rPr>
+          <w:i/>
+          <w:iCs/>
+        </w:rPr>
+        <w:t xml:space="preserve">path-dependent</w:t>
+      </w:r>
+      <w:r>
+        <w:t xml:space="preserve"> </w:t>
+      </w:r>
+      <w:r>
+        <w:t xml:space="preserve">dan</w:t>
+      </w:r>
+      <w:r>
+        <w:t xml:space="preserve"> </w:t>
+      </w:r>
+      <w:r>
+        <w:rPr>
+          <w:i/>
+          <w:iCs/>
+        </w:rPr>
+        <w:t xml:space="preserve">tacit</w:t>
+      </w:r>
+      <w:r>
+        <w:t xml:space="preserve">, sekaligus hanya efektif dalam konteks strategi yang sesuai.</w:t>
+      </w:r>
+    </w:p>
+    <w:p>
+      <w:pPr>
+        <w:pStyle w:val="BodyText"/>
+      </w:pPr>
+      <w:r>
+        <w:t xml:space="preserve">Dari sudut pandang strategi kompetitif, artikel mengadopsi tipologi Porter (1980, 1985) —</w:t>
+      </w:r>
+      <w:r>
+        <w:t xml:space="preserve"> </w:t>
+      </w:r>
+      <w:r>
+        <w:rPr>
+          <w:i/>
+          <w:iCs/>
+        </w:rPr>
+        <w:t xml:space="preserve">differentiation</w:t>
+      </w:r>
+      <w:r>
+        <w:t xml:space="preserve">,</w:t>
+      </w:r>
+      <w:r>
+        <w:t xml:space="preserve"> </w:t>
+      </w:r>
+      <w:r>
+        <w:rPr>
+          <w:i/>
+          <w:iCs/>
+        </w:rPr>
+        <w:t xml:space="preserve">overall cost leadership</w:t>
+      </w:r>
+      <w:r>
+        <w:t xml:space="preserve">, dan</w:t>
+      </w:r>
+      <w:r>
+        <w:t xml:space="preserve"> </w:t>
+      </w:r>
+      <w:r>
+        <w:rPr>
+          <w:i/>
+          <w:iCs/>
+        </w:rPr>
+        <w:t xml:space="preserve">focus</w:t>
+      </w:r>
+      <w:r>
+        <w:t xml:space="preserve"> </w:t>
+      </w:r>
+      <w:r>
+        <w:t xml:space="preserve">— sebagai titik pijak. Berdasarkan karakteristik masing-masing strategi generik, Hsieh dan Chen menurunkan tiga tipe strategi HR:</w:t>
+      </w:r>
+      <w:r>
+        <w:t xml:space="preserve"> </w:t>
+      </w:r>
+      <w:r>
+        <w:rPr>
+          <w:i/>
+          <w:iCs/>
+        </w:rPr>
+        <w:t xml:space="preserve">innovation-oriented</w:t>
+      </w:r>
+      <w:r>
+        <w:t xml:space="preserve">,</w:t>
+      </w:r>
+      <w:r>
+        <w:t xml:space="preserve"> </w:t>
+      </w:r>
+      <w:r>
+        <w:rPr>
+          <w:i/>
+          <w:iCs/>
+        </w:rPr>
+        <w:t xml:space="preserve">contribution-oriented</w:t>
+      </w:r>
+      <w:r>
+        <w:t xml:space="preserve">, dan</w:t>
+      </w:r>
+      <w:r>
+        <w:t xml:space="preserve"> </w:t>
+      </w:r>
+      <w:r>
+        <w:rPr>
+          <w:i/>
+          <w:iCs/>
+        </w:rPr>
+        <w:t xml:space="preserve">commitment-oriented</w:t>
+      </w:r>
+      <w:r>
+        <w:t xml:space="preserve"> </w:t>
+      </w:r>
+      <w:r>
+        <w:t xml:space="preserve">— yang merupakan sintesis dari Schuler dan Jackson (1987), Miles dan Snow (1978, 1984), serta Dyer dan Holder (1988). Selanjutnya, dari taksonomi Howard dan Dougherty (2004), tiga tipe sistem</w:t>
+      </w:r>
+      <w:r>
+        <w:t xml:space="preserve"> </w:t>
+      </w:r>
+      <w:r>
+        <w:rPr>
+          <w:i/>
+          <w:iCs/>
+        </w:rPr>
+        <w:t xml:space="preserve">reward</w:t>
+      </w:r>
+      <w:r>
+        <w:t xml:space="preserve"> </w:t>
+      </w:r>
+      <w:r>
+        <w:t xml:space="preserve">diturunkan:</w:t>
+      </w:r>
+      <w:r>
+        <w:t xml:space="preserve"> </w:t>
+      </w:r>
+      <w:r>
+        <w:rPr>
+          <w:i/>
+          <w:iCs/>
+        </w:rPr>
+        <w:t xml:space="preserve">human capital reward</w:t>
+      </w:r>
+      <w:r>
+        <w:t xml:space="preserve">,</w:t>
+      </w:r>
+      <w:r>
+        <w:t xml:space="preserve"> </w:t>
+      </w:r>
+      <w:r>
+        <w:rPr>
+          <w:i/>
+          <w:iCs/>
+        </w:rPr>
+        <w:t xml:space="preserve">output reward</w:t>
+      </w:r>
+      <w:r>
+        <w:t xml:space="preserve">, dan</w:t>
+      </w:r>
+      <w:r>
+        <w:t xml:space="preserve"> </w:t>
+      </w:r>
+      <w:r>
+        <w:rPr>
+          <w:i/>
+          <w:iCs/>
+        </w:rPr>
+        <w:t xml:space="preserve">position reward</w:t>
+      </w:r>
+      <w:r>
+        <w:t xml:space="preserve">. Argumen sentral artikel adalah bahwa keselarasan simultan ketiga komponen ini — strategi generik, tipe HR, dan tipe</w:t>
+      </w:r>
+      <w:r>
+        <w:t xml:space="preserve"> </w:t>
+      </w:r>
+      <w:r>
+        <w:rPr>
+          <w:i/>
+          <w:iCs/>
+        </w:rPr>
+        <w:t xml:space="preserve">reward</w:t>
+      </w:r>
+      <w:r>
+        <w:t xml:space="preserve"> </w:t>
+      </w:r>
+      <w:r>
+        <w:t xml:space="preserve">— akan meningkatkan kinerja organisasi dan menciptakan keunggulan kompetitif berkelanjutan, sementara misalignment di satu sudut triad akan menghasilkan tegangan eksekusi yang menekan kinerja.</w:t>
+      </w:r>
+    </w:p>
+    <w:p>
+      <w:r>
+        <w:pict>
+          <v:rect style="width:0;height:1.5pt" o:hralign="center" o:hrstd="t" o:hr="t"/>
+        </w:pict>
+      </w:r>
+    </w:p>
+    <w:bookmarkEnd w:id="191"/>
+    <w:bookmarkStart w:id="192" w:name="temuan-utama-10"/>
+    <w:p>
+      <w:pPr>
+        <w:pStyle w:val="Heading3"/>
+      </w:pPr>
+      <w:r>
+        <w:t xml:space="preserve">Temuan Utama</w:t>
+      </w:r>
+    </w:p>
+    <w:p>
+      <w:pPr>
+        <w:pStyle w:val="FirstParagraph"/>
+      </w:pPr>
+      <w:r>
+        <w:t xml:space="preserve">Kontribusi inti artikel adalah konfigurasi</w:t>
+      </w:r>
+      <w:r>
+        <w:t xml:space="preserve"> </w:t>
+      </w:r>
+      <w:r>
+        <w:rPr>
+          <w:b/>
+          <w:bCs/>
+        </w:rPr>
+        <w:t xml:space="preserve">tiga-arah</w:t>
+      </w:r>
+      <w:r>
+        <w:t xml:space="preserve"> </w:t>
+      </w:r>
+      <w:r>
+        <w:t xml:space="preserve">(</w:t>
+      </w:r>
+      <w:r>
+        <w:rPr>
+          <w:i/>
+          <w:iCs/>
+        </w:rPr>
+        <w:t xml:space="preserve">three-way alignment</w:t>
+      </w:r>
+      <w:r>
+        <w:t xml:space="preserve">) yang dipetakan secara visual dalam Tabel 1. Setiap strategi generik Porter dipasangkan dengan satu tipe strategi HR dan satu tipe sistem</w:t>
+      </w:r>
+      <w:r>
+        <w:t xml:space="preserve"> </w:t>
+      </w:r>
+      <w:r>
+        <w:rPr>
+          <w:i/>
+          <w:iCs/>
+        </w:rPr>
+        <w:t xml:space="preserve">reward</w:t>
+      </w:r>
+      <w:r>
+        <w:t xml:space="preserve"> </w:t>
+      </w:r>
+      <w:r>
+        <w:t xml:space="preserve">yang dihipotesiskan sebagai konfigurasi yang konsisten dan saling memperkuat.</w:t>
+      </w:r>
+    </w:p>
+    <w:p>
+      <w:pPr>
+        <w:pStyle w:val="BodyText"/>
+      </w:pPr>
+      <w:r>
+        <w:rPr>
+          <w:b/>
+          <w:bCs/>
+        </w:rPr>
+        <w:t xml:space="preserve">Konfigurasi pertama: Differentiation → Innovation-Oriented HR → Human Capital Reward.</w:t>
+      </w:r>
+      <w:r>
+        <w:t xml:space="preserve"> </w:t>
+      </w:r>
+      <w:r>
+        <w:t xml:space="preserve">Strategi</w:t>
+      </w:r>
+      <w:r>
+        <w:t xml:space="preserve"> </w:t>
+      </w:r>
+      <w:r>
+        <w:rPr>
+          <w:i/>
+          <w:iCs/>
+        </w:rPr>
+        <w:t xml:space="preserve">differentiation</w:t>
+      </w:r>
+      <w:r>
+        <w:t xml:space="preserve"> </w:t>
+      </w:r>
+      <w:r>
+        <w:t xml:space="preserve">menuntut inovasi berkelanjutan dan adaptabilitas tinggi. HR</w:t>
+      </w:r>
+      <w:r>
+        <w:t xml:space="preserve"> </w:t>
+      </w:r>
+      <w:r>
+        <w:rPr>
+          <w:i/>
+          <w:iCs/>
+        </w:rPr>
+        <w:t xml:space="preserve">innovation-oriented</w:t>
+      </w:r>
+      <w:r>
+        <w:t xml:space="preserve"> </w:t>
+      </w:r>
+      <w:r>
+        <w:t xml:space="preserve">merangsang kreativitas dan pengembangan kapabilitas adaptif karyawan. Target utama adalah karyawan R&amp;D, insinyur, dan profesional. Sistem</w:t>
+      </w:r>
+      <w:r>
+        <w:t xml:space="preserve"> </w:t>
+      </w:r>
+      <w:r>
+        <w:rPr>
+          <w:i/>
+          <w:iCs/>
+        </w:rPr>
+        <w:t xml:space="preserve">reward</w:t>
+      </w:r>
+      <w:r>
+        <w:t xml:space="preserve"> </w:t>
+      </w:r>
+      <w:r>
+        <w:t xml:space="preserve">yang sesuai adalah</w:t>
+      </w:r>
+      <w:r>
+        <w:t xml:space="preserve"> </w:t>
+      </w:r>
+      <w:r>
+        <w:rPr>
+          <w:i/>
+          <w:iCs/>
+        </w:rPr>
+        <w:t xml:space="preserve">human capital reward</w:t>
+      </w:r>
+      <w:r>
+        <w:t xml:space="preserve"> </w:t>
+      </w:r>
+      <w:r>
+        <w:t xml:space="preserve">dengan</w:t>
+      </w:r>
+      <w:r>
+        <w:t xml:space="preserve"> </w:t>
+      </w:r>
+      <w:r>
+        <w:rPr>
+          <w:b/>
+          <w:bCs/>
+        </w:rPr>
+        <w:t xml:space="preserve">mode intrinsik</w:t>
+      </w:r>
+      <w:r>
+        <w:t xml:space="preserve"> </w:t>
+      </w:r>
+      <w:r>
+        <w:t xml:space="preserve">sebagai penekanan utama: otonomi kerja, peluang pertumbuhan pribadi, pengakuan keahlian, dan lingkungan kerja berkualitas. Pivot analitis utama:</w:t>
+      </w:r>
+      <w:r>
+        <w:t xml:space="preserve"> </w:t>
+      </w:r>
+      <w:r>
+        <w:rPr>
+          <w:i/>
+          <w:iCs/>
+        </w:rPr>
+        <w:t xml:space="preserve">reward</w:t>
+      </w:r>
+      <w:r>
+        <w:t xml:space="preserve"> </w:t>
+      </w:r>
+      <w:r>
+        <w:t xml:space="preserve">berbasis</w:t>
+      </w:r>
+      <w:r>
+        <w:t xml:space="preserve"> </w:t>
+      </w:r>
+      <w:r>
+        <w:rPr>
+          <w:i/>
+          <w:iCs/>
+        </w:rPr>
+        <w:t xml:space="preserve">output</w:t>
+      </w:r>
+      <w:r>
+        <w:t xml:space="preserve"> </w:t>
+      </w:r>
+      <w:r>
+        <w:t xml:space="preserve">jangka pendek justru menekan perilaku inovatif karena inovasi membutuhkan toleransi kegagalan dan horizon waktu panjang. Kompensasi tunai tetap ada tetapi berada di peringkat terakhir. Kriteria</w:t>
+      </w:r>
+      <w:r>
+        <w:t xml:space="preserve"> </w:t>
+      </w:r>
+      <w:r>
+        <w:rPr>
+          <w:i/>
+          <w:iCs/>
+        </w:rPr>
+        <w:t xml:space="preserve">reward</w:t>
+      </w:r>
+      <w:r>
+        <w:t xml:space="preserve">: keterampilan, pengetahuan, inovasi, adaptabilitas, dan pengalaman.</w:t>
+      </w:r>
+    </w:p>
+    <w:p>
+      <w:pPr>
+        <w:pStyle w:val="BodyText"/>
+      </w:pPr>
+      <w:r>
+        <w:rPr>
+          <w:b/>
+          <w:bCs/>
+        </w:rPr>
+        <w:t xml:space="preserve">Konfigurasi kedua: Overall Cost Leadership → Contribution-Oriented HR → Output Reward.</w:t>
+      </w:r>
+      <w:r>
+        <w:t xml:space="preserve"> </w:t>
+      </w:r>
+      <w:r>
+        <w:t xml:space="preserve">Strategi</w:t>
+      </w:r>
+      <w:r>
+        <w:t xml:space="preserve"> </w:t>
+      </w:r>
+      <w:r>
+        <w:rPr>
+          <w:i/>
+          <w:iCs/>
+        </w:rPr>
+        <w:t xml:space="preserve">cost leadership</w:t>
+      </w:r>
+      <w:r>
+        <w:t xml:space="preserve"> </w:t>
+      </w:r>
+      <w:r>
+        <w:t xml:space="preserve">menuntut efisiensi biaya dan produktivitas terukur. HR</w:t>
+      </w:r>
+      <w:r>
+        <w:t xml:space="preserve"> </w:t>
+      </w:r>
+      <w:r>
+        <w:rPr>
+          <w:i/>
+          <w:iCs/>
+        </w:rPr>
+        <w:t xml:space="preserve">contribution-oriented</w:t>
+      </w:r>
+      <w:r>
+        <w:t xml:space="preserve"> </w:t>
+      </w:r>
+      <w:r>
+        <w:t xml:space="preserve">menekankan kontribusi karyawan melalui teknik SDM yang berorientasi hasil. Target utama adalah</w:t>
+      </w:r>
+      <w:r>
+        <w:t xml:space="preserve"> </w:t>
+      </w:r>
+      <w:r>
+        <w:rPr>
+          <w:i/>
+          <w:iCs/>
+        </w:rPr>
+        <w:t xml:space="preserve">on-line producer</w:t>
+      </w:r>
+      <w:r>
+        <w:t xml:space="preserve"> </w:t>
+      </w:r>
+      <w:r>
+        <w:t xml:space="preserve">dan tenaga penjualan. Sistem</w:t>
+      </w:r>
+      <w:r>
+        <w:t xml:space="preserve"> </w:t>
+      </w:r>
+      <w:r>
+        <w:rPr>
+          <w:i/>
+          <w:iCs/>
+        </w:rPr>
+        <w:t xml:space="preserve">reward</w:t>
+      </w:r>
+      <w:r>
+        <w:t xml:space="preserve"> </w:t>
+      </w:r>
+      <w:r>
+        <w:t xml:space="preserve">yang sesuai adalah</w:t>
+      </w:r>
+      <w:r>
+        <w:t xml:space="preserve"> </w:t>
+      </w:r>
+      <w:r>
+        <w:rPr>
+          <w:i/>
+          <w:iCs/>
+        </w:rPr>
+        <w:t xml:space="preserve">output reward</w:t>
+      </w:r>
+      <w:r>
+        <w:t xml:space="preserve"> </w:t>
+      </w:r>
+      <w:r>
+        <w:t xml:space="preserve">dengan</w:t>
+      </w:r>
+      <w:r>
+        <w:t xml:space="preserve"> </w:t>
+      </w:r>
+      <w:r>
+        <w:rPr>
+          <w:b/>
+          <w:bCs/>
+        </w:rPr>
+        <w:t xml:space="preserve">mode ekstrinsik</w:t>
+      </w:r>
+      <w:r>
+        <w:t xml:space="preserve">: insentif berbasis kinerja, sistem bagi hasil (</w:t>
+      </w:r>
+      <w:r>
+        <w:rPr>
+          <w:i/>
+          <w:iCs/>
+        </w:rPr>
+        <w:t xml:space="preserve">gain-sharing</w:t>
+      </w:r>
+      <w:r>
+        <w:t xml:space="preserve">), bonus produktivitas, dan komisi penjualan. Kriteria</w:t>
+      </w:r>
+      <w:r>
+        <w:t xml:space="preserve"> </w:t>
+      </w:r>
+      <w:r>
+        <w:rPr>
+          <w:i/>
+          <w:iCs/>
+        </w:rPr>
+        <w:t xml:space="preserve">reward</w:t>
+      </w:r>
+      <w:r>
+        <w:t xml:space="preserve">: kinerja, produktivitas, pertumbuhan, laba — metrik kuantitatif yang langsung terkoneksi dengan efisiensi biaya. Dyer dan Holder (1988) menyebut konfigurasi ini sebagai</w:t>
+      </w:r>
+      <w:r>
+        <w:t xml:space="preserve"> </w:t>
+      </w:r>
+      <w:r>
+        <w:rPr>
+          <w:i/>
+          <w:iCs/>
+        </w:rPr>
+        <w:t xml:space="preserve">inducement strategy</w:t>
+      </w:r>
+      <w:r>
+        <w:t xml:space="preserve">.</w:t>
+      </w:r>
+    </w:p>
+    <w:p>
+      <w:pPr>
+        <w:pStyle w:val="BodyText"/>
+      </w:pPr>
+      <w:r>
+        <w:rPr>
+          <w:b/>
+          <w:bCs/>
+        </w:rPr>
+        <w:t xml:space="preserve">Konfigurasi ketiga: Focus → Commitment-Oriented HR → Position Reward.</w:t>
+      </w:r>
+      <w:r>
+        <w:t xml:space="preserve"> </w:t>
+      </w:r>
+      <w:r>
+        <w:t xml:space="preserve">Strategi</w:t>
+      </w:r>
+      <w:r>
+        <w:t xml:space="preserve"> </w:t>
+      </w:r>
+      <w:r>
+        <w:rPr>
+          <w:i/>
+          <w:iCs/>
+        </w:rPr>
+        <w:t xml:space="preserve">focus</w:t>
+      </w:r>
+      <w:r>
+        <w:t xml:space="preserve"> </w:t>
+      </w:r>
+      <w:r>
+        <w:t xml:space="preserve">menuntut pemahaman mendalam terhadap segmen pasar sempit yang hanya dimiliki karyawan loyal jangka panjang. HR</w:t>
+      </w:r>
+      <w:r>
+        <w:t xml:space="preserve"> </w:t>
+      </w:r>
+      <w:r>
+        <w:rPr>
+          <w:i/>
+          <w:iCs/>
+        </w:rPr>
+        <w:t xml:space="preserve">commitment-oriented</w:t>
+      </w:r>
+      <w:r>
+        <w:t xml:space="preserve"> </w:t>
+      </w:r>
+      <w:r>
+        <w:t xml:space="preserve">menekankan retensi karyawan senior. Sistem</w:t>
+      </w:r>
+      <w:r>
+        <w:t xml:space="preserve"> </w:t>
+      </w:r>
+      <w:r>
+        <w:rPr>
+          <w:i/>
+          <w:iCs/>
+        </w:rPr>
+        <w:t xml:space="preserve">reward</w:t>
+      </w:r>
+      <w:r>
+        <w:t xml:space="preserve"> </w:t>
+      </w:r>
+      <w:r>
+        <w:t xml:space="preserve">yang sesuai adalah</w:t>
+      </w:r>
+      <w:r>
+        <w:t xml:space="preserve"> </w:t>
+      </w:r>
+      <w:r>
+        <w:rPr>
+          <w:i/>
+          <w:iCs/>
+        </w:rPr>
+        <w:t xml:space="preserve">position reward</w:t>
+      </w:r>
+      <w:r>
+        <w:t xml:space="preserve"> </w:t>
+      </w:r>
+      <w:r>
+        <w:t xml:space="preserve">yang</w:t>
+      </w:r>
+      <w:r>
+        <w:t xml:space="preserve"> </w:t>
+      </w:r>
+      <w:r>
+        <w:rPr>
+          <w:b/>
+          <w:bCs/>
+        </w:rPr>
+        <w:t xml:space="preserve">memadukan mode intrinsik dan ekstrinsik</w:t>
+      </w:r>
+      <w:r>
+        <w:t xml:space="preserve">: jabatan (</w:t>
+      </w:r>
+      <w:r>
+        <w:rPr>
+          <w:i/>
+          <w:iCs/>
+        </w:rPr>
+        <w:t xml:space="preserve">title</w:t>
+      </w:r>
+      <w:r>
+        <w:t xml:space="preserve">), senioritas, keamanan kerja, kepemilikan saham, dan otonomi pengambilan keputusan.</w:t>
+      </w:r>
+    </w:p>
+    <w:p>
+      <w:pPr>
+        <w:pStyle w:val="BodyText"/>
+      </w:pPr>
+      <w:r>
+        <w:rPr>
+          <w:b/>
+          <w:bCs/>
+        </w:rPr>
+        <w:t xml:space="preserve">Relativitas reward dan hipotesis konfigurasional.</w:t>
+      </w:r>
+      <w:r>
+        <w:t xml:space="preserve"> </w:t>
+      </w:r>
+      <w:r>
+        <w:t xml:space="preserve">Ketiga tipe</w:t>
+      </w:r>
+      <w:r>
+        <w:t xml:space="preserve"> </w:t>
+      </w:r>
+      <w:r>
+        <w:rPr>
+          <w:i/>
+          <w:iCs/>
+        </w:rPr>
+        <w:t xml:space="preserve">reward</w:t>
+      </w:r>
+      <w:r>
+        <w:t xml:space="preserve"> </w:t>
+      </w:r>
+      <w:r>
+        <w:t xml:space="preserve">bersifat</w:t>
+      </w:r>
+      <w:r>
+        <w:t xml:space="preserve"> </w:t>
+      </w:r>
+      <w:r>
+        <w:rPr>
+          <w:b/>
+          <w:bCs/>
+        </w:rPr>
+        <w:t xml:space="preserve">relatif dalam penekanan</w:t>
+      </w:r>
+      <w:r>
+        <w:t xml:space="preserve"> </w:t>
+      </w:r>
+      <w:r>
+        <w:t xml:space="preserve">— bukan pilihan eksklusif. Perusahaan</w:t>
+      </w:r>
+      <w:r>
+        <w:t xml:space="preserve"> </w:t>
+      </w:r>
+      <w:r>
+        <w:rPr>
+          <w:i/>
+          <w:iCs/>
+        </w:rPr>
+        <w:t xml:space="preserve">differentiation</w:t>
+      </w:r>
+      <w:r>
+        <w:t xml:space="preserve"> </w:t>
+      </w:r>
+      <w:r>
+        <w:t xml:space="preserve">tetap memberi kompensasi tunai kompetitif, tetapi bobotnya lebih kecil dari komponen intrinsik. Pivot teoritis utama adalah klaim konfigurasional: ketiga komponen harus selaras</w:t>
+      </w:r>
+      <w:r>
+        <w:t xml:space="preserve"> </w:t>
+      </w:r>
+      <w:r>
+        <w:rPr>
+          <w:b/>
+          <w:bCs/>
+        </w:rPr>
+        <w:t xml:space="preserve">simultan</w:t>
+      </w:r>
+      <w:r>
+        <w:t xml:space="preserve">. Misalignment menghasilkan tegangan spesifik:</w:t>
+      </w:r>
+      <w:r>
+        <w:t xml:space="preserve"> </w:t>
+      </w:r>
+      <w:r>
+        <w:rPr>
+          <w:i/>
+          <w:iCs/>
+        </w:rPr>
+        <w:t xml:space="preserve">differentiation</w:t>
+      </w:r>
+      <w:r>
+        <w:t xml:space="preserve"> </w:t>
+      </w:r>
+      <w:r>
+        <w:t xml:space="preserve">+</w:t>
+      </w:r>
+      <w:r>
+        <w:t xml:space="preserve"> </w:t>
+      </w:r>
+      <w:r>
+        <w:rPr>
+          <w:i/>
+          <w:iCs/>
+        </w:rPr>
+        <w:t xml:space="preserve">output reward</w:t>
+      </w:r>
+      <w:r>
+        <w:t xml:space="preserve"> </w:t>
+      </w:r>
+      <w:r>
+        <w:t xml:space="preserve">→</w:t>
+      </w:r>
+      <w:r>
+        <w:t xml:space="preserve"> </w:t>
+      </w:r>
+      <w:r>
+        <w:rPr>
+          <w:i/>
+          <w:iCs/>
+        </w:rPr>
+        <w:t xml:space="preserve">innovation paralysis</w:t>
+      </w:r>
+      <w:r>
+        <w:t xml:space="preserve">;</w:t>
+      </w:r>
+      <w:r>
+        <w:t xml:space="preserve"> </w:t>
+      </w:r>
+      <w:r>
+        <w:rPr>
+          <w:i/>
+          <w:iCs/>
+        </w:rPr>
+        <w:t xml:space="preserve">cost leadership</w:t>
+      </w:r>
+      <w:r>
+        <w:t xml:space="preserve"> </w:t>
+      </w:r>
+      <w:r>
+        <w:t xml:space="preserve">+</w:t>
+      </w:r>
+      <w:r>
+        <w:t xml:space="preserve"> </w:t>
+      </w:r>
+      <w:r>
+        <w:rPr>
+          <w:i/>
+          <w:iCs/>
+        </w:rPr>
+        <w:t xml:space="preserve">human capital reward</w:t>
+      </w:r>
+      <w:r>
+        <w:t xml:space="preserve"> </w:t>
+      </w:r>
+      <w:r>
+        <w:t xml:space="preserve">→</w:t>
+      </w:r>
+      <w:r>
+        <w:t xml:space="preserve"> </w:t>
+      </w:r>
+      <w:r>
+        <w:rPr>
+          <w:i/>
+          <w:iCs/>
+        </w:rPr>
+        <w:t xml:space="preserve">cost erosion</w:t>
+      </w:r>
+      <w:r>
+        <w:t xml:space="preserve">. Distinsi motivasi</w:t>
+      </w:r>
+      <w:r>
+        <w:t xml:space="preserve"> </w:t>
+      </w:r>
+      <w:r>
+        <w:rPr>
+          <w:b/>
+          <w:bCs/>
+        </w:rPr>
+        <w:t xml:space="preserve">intrinsik versus ekstrinsik</w:t>
+      </w:r>
+      <w:r>
+        <w:t xml:space="preserve"> </w:t>
+      </w:r>
+      <w:r>
+        <w:t xml:space="preserve">(Herzberg et al. 1959) menjadi pembeda kritis dan menjelaskan mengapa substitusi antar tipe</w:t>
+      </w:r>
+      <w:r>
+        <w:t xml:space="preserve"> </w:t>
+      </w:r>
+      <w:r>
+        <w:rPr>
+          <w:i/>
+          <w:iCs/>
+        </w:rPr>
+        <w:t xml:space="preserve">reward</w:t>
+      </w:r>
+      <w:r>
+        <w:t xml:space="preserve"> </w:t>
+      </w:r>
+      <w:r>
+        <w:t xml:space="preserve">tidak dapat dilakukan sembarangan.</w:t>
+      </w:r>
+    </w:p>
+    <w:p>
+      <w:r>
+        <w:pict>
+          <v:rect style="width:0;height:1.5pt" o:hralign="center" o:hrstd="t" o:hr="t"/>
+        </w:pict>
+      </w:r>
+    </w:p>
+    <w:bookmarkEnd w:id="192"/>
+    <w:bookmarkStart w:id="193" w:name="kelebihan-10"/>
+    <w:p>
+      <w:pPr>
+        <w:pStyle w:val="Heading3"/>
+      </w:pPr>
+      <w:r>
+        <w:t xml:space="preserve">Kelebihan</w:t>
+      </w:r>
+    </w:p>
+    <w:p>
+      <w:pPr>
+        <w:pStyle w:val="FirstParagraph"/>
+      </w:pPr>
+      <w:r>
+        <w:rPr>
+          <w:b/>
+          <w:bCs/>
+        </w:rPr>
+        <w:t xml:space="preserve">Integrasi tiga domain yang orisinal.</w:t>
+      </w:r>
+      <w:r>
+        <w:t xml:space="preserve"> </w:t>
+      </w:r>
+      <w:r>
+        <w:t xml:space="preserve">Kekuatan utama adalah keberanian sintesis lintas-aliran. Literatur</w:t>
+      </w:r>
+      <w:r>
+        <w:t xml:space="preserve"> </w:t>
+      </w:r>
+      <w:r>
+        <w:rPr>
+          <w:i/>
+          <w:iCs/>
+        </w:rPr>
+        <w:t xml:space="preserve">strategy-HRM linking</w:t>
+      </w:r>
+      <w:r>
+        <w:t xml:space="preserve"> </w:t>
+      </w:r>
+      <w:r>
+        <w:t xml:space="preserve">(Schuler &amp; Jackson 1987; Miles &amp; Snow 1978, 1984; Dyer &amp; Holder 1988) dan literatur</w:t>
+      </w:r>
+      <w:r>
+        <w:t xml:space="preserve"> </w:t>
+      </w:r>
+      <w:r>
+        <w:rPr>
+          <w:i/>
+          <w:iCs/>
+        </w:rPr>
+        <w:t xml:space="preserve">strategic reward</w:t>
+      </w:r>
+      <w:r>
+        <w:t xml:space="preserve"> </w:t>
+      </w:r>
+      <w:r>
+        <w:t xml:space="preserve">(Howard &amp; Dougherty 2004; Armstrong &amp; Brown 2005) selama ini bergerak paralel. Hsieh dan Chen menyatukannya dalam Tabel 1 sebagai satu paket konfigurasi yang konsisten. Kontribusi ini bermakna karena menegaskan bahwa</w:t>
+      </w:r>
+      <w:r>
+        <w:t xml:space="preserve"> </w:t>
+      </w:r>
+      <w:r>
+        <w:rPr>
+          <w:i/>
+          <w:iCs/>
+        </w:rPr>
+        <w:t xml:space="preserve">reward system</w:t>
+      </w:r>
+      <w:r>
+        <w:t xml:space="preserve"> </w:t>
+      </w:r>
+      <w:r>
+        <w:t xml:space="preserve">bukan instrumen teknis-netral, melainkan komponen yang harus dikonfigurasi bersama strategi generik.</w:t>
+      </w:r>
+    </w:p>
+    <w:p>
+      <w:pPr>
+        <w:pStyle w:val="BodyText"/>
+      </w:pPr>
+      <w:r>
+        <w:rPr>
+          <w:b/>
+          <w:bCs/>
+        </w:rPr>
+        <w:t xml:space="preserve">Landasan ganda RBV +</w:t>
+      </w:r>
+      <w:r>
+        <w:rPr>
+          <w:b/>
+          <w:bCs/>
+        </w:rPr>
+        <w:t xml:space="preserve"> </w:t>
+      </w:r>
+      <w:r>
+        <w:rPr>
+          <w:b/>
+          <w:bCs/>
+          <w:i/>
+          <w:iCs/>
+        </w:rPr>
+        <w:t xml:space="preserve">contingency theory</w:t>
+      </w:r>
+      <w:r>
+        <w:rPr>
+          <w:b/>
+          <w:bCs/>
+        </w:rPr>
+        <w:t xml:space="preserve">.</w:t>
+      </w:r>
+      <w:r>
+        <w:t xml:space="preserve"> </w:t>
+      </w:r>
+      <w:r>
+        <w:t xml:space="preserve">Fondasi ganda RBV (Barney 1991; Wernerfelt 1984; Peteraf 1993) dan</w:t>
+      </w:r>
+      <w:r>
+        <w:t xml:space="preserve"> </w:t>
+      </w:r>
+      <w:r>
+        <w:rPr>
+          <w:i/>
+          <w:iCs/>
+        </w:rPr>
+        <w:t xml:space="preserve">contingency theory</w:t>
+      </w:r>
+      <w:r>
+        <w:t xml:space="preserve"> </w:t>
+      </w:r>
+      <w:r>
+        <w:t xml:space="preserve">(Mintzberg 1979; Hambrick 1983, 1984) tidak saling bertentangan: RBV menjelaskan</w:t>
+      </w:r>
+      <w:r>
+        <w:t xml:space="preserve"> </w:t>
+      </w:r>
+      <w:r>
+        <w:rPr>
+          <w:i/>
+          <w:iCs/>
+        </w:rPr>
+        <w:t xml:space="preserve">mengapa</w:t>
+      </w:r>
+      <w:r>
+        <w:t xml:space="preserve"> </w:t>
+      </w:r>
+      <w:r>
+        <w:t xml:space="preserve">konfigurasi internal yang selaras menghasilkan keunggulan kompetitif, sementara</w:t>
+      </w:r>
+      <w:r>
+        <w:t xml:space="preserve"> </w:t>
+      </w:r>
+      <w:r>
+        <w:rPr>
+          <w:i/>
+          <w:iCs/>
+        </w:rPr>
+        <w:t xml:space="preserve">contingency theory</w:t>
+      </w:r>
+      <w:r>
+        <w:t xml:space="preserve"> </w:t>
+      </w:r>
+      <w:r>
+        <w:t xml:space="preserve">menjelaskan</w:t>
+      </w:r>
+      <w:r>
+        <w:t xml:space="preserve"> </w:t>
+      </w:r>
+      <w:r>
+        <w:rPr>
+          <w:i/>
+          <w:iCs/>
+        </w:rPr>
+        <w:t xml:space="preserve">mengapa</w:t>
+      </w:r>
+      <w:r>
+        <w:t xml:space="preserve"> </w:t>
+      </w:r>
+      <w:r>
+        <w:t xml:space="preserve">tidak ada konfigurasi universal yang berlaku untuk semua organisasi.</w:t>
+      </w:r>
+    </w:p>
+    <w:p>
+      <w:pPr>
+        <w:pStyle w:val="BodyText"/>
+      </w:pPr>
+      <w:r>
+        <w:rPr>
+          <w:b/>
+          <w:bCs/>
+        </w:rPr>
+        <w:t xml:space="preserve">Kerangka manajerial</w:t>
+      </w:r>
+      <w:r>
+        <w:rPr>
+          <w:b/>
+          <w:bCs/>
+        </w:rPr>
+        <w:t xml:space="preserve"> </w:t>
+      </w:r>
+      <w:r>
+        <w:rPr>
+          <w:b/>
+          <w:bCs/>
+          <w:i/>
+          <w:iCs/>
+        </w:rPr>
+        <w:t xml:space="preserve">actionable</w:t>
+      </w:r>
+      <w:r>
+        <w:rPr>
+          <w:b/>
+          <w:bCs/>
+        </w:rPr>
+        <w:t xml:space="preserve"> </w:t>
+      </w:r>
+      <w:r>
+        <w:rPr>
+          <w:b/>
+          <w:bCs/>
+        </w:rPr>
+        <w:t xml:space="preserve">dengan spesifikasi kriteria reward yang mendetail.</w:t>
+      </w:r>
+      <w:r>
+        <w:t xml:space="preserve"> </w:t>
+      </w:r>
+      <w:r>
+        <w:t xml:space="preserve">Tabel 1 berfungsi sebagai</w:t>
+      </w:r>
+      <w:r>
+        <w:t xml:space="preserve"> </w:t>
+      </w:r>
+      <w:r>
+        <w:rPr>
+          <w:i/>
+          <w:iCs/>
+        </w:rPr>
+        <w:t xml:space="preserve">diagnostic tool</w:t>
+      </w:r>
+      <w:r>
+        <w:t xml:space="preserve"> </w:t>
+      </w:r>
+      <w:r>
+        <w:t xml:space="preserve">langsung: manajer dapat memeriksa apakah tipe HR dan</w:t>
+      </w:r>
+      <w:r>
+        <w:t xml:space="preserve"> </w:t>
+      </w:r>
+      <w:r>
+        <w:rPr>
+          <w:i/>
+          <w:iCs/>
+        </w:rPr>
+        <w:t xml:space="preserve">reward</w:t>
+      </w:r>
+      <w:r>
+        <w:t xml:space="preserve"> </w:t>
+      </w:r>
+      <w:r>
+        <w:t xml:space="preserve">yang berjalan konsisten dengan strategi generiknya. Penulis tidak sekadar memberi label alternatif</w:t>
+      </w:r>
+      <w:r>
+        <w:t xml:space="preserve"> </w:t>
+      </w:r>
+      <w:r>
+        <w:rPr>
+          <w:i/>
+          <w:iCs/>
+        </w:rPr>
+        <w:t xml:space="preserve">reward</w:t>
+      </w:r>
+      <w:r>
+        <w:t xml:space="preserve">, tetapi menjelaskan secara rinci kriteria, objek, dan mode setiap alternatif — membuat kerangka lebih konkret dan jauh lebih berguna dibandingkan literatur</w:t>
+      </w:r>
+      <w:r>
+        <w:t xml:space="preserve"> </w:t>
+      </w:r>
+      <w:r>
+        <w:rPr>
+          <w:i/>
+          <w:iCs/>
+        </w:rPr>
+        <w:t xml:space="preserve">HR best practice</w:t>
+      </w:r>
+      <w:r>
+        <w:t xml:space="preserve"> </w:t>
+      </w:r>
+      <w:r>
+        <w:t xml:space="preserve">yang merekomendasikan praktik universal tanpa kepekaan konteks strategis.</w:t>
+      </w:r>
+    </w:p>
+    <w:p>
+      <w:r>
+        <w:pict>
+          <v:rect style="width:0;height:1.5pt" o:hralign="center" o:hrstd="t" o:hr="t"/>
+        </w:pict>
+      </w:r>
+    </w:p>
+    <w:bookmarkEnd w:id="193"/>
+    <w:bookmarkStart w:id="194" w:name="kekurangan-10"/>
+    <w:p>
+      <w:pPr>
+        <w:pStyle w:val="Heading3"/>
+      </w:pPr>
+      <w:r>
+        <w:t xml:space="preserve">Kekurangan</w:t>
+      </w:r>
+    </w:p>
+    <w:p>
+      <w:pPr>
+        <w:pStyle w:val="FirstParagraph"/>
+      </w:pPr>
+      <w:r>
+        <w:rPr>
+          <w:b/>
+          <w:bCs/>
+        </w:rPr>
+        <w:t xml:space="preserve">Tidak ada pengujian empiris.</w:t>
+      </w:r>
+      <w:r>
+        <w:t xml:space="preserve"> </w:t>
+      </w:r>
+      <w:r>
+        <w:t xml:space="preserve">Keterbatasan paling mendasar — diakui penulis pada hlm. 27 — adalah sifat sepenuhnya konseptual artikel. Tidak ada survei,</w:t>
+      </w:r>
+      <w:r>
+        <w:t xml:space="preserve"> </w:t>
+      </w:r>
+      <w:r>
+        <w:rPr>
+          <w:i/>
+          <w:iCs/>
+        </w:rPr>
+        <w:t xml:space="preserve">case study</w:t>
+      </w:r>
+      <w:r>
+        <w:t xml:space="preserve">, maupun analisis data sekunder yang menguji proposisi</w:t>
+      </w:r>
+      <w:r>
+        <w:t xml:space="preserve"> </w:t>
+      </w:r>
+      <w:r>
+        <w:rPr>
+          <w:i/>
+          <w:iCs/>
+        </w:rPr>
+        <w:t xml:space="preserve">triad fit</w:t>
+      </w:r>
+      <w:r>
+        <w:t xml:space="preserve">. Seluruh klaim tetap berstatus hipotesis. Penulis sendiri menyarankan agar penelitian masa depan mengintegrasikan data empiris untuk memverifikasi kepraktisan kerangka ini.</w:t>
+      </w:r>
+    </w:p>
+    <w:p>
+      <w:pPr>
+        <w:pStyle w:val="BodyText"/>
+      </w:pPr>
+      <w:r>
+        <w:rPr>
+          <w:b/>
+          <w:bCs/>
+        </w:rPr>
+        <w:t xml:space="preserve">Pengabaian tantangan implementasi dan asumsi strategi murni.</w:t>
+      </w:r>
+      <w:r>
+        <w:t xml:space="preserve"> </w:t>
+      </w:r>
+      <w:r>
+        <w:t xml:space="preserve">Penulis tidak membahas bagaimana mengukur</w:t>
+      </w:r>
+      <w:r>
+        <w:t xml:space="preserve"> </w:t>
+      </w:r>
+      <w:r>
+        <w:t xml:space="preserve">“inovasi”</w:t>
+      </w:r>
+      <w:r>
+        <w:t xml:space="preserve"> </w:t>
+      </w:r>
+      <w:r>
+        <w:t xml:space="preserve">atau</w:t>
+      </w:r>
+      <w:r>
+        <w:t xml:space="preserve"> </w:t>
+      </w:r>
+      <w:r>
+        <w:t xml:space="preserve">“adaptabilitas”</w:t>
+      </w:r>
+      <w:r>
+        <w:t xml:space="preserve"> </w:t>
+      </w:r>
+      <w:r>
+        <w:t xml:space="preserve">sebagai kriteria</w:t>
+      </w:r>
+      <w:r>
+        <w:t xml:space="preserve"> </w:t>
+      </w:r>
+      <w:r>
+        <w:rPr>
+          <w:i/>
+          <w:iCs/>
+        </w:rPr>
+        <w:t xml:space="preserve">reward</w:t>
+      </w:r>
+      <w:r>
+        <w:t xml:space="preserve"> </w:t>
+      </w:r>
+      <w:r>
+        <w:t xml:space="preserve">— konstruk yang sangat subjektif dan rawan bias evaluator. Lebih mendasar, artikel bergantung pada asumsi bahwa perusahaan dapat diklasifikasikan bersih ke satu strategi generik Porter. Namun, sebagaimana ditunjukkan Salavou (Artikel 7 MSK304), banyak perusahaan sukses menjalankan</w:t>
+      </w:r>
+      <w:r>
+        <w:t xml:space="preserve"> </w:t>
+      </w:r>
+      <w:r>
+        <w:rPr>
+          <w:b/>
+          <w:bCs/>
+        </w:rPr>
+        <w:t xml:space="preserve">strategi hybrid</w:t>
+      </w:r>
+      <w:r>
+        <w:t xml:space="preserve">. Bila strategi pijakan tidak dapat dikategorisasi secara murni, konfigurasi HR dan</w:t>
+      </w:r>
+      <w:r>
+        <w:t xml:space="preserve"> </w:t>
+      </w:r>
+      <w:r>
+        <w:rPr>
+          <w:i/>
+          <w:iCs/>
+        </w:rPr>
+        <w:t xml:space="preserve">reward</w:t>
+      </w:r>
+      <w:r>
+        <w:t xml:space="preserve"> </w:t>
+      </w:r>
+      <w:r>
+        <w:t xml:space="preserve">yang dianjurkan menjadi ambigu — dan artikel tidak menawarkan panduan untuk perusahaan</w:t>
+      </w:r>
+      <w:r>
+        <w:t xml:space="preserve"> </w:t>
+      </w:r>
+      <w:r>
+        <w:rPr>
+          <w:i/>
+          <w:iCs/>
+        </w:rPr>
+        <w:t xml:space="preserve">best-cost provider</w:t>
+      </w:r>
+      <w:r>
+        <w:t xml:space="preserve">.</w:t>
+      </w:r>
+    </w:p>
+    <w:p>
+      <w:pPr>
+        <w:pStyle w:val="BodyText"/>
+      </w:pPr>
+      <w:r>
+        <w:rPr>
+          <w:b/>
+          <w:bCs/>
+        </w:rPr>
+        <w:t xml:space="preserve">Konteks pre-digital dan generalisasi lintas budaya belum teruji.</w:t>
+      </w:r>
+      <w:r>
+        <w:t xml:space="preserve"> </w:t>
+      </w:r>
+      <w:r>
+        <w:t xml:space="preserve">Artikel tidak membahas perkembangan kontemporer seperti</w:t>
+      </w:r>
+      <w:r>
+        <w:t xml:space="preserve"> </w:t>
+      </w:r>
+      <w:r>
+        <w:rPr>
+          <w:i/>
+          <w:iCs/>
+        </w:rPr>
+        <w:t xml:space="preserve">HRIS</w:t>
+      </w:r>
+      <w:r>
+        <w:t xml:space="preserve">,</w:t>
+      </w:r>
+      <w:r>
+        <w:t xml:space="preserve"> </w:t>
+      </w:r>
+      <w:r>
+        <w:rPr>
+          <w:i/>
+          <w:iCs/>
+        </w:rPr>
+        <w:t xml:space="preserve">real-time performance tracking</w:t>
+      </w:r>
+      <w:r>
+        <w:t xml:space="preserve">, atau personalisasi</w:t>
+      </w:r>
+      <w:r>
+        <w:t xml:space="preserve"> </w:t>
+      </w:r>
+      <w:r>
+        <w:rPr>
+          <w:i/>
+          <w:iCs/>
+        </w:rPr>
+        <w:t xml:space="preserve">reward</w:t>
+      </w:r>
+      <w:r>
+        <w:t xml:space="preserve"> </w:t>
+      </w:r>
+      <w:r>
+        <w:t xml:space="preserve">berbasis data — dimensi yang sepenuhnya absen padahal telah mengubah cara sistem penghargaan didesain dan dieksekusi. Lebih jauh, tidak ada diskusi tentang bagaimana konteks budaya —</w:t>
+      </w:r>
+      <w:r>
+        <w:t xml:space="preserve"> </w:t>
+      </w:r>
+      <w:r>
+        <w:rPr>
+          <w:i/>
+          <w:iCs/>
+        </w:rPr>
+        <w:t xml:space="preserve">high power distance</w:t>
+      </w:r>
+      <w:r>
+        <w:t xml:space="preserve">,</w:t>
+      </w:r>
+      <w:r>
+        <w:t xml:space="preserve"> </w:t>
+      </w:r>
+      <w:r>
+        <w:rPr>
+          <w:i/>
+          <w:iCs/>
+        </w:rPr>
+        <w:t xml:space="preserve">Confucian-influenced</w:t>
+      </w:r>
+      <w:r>
+        <w:t xml:space="preserve">, maupun perbedaan generasi (milenial vs. Gen X) — mempengaruhi preferensi</w:t>
+      </w:r>
+      <w:r>
+        <w:t xml:space="preserve"> </w:t>
+      </w:r>
+      <w:r>
+        <w:rPr>
+          <w:i/>
+          <w:iCs/>
+        </w:rPr>
+        <w:t xml:space="preserve">reward</w:t>
+      </w:r>
+      <w:r>
+        <w:t xml:space="preserve"> </w:t>
+      </w:r>
+      <w:r>
+        <w:t xml:space="preserve">dan efektivitas konfigurasi triad di berbagai konteks nasional.</w:t>
+      </w:r>
+    </w:p>
+    <w:p>
+      <w:r>
+        <w:pict>
+          <v:rect style="width:0;height:1.5pt" o:hralign="center" o:hrstd="t" o:hr="t"/>
+        </w:pict>
+      </w:r>
+    </w:p>
+    <w:bookmarkEnd w:id="194"/>
+    <w:bookmarkStart w:id="195" w:name="posisi-dalam-kerangka-mata-kuliah-10"/>
+    <w:p>
+      <w:pPr>
+        <w:pStyle w:val="Heading3"/>
+      </w:pPr>
+      <w:r>
+        <w:t xml:space="preserve">Posisi dalam Kerangka Mata Kuliah</w:t>
+      </w:r>
+    </w:p>
+    <w:p>
+      <w:pPr>
+        <w:pStyle w:val="FirstParagraph"/>
+      </w:pPr>
+      <w:r>
+        <w:t xml:space="preserve">Artikel Hsieh dan Chen (2011) berfungsi sebagai</w:t>
+      </w:r>
+      <w:r>
+        <w:t xml:space="preserve"> </w:t>
+      </w:r>
+      <w:r>
+        <w:rPr>
+          <w:b/>
+          <w:bCs/>
+        </w:rPr>
+        <w:t xml:space="preserve">jangkar konseptual Pertemuan 7</w:t>
+      </w:r>
+      <w:r>
+        <w:t xml:space="preserve"> </w:t>
+      </w:r>
+      <w:r>
+        <w:t xml:space="preserve">dalam MSK304, melengkapi dua sumber lainnya — TPGS Ch.8 dan Artikel 12 — dengan cara saling mengisi tanpa tumpang tindih.</w:t>
+      </w:r>
+    </w:p>
+    <w:p>
+      <w:pPr>
+        <w:pStyle w:val="BodyText"/>
+      </w:pPr>
+      <w:r>
+        <w:t xml:space="preserve">TPGS Ch.8 beroperasi di</w:t>
+      </w:r>
+      <w:r>
+        <w:t xml:space="preserve"> </w:t>
+      </w:r>
+      <w:r>
+        <w:rPr>
+          <w:b/>
+          <w:bCs/>
+        </w:rPr>
+        <w:t xml:space="preserve">Level 1 —</w:t>
+      </w:r>
+      <w:r>
+        <w:rPr>
+          <w:b/>
+          <w:bCs/>
+        </w:rPr>
+        <w:t xml:space="preserve"> </w:t>
+      </w:r>
+      <w:r>
+        <w:rPr>
+          <w:b/>
+          <w:bCs/>
+          <w:i/>
+          <w:iCs/>
+        </w:rPr>
+        <w:t xml:space="preserve">cross-business fit</w:t>
+      </w:r>
+      <w:r>
+        <w:t xml:space="preserve"> </w:t>
+      </w:r>
+      <w:r>
+        <w:t xml:space="preserve">(level korporat): sinergi lintas unit bisnis diuji melalui</w:t>
+      </w:r>
+      <w:r>
+        <w:t xml:space="preserve"> </w:t>
+      </w:r>
+      <w:r>
+        <w:rPr>
+          <w:i/>
+          <w:iCs/>
+        </w:rPr>
+        <w:t xml:space="preserve">industry attractiveness</w:t>
+      </w:r>
+      <w:r>
+        <w:t xml:space="preserve">,</w:t>
+      </w:r>
+      <w:r>
+        <w:t xml:space="preserve"> </w:t>
+      </w:r>
+      <w:r>
+        <w:rPr>
+          <w:i/>
+          <w:iCs/>
+        </w:rPr>
+        <w:t xml:space="preserve">cost-of-entry</w:t>
+      </w:r>
+      <w:r>
+        <w:t xml:space="preserve">, dan</w:t>
+      </w:r>
+      <w:r>
+        <w:t xml:space="preserve"> </w:t>
+      </w:r>
+      <w:r>
+        <w:rPr>
+          <w:i/>
+          <w:iCs/>
+        </w:rPr>
+        <w:t xml:space="preserve">better-off test</w:t>
+      </w:r>
+      <w:r>
+        <w:t xml:space="preserve">. Hsieh dan Chen beroperasi di</w:t>
+      </w:r>
+      <w:r>
+        <w:t xml:space="preserve"> </w:t>
+      </w:r>
+      <w:r>
+        <w:rPr>
+          <w:b/>
+          <w:bCs/>
+        </w:rPr>
+        <w:t xml:space="preserve">Level 2 —</w:t>
+      </w:r>
+      <w:r>
+        <w:rPr>
+          <w:b/>
+          <w:bCs/>
+        </w:rPr>
+        <w:t xml:space="preserve"> </w:t>
+      </w:r>
+      <w:r>
+        <w:rPr>
+          <w:b/>
+          <w:bCs/>
+          <w:i/>
+          <w:iCs/>
+        </w:rPr>
+        <w:t xml:space="preserve">internal business fit</w:t>
+      </w:r>
+      <w:r>
+        <w:t xml:space="preserve">: setelah strategi generik unit ditetapkan, kerangka</w:t>
+      </w:r>
+      <w:r>
+        <w:t xml:space="preserve"> </w:t>
+      </w:r>
+      <w:r>
+        <w:rPr>
+          <w:i/>
+          <w:iCs/>
+        </w:rPr>
+        <w:t xml:space="preserve">triad</w:t>
+      </w:r>
+      <w:r>
+        <w:t xml:space="preserve"> </w:t>
+      </w:r>
+      <w:r>
+        <w:t xml:space="preserve">menjelaskan bagaimana HR dan</w:t>
+      </w:r>
+      <w:r>
+        <w:t xml:space="preserve"> </w:t>
+      </w:r>
+      <w:r>
+        <w:rPr>
+          <w:i/>
+          <w:iCs/>
+        </w:rPr>
+        <w:t xml:space="preserve">reward</w:t>
+      </w:r>
+      <w:r>
+        <w:t xml:space="preserve"> </w:t>
+      </w:r>
+      <w:r>
+        <w:t xml:space="preserve">harus dikonfigurasi agar eksekusi berjalan. Artikel 12 (Okebaram &amp; Onuoha 2018) memperluas ke</w:t>
+      </w:r>
+      <w:r>
+        <w:t xml:space="preserve"> </w:t>
+      </w:r>
+      <w:r>
+        <w:rPr>
+          <w:b/>
+          <w:bCs/>
+        </w:rPr>
+        <w:t xml:space="preserve">Level 3 —</w:t>
+      </w:r>
+      <w:r>
+        <w:rPr>
+          <w:b/>
+          <w:bCs/>
+        </w:rPr>
+        <w:t xml:space="preserve"> </w:t>
+      </w:r>
+      <w:r>
+        <w:rPr>
+          <w:b/>
+          <w:bCs/>
+          <w:i/>
+          <w:iCs/>
+        </w:rPr>
+        <w:t xml:space="preserve">organizational alignment</w:t>
+      </w:r>
+      <w:r>
+        <w:t xml:space="preserve"> </w:t>
+      </w:r>
+      <w:r>
+        <w:t xml:space="preserve">melalui kerangka 4Cs. Ketiga lensa bersifat</w:t>
+      </w:r>
+      <w:r>
+        <w:t xml:space="preserve"> </w:t>
+      </w:r>
+      <w:r>
+        <w:rPr>
+          <w:b/>
+          <w:bCs/>
+        </w:rPr>
+        <w:t xml:space="preserve">hierarkis dan komplementer</w:t>
+      </w:r>
+      <w:r>
+        <w:t xml:space="preserve">: sinergi Level 1 hanya terealisasi bila unit bisnis memiliki</w:t>
+      </w:r>
+      <w:r>
+        <w:t xml:space="preserve"> </w:t>
+      </w:r>
+      <w:r>
+        <w:rPr>
+          <w:i/>
+          <w:iCs/>
+        </w:rPr>
+        <w:t xml:space="preserve">internal fit</w:t>
+      </w:r>
+      <w:r>
+        <w:t xml:space="preserve"> </w:t>
+      </w:r>
+      <w:r>
+        <w:t xml:space="preserve">sehat di Level 2.</w:t>
+      </w:r>
+    </w:p>
+    <w:p>
+      <w:pPr>
+        <w:pStyle w:val="BodyText"/>
+      </w:pPr>
+      <w:r>
+        <w:rPr>
+          <w:b/>
+          <w:bCs/>
+        </w:rPr>
+        <w:t xml:space="preserve">Penerapan di Indonesia</w:t>
+      </w:r>
+      <w:r>
+        <w:t xml:space="preserve"> </w:t>
+      </w:r>
+      <w:r>
+        <w:t xml:space="preserve">memperkuat relevansi.</w:t>
+      </w:r>
+      <w:r>
+        <w:t xml:space="preserve"> </w:t>
+      </w:r>
+      <w:r>
+        <w:rPr>
+          <w:b/>
+          <w:bCs/>
+        </w:rPr>
+        <w:t xml:space="preserve">Gojek dan Tokopedia</w:t>
+      </w:r>
+      <w:r>
+        <w:t xml:space="preserve"> </w:t>
+      </w:r>
+      <w:r>
+        <w:t xml:space="preserve">menjalankan</w:t>
+      </w:r>
+      <w:r>
+        <w:t xml:space="preserve"> </w:t>
+      </w:r>
+      <w:r>
+        <w:rPr>
+          <w:i/>
+          <w:iCs/>
+        </w:rPr>
+        <w:t xml:space="preserve">differentiation</w:t>
+      </w:r>
+      <w:r>
+        <w:t xml:space="preserve"> </w:t>
+      </w:r>
+      <w:r>
+        <w:t xml:space="preserve">berbasis inovasi:</w:t>
+      </w:r>
+      <w:r>
+        <w:t xml:space="preserve"> </w:t>
+      </w:r>
+      <w:r>
+        <w:rPr>
+          <w:i/>
+          <w:iCs/>
+        </w:rPr>
+        <w:t xml:space="preserve">innovation-oriented</w:t>
+      </w:r>
+      <w:r>
+        <w:t xml:space="preserve"> </w:t>
+      </w:r>
+      <w:r>
+        <w:t xml:space="preserve">HR dengan rekrutmen berbasis kapabilitas teknis,</w:t>
+      </w:r>
+      <w:r>
+        <w:t xml:space="preserve"> </w:t>
+      </w:r>
+      <w:r>
+        <w:rPr>
+          <w:i/>
+          <w:iCs/>
+        </w:rPr>
+        <w:t xml:space="preserve">career ladder</w:t>
+      </w:r>
+      <w:r>
+        <w:t xml:space="preserve"> </w:t>
+      </w:r>
+      <w:r>
+        <w:t xml:space="preserve">ganda, serta</w:t>
+      </w:r>
+      <w:r>
+        <w:t xml:space="preserve"> </w:t>
+      </w:r>
+      <w:r>
+        <w:rPr>
+          <w:i/>
+          <w:iCs/>
+        </w:rPr>
+        <w:t xml:space="preserve">reward</w:t>
+      </w:r>
+      <w:r>
+        <w:t xml:space="preserve"> </w:t>
+      </w:r>
+      <w:r>
+        <w:t xml:space="preserve">yang menekankan</w:t>
+      </w:r>
+      <w:r>
+        <w:t xml:space="preserve"> </w:t>
+      </w:r>
+      <w:r>
+        <w:rPr>
+          <w:i/>
+          <w:iCs/>
+        </w:rPr>
+        <w:t xml:space="preserve">equity ownership</w:t>
+      </w:r>
+      <w:r>
+        <w:t xml:space="preserve"> </w:t>
+      </w:r>
+      <w:r>
+        <w:t xml:space="preserve">dan otonomi tim — konsisten dengan</w:t>
+      </w:r>
+      <w:r>
+        <w:t xml:space="preserve"> </w:t>
+      </w:r>
+      <w:r>
+        <w:rPr>
+          <w:i/>
+          <w:iCs/>
+        </w:rPr>
+        <w:t xml:space="preserve">human capital reward</w:t>
+      </w:r>
+      <w:r>
+        <w:t xml:space="preserve"> </w:t>
+      </w:r>
+      <w:r>
+        <w:t xml:space="preserve">intrinsik-berat.</w:t>
+      </w:r>
+      <w:r>
+        <w:t xml:space="preserve"> </w:t>
+      </w:r>
+      <w:r>
+        <w:rPr>
+          <w:b/>
+          <w:bCs/>
+        </w:rPr>
+        <w:t xml:space="preserve">Astra International</w:t>
+      </w:r>
+      <w:r>
+        <w:t xml:space="preserve"> </w:t>
+      </w:r>
+      <w:r>
+        <w:t xml:space="preserve">pada lini manufaktur menjalankan</w:t>
+      </w:r>
+      <w:r>
+        <w:t xml:space="preserve"> </w:t>
+      </w:r>
+      <w:r>
+        <w:rPr>
+          <w:i/>
+          <w:iCs/>
+        </w:rPr>
+        <w:t xml:space="preserve">cost leadership</w:t>
+      </w:r>
+      <w:r>
+        <w:t xml:space="preserve"> </w:t>
+      </w:r>
+      <w:r>
+        <w:t xml:space="preserve">dengan KPI kontribusi unit bisnis dan pengukuran produktivitas ketat — konsisten dengan</w:t>
+      </w:r>
+      <w:r>
+        <w:t xml:space="preserve"> </w:t>
+      </w:r>
+      <w:r>
+        <w:rPr>
+          <w:i/>
+          <w:iCs/>
+        </w:rPr>
+        <w:t xml:space="preserve">contribution-oriented</w:t>
+      </w:r>
+      <w:r>
+        <w:t xml:space="preserve"> </w:t>
+      </w:r>
+      <w:r>
+        <w:t xml:space="preserve">HR dan</w:t>
+      </w:r>
+      <w:r>
+        <w:t xml:space="preserve"> </w:t>
+      </w:r>
+      <w:r>
+        <w:rPr>
+          <w:i/>
+          <w:iCs/>
+        </w:rPr>
+        <w:t xml:space="preserve">output reward</w:t>
+      </w:r>
+      <w:r>
+        <w:t xml:space="preserve"> </w:t>
+      </w:r>
+      <w:r>
+        <w:t xml:space="preserve">ekstrinsik-berat. Sebagai kasus negatif, banyak</w:t>
+      </w:r>
+      <w:r>
+        <w:t xml:space="preserve"> </w:t>
+      </w:r>
+      <w:r>
+        <w:rPr>
+          <w:b/>
+          <w:bCs/>
+        </w:rPr>
+        <w:t xml:space="preserve">BUMN</w:t>
+      </w:r>
+      <w:r>
+        <w:t xml:space="preserve"> </w:t>
+      </w:r>
+      <w:r>
+        <w:t xml:space="preserve">berambisi</w:t>
+      </w:r>
+      <w:r>
+        <w:t xml:space="preserve"> </w:t>
+      </w:r>
+      <w:r>
+        <w:rPr>
+          <w:i/>
+          <w:iCs/>
+        </w:rPr>
+        <w:t xml:space="preserve">differentiation</w:t>
+      </w:r>
+      <w:r>
+        <w:t xml:space="preserve"> </w:t>
+      </w:r>
+      <w:r>
+        <w:t xml:space="preserve">tetapi mempertahankan</w:t>
+      </w:r>
+      <w:r>
+        <w:t xml:space="preserve"> </w:t>
+      </w:r>
+      <w:r>
+        <w:rPr>
+          <w:i/>
+          <w:iCs/>
+        </w:rPr>
+        <w:t xml:space="preserve">reward</w:t>
+      </w:r>
+      <w:r>
+        <w:t xml:space="preserve"> </w:t>
+      </w:r>
+      <w:r>
+        <w:t xml:space="preserve">birokratik berbasis masa kerja — menghasilkan</w:t>
+      </w:r>
+      <w:r>
+        <w:t xml:space="preserve"> </w:t>
+      </w:r>
+      <w:r>
+        <w:rPr>
+          <w:i/>
+          <w:iCs/>
+        </w:rPr>
+        <w:t xml:space="preserve">execution gap</w:t>
+      </w:r>
+      <w:r>
+        <w:t xml:space="preserve"> </w:t>
+      </w:r>
+      <w:r>
+        <w:t xml:space="preserve">yang konsisten dengan prediksi</w:t>
+      </w:r>
+      <w:r>
+        <w:t xml:space="preserve"> </w:t>
+      </w:r>
+      <w:r>
+        <w:rPr>
+          <w:i/>
+          <w:iCs/>
+        </w:rPr>
+        <w:t xml:space="preserve">innovation paralysis</w:t>
+      </w:r>
+      <w:r>
+        <w:t xml:space="preserve"> </w:t>
+      </w:r>
+      <w:r>
+        <w:t xml:space="preserve">Hsieh dan Chen.</w:t>
+      </w:r>
+    </w:p>
+    <w:bookmarkEnd w:id="195"/>
+    <w:bookmarkEnd w:id="196"/>
+    <w:bookmarkEnd w:id="197"/>
     <w:sectPr>
       <w:pgSz w:h="15840" w:w="12240"/>
       <w:pgMar w:bottom="1417" w:footer="720" w:gutter="0" w:header="720" w:left="1701" w:right="1417" w:top="1701"/>

</xml_diff>

<commit_message>
feat(master-doc): CR Art 12 — Okebaram & Onuoha 2018
Add final content file 31_part3_art12.md: Critical Review of Okebaram &
Onuoha (2018) — 4Cs framework, three-level strategic-fit taxonomy, and
SEVERE methodological critique (K-S test misuse, no Cronbach's alpha,
p=0.000 across all hypotheses). Rebuild master DOCX; 0 missing sections.

Co-Authored-By: Claude Sonnet 4.6 <noreply@anthropic.com>
</commit_message>
<xml_diff>
--- a/01079_Dzaki Muhammad Yusfian_Master Consolidated Study Document.docx
+++ b/01079_Dzaki Muhammad Yusfian_Master Consolidated Study Document.docx
@@ -42869,6 +42869,2617 @@
     <w:bookmarkEnd w:id="195"/>
     <w:bookmarkEnd w:id="196"/>
     <w:bookmarkEnd w:id="197"/>
+    <w:bookmarkStart w:id="204" w:name="bagian-iii-critical-review-artikel-12"/>
+    <w:p>
+      <w:pPr>
+        <w:pStyle w:val="Heading1"/>
+      </w:pPr>
+      <w:r>
+        <w:t xml:space="preserve">BAGIAN III — CRITICAL REVIEW ARTIKEL 12</w:t>
+      </w:r>
+    </w:p>
+    <w:bookmarkStart w:id="203" w:name="Xbeab985ea61eb7a3bedf60508104f7ca7d2f325"/>
+    <w:p>
+      <w:pPr>
+        <w:pStyle w:val="Heading2"/>
+      </w:pPr>
+      <w:r>
+        <w:t xml:space="preserve">Okebaram &amp; Onuoha (2018) —</w:t>
+      </w:r>
+      <w:r>
+        <w:t xml:space="preserve"> </w:t>
+      </w:r>
+      <w:r>
+        <w:rPr>
+          <w:i/>
+          <w:iCs/>
+        </w:rPr>
+        <w:t xml:space="preserve">Implication of Strategic Fit and Sustainability on Organizational Effectiveness</w:t>
+      </w:r>
+    </w:p>
+    <w:p>
+      <w:pPr>
+        <w:pStyle w:val="FirstParagraph"/>
+      </w:pPr>
+      <w:r>
+        <w:rPr>
+          <w:b/>
+          <w:bCs/>
+        </w:rPr>
+        <w:t xml:space="preserve">Sitasi lengkap:</w:t>
+      </w:r>
+      <w:r>
+        <w:t xml:space="preserve"> </w:t>
+      </w:r>
+      <w:r>
+        <w:t xml:space="preserve">Okebaram, S. M., &amp; Onuoha, C. E. (2018). Implication of Strategic Fit and Sustainability on Organizational Effectiveness.</w:t>
+      </w:r>
+      <w:r>
+        <w:t xml:space="preserve"> </w:t>
+      </w:r>
+      <w:r>
+        <w:rPr>
+          <w:i/>
+          <w:iCs/>
+        </w:rPr>
+        <w:t xml:space="preserve">International Academic Research Conference in Vienna</w:t>
+      </w:r>
+      <w:r>
+        <w:t xml:space="preserve">, pp. 194–213.</w:t>
+      </w:r>
+    </w:p>
+    <w:p>
+      <w:r>
+        <w:pict>
+          <v:rect style="width:0;height:1.5pt" o:hralign="center" o:hrstd="t" o:hr="t"/>
+        </w:pict>
+      </w:r>
+    </w:p>
+    <w:bookmarkStart w:id="198" w:name="ringkasan-inti-11"/>
+    <w:p>
+      <w:pPr>
+        <w:pStyle w:val="Heading3"/>
+      </w:pPr>
+      <w:r>
+        <w:t xml:space="preserve">Ringkasan Inti</w:t>
+      </w:r>
+    </w:p>
+    <w:p>
+      <w:pPr>
+        <w:pStyle w:val="FirstParagraph"/>
+      </w:pPr>
+      <w:r>
+        <w:t xml:space="preserve">Okebaram dan Onuoha (2018) menyajikan studi empiris survei yang bertujuan menguji bagaimana</w:t>
+      </w:r>
+      <w:r>
+        <w:t xml:space="preserve"> </w:t>
+      </w:r>
+      <w:r>
+        <w:rPr>
+          <w:b/>
+          <w:bCs/>
+        </w:rPr>
+        <w:t xml:space="preserve">strategic fit</w:t>
+      </w:r>
+      <w:r>
+        <w:t xml:space="preserve"> </w:t>
+      </w:r>
+      <w:r>
+        <w:t xml:space="preserve">— dioperasionalisasi melalui kerangka 4Cs Medcof (1997) — berimplikasi pada</w:t>
+      </w:r>
+      <w:r>
+        <w:t xml:space="preserve"> </w:t>
+      </w:r>
+      <w:r>
+        <w:rPr>
+          <w:i/>
+          <w:iCs/>
+        </w:rPr>
+        <w:t xml:space="preserve">organizational effectiveness</w:t>
+      </w:r>
+      <w:r>
+        <w:t xml:space="preserve"> </w:t>
+      </w:r>
+      <w:r>
+        <w:t xml:space="preserve">melalui tiga jalur organisasional:</w:t>
+      </w:r>
+      <w:r>
+        <w:t xml:space="preserve"> </w:t>
+      </w:r>
+      <w:r>
+        <w:rPr>
+          <w:i/>
+          <w:iCs/>
+        </w:rPr>
+        <w:t xml:space="preserve">organization design</w:t>
+      </w:r>
+      <w:r>
+        <w:t xml:space="preserve">,</w:t>
+      </w:r>
+      <w:r>
+        <w:t xml:space="preserve"> </w:t>
+      </w:r>
+      <w:r>
+        <w:rPr>
+          <w:i/>
+          <w:iCs/>
+        </w:rPr>
+        <w:t xml:space="preserve">employee relations</w:t>
+      </w:r>
+      <w:r>
+        <w:t xml:space="preserve">, dan</w:t>
+      </w:r>
+      <w:r>
+        <w:t xml:space="preserve"> </w:t>
+      </w:r>
+      <w:r>
+        <w:rPr>
+          <w:i/>
+          <w:iCs/>
+        </w:rPr>
+        <w:t xml:space="preserve">information exchange</w:t>
+      </w:r>
+      <w:r>
+        <w:t xml:space="preserve">. Penelitian ini dilaksanakan dengan desain</w:t>
+      </w:r>
+      <w:r>
+        <w:t xml:space="preserve"> </w:t>
+      </w:r>
+      <w:r>
+        <w:rPr>
+          <w:i/>
+          <w:iCs/>
+        </w:rPr>
+        <w:t xml:space="preserve">cross-sectional</w:t>
+      </w:r>
+      <w:r>
+        <w:t xml:space="preserve"> </w:t>
+      </w:r>
+      <w:r>
+        <w:t xml:space="preserve">menggunakan kuesioner dan wawancara sebagai instrumen, dengan sampel n = 212 responden yang dipilih dari populasi 450 menggunakan formula Slovin (margin kesalahan 5%). Populasi mencakup tiga operator telekomunikasi Nigeria — MTN, Airtel, dan Etisalat — serta satu bank internasional, Ecobank, yang dipilih karena cakupan operasi lintas batasnya.</w:t>
+      </w:r>
+    </w:p>
+    <w:p>
+      <w:pPr>
+        <w:pStyle w:val="BodyText"/>
+      </w:pPr>
+      <w:r>
+        <w:t xml:space="preserve">Relevansi manajerial artikel ini berpijak pada data kegagalan</w:t>
+      </w:r>
+      <w:r>
+        <w:t xml:space="preserve"> </w:t>
+      </w:r>
+      <w:r>
+        <w:rPr>
+          <w:i/>
+          <w:iCs/>
+        </w:rPr>
+        <w:t xml:space="preserve">alliance</w:t>
+      </w:r>
+      <w:r>
+        <w:t xml:space="preserve"> </w:t>
+      </w:r>
+      <w:r>
+        <w:t xml:space="preserve">dan M&amp;A: Bamford, Gomes-Casseres, dan Robinson (2004) melaporkan kegagalan 30–70% aliansi strategis, sementara Lunnan dan Hauglang (2008) mencatat tingkat terminasi aliansi lebih dari 50%. Fakta ini mendorong penulis untuk membangun argumen bahwa</w:t>
+      </w:r>
+      <w:r>
+        <w:t xml:space="preserve"> </w:t>
+      </w:r>
+      <w:r>
+        <w:rPr>
+          <w:b/>
+          <w:bCs/>
+        </w:rPr>
+        <w:t xml:space="preserve">strategic fit</w:t>
+      </w:r>
+      <w:r>
+        <w:t xml:space="preserve"> </w:t>
+      </w:r>
+      <w:r>
+        <w:t xml:space="preserve">adalah alat</w:t>
+      </w:r>
+      <w:r>
+        <w:t xml:space="preserve"> </w:t>
+      </w:r>
+      <w:r>
+        <w:rPr>
+          <w:i/>
+          <w:iCs/>
+        </w:rPr>
+        <w:t xml:space="preserve">due diligence</w:t>
+      </w:r>
+      <w:r>
+        <w:t xml:space="preserve"> </w:t>
+      </w:r>
+      <w:r>
+        <w:t xml:space="preserve">kritis yang harus digunakan sebelum dan sesudah transaksi M&amp;A.</w:t>
+      </w:r>
+    </w:p>
+    <w:p>
+      <w:pPr>
+        <w:pStyle w:val="BodyText"/>
+      </w:pPr>
+      <w:r>
+        <w:t xml:space="preserve">Kerangka konseptual artikel memadukan definisi Nadler dan Tushman (1980) —</w:t>
+      </w:r>
+      <w:r>
+        <w:t xml:space="preserve"> </w:t>
+      </w:r>
+      <w:r>
+        <w:rPr>
+          <w:i/>
+          <w:iCs/>
+        </w:rPr>
+        <w:t xml:space="preserve">fit</w:t>
+      </w:r>
+      <w:r>
+        <w:t xml:space="preserve"> </w:t>
+      </w:r>
+      <w:r>
+        <w:t xml:space="preserve">sebagai derajat kesesuaian antara kebutuhan, tujuan, dan struktur komponen organisasi — dengan perspektif eksternal Grant (2007) tentang pencocokan sumber daya dan kapabilitas terhadap peluang lingkungan. Artikel juga memperkenalkan</w:t>
+      </w:r>
+      <w:r>
+        <w:t xml:space="preserve"> </w:t>
+      </w:r>
+      <w:r>
+        <w:rPr>
+          <w:b/>
+          <w:bCs/>
+        </w:rPr>
+        <w:t xml:space="preserve">Executive Fit Matrix</w:t>
+      </w:r>
+      <w:r>
+        <w:t xml:space="preserve"> </w:t>
+      </w:r>
+      <w:r>
+        <w:t xml:space="preserve">(diadaptasi dari Effron dan Ort via HBR) yang mengukur kesesuaian strategi CEO dengan dua sumbu: dimensi strategi (</w:t>
+      </w:r>
+      <w:r>
+        <w:rPr>
+          <w:i/>
+          <w:iCs/>
+        </w:rPr>
+        <w:t xml:space="preserve">cost advantage</w:t>
+      </w:r>
+      <w:r>
+        <w:t xml:space="preserve"> </w:t>
+      </w:r>
+      <w:r>
+        <w:t xml:space="preserve">vs. </w:t>
+      </w:r>
+      <w:r>
+        <w:rPr>
+          <w:i/>
+          <w:iCs/>
+        </w:rPr>
+        <w:t xml:space="preserve">differentiation advantage</w:t>
+      </w:r>
+      <w:r>
+        <w:t xml:space="preserve">) dan dimensi perubahan (</w:t>
+      </w:r>
+      <w:r>
+        <w:rPr>
+          <w:i/>
+          <w:iCs/>
+        </w:rPr>
+        <w:t xml:space="preserve">start-up/turnaround</w:t>
+      </w:r>
+      <w:r>
+        <w:t xml:space="preserve"> </w:t>
+      </w:r>
+      <w:r>
+        <w:t xml:space="preserve">vs. </w:t>
+      </w:r>
+      <w:r>
+        <w:rPr>
+          <w:i/>
+          <w:iCs/>
+        </w:rPr>
+        <w:t xml:space="preserve">steady-state</w:t>
+      </w:r>
+      <w:r>
+        <w:t xml:space="preserve">). Ketiga hipotesis null diuji secara statistik dan seluruhnya ditolak, sehingga penulis menyimpulkan bahwa integrasi 4Cs dengan ketiga elemen organisasional menghasilkan sinergi dan keberlanjutan</w:t>
+      </w:r>
+      <w:r>
+        <w:t xml:space="preserve"> </w:t>
+      </w:r>
+      <w:r>
+        <w:rPr>
+          <w:i/>
+          <w:iCs/>
+        </w:rPr>
+        <w:t xml:space="preserve">organizational effectiveness</w:t>
+      </w:r>
+      <w:r>
+        <w:t xml:space="preserve">.</w:t>
+      </w:r>
+    </w:p>
+    <w:p>
+      <w:r>
+        <w:pict>
+          <v:rect style="width:0;height:1.5pt" o:hralign="center" o:hrstd="t" o:hr="t"/>
+        </w:pict>
+      </w:r>
+    </w:p>
+    <w:bookmarkEnd w:id="198"/>
+    <w:bookmarkStart w:id="199" w:name="temuan-utama-11"/>
+    <w:p>
+      <w:pPr>
+        <w:pStyle w:val="Heading3"/>
+      </w:pPr>
+      <w:r>
+        <w:t xml:space="preserve">Temuan Utama</w:t>
+      </w:r>
+    </w:p>
+    <w:p>
+      <w:pPr>
+        <w:pStyle w:val="FirstParagraph"/>
+      </w:pPr>
+      <w:r>
+        <w:t xml:space="preserve">Kontribusi empiris inti artikel adalah pengujian tiga hipotesis yang menghubungkan</w:t>
+      </w:r>
+      <w:r>
+        <w:t xml:space="preserve"> </w:t>
+      </w:r>
+      <w:r>
+        <w:rPr>
+          <w:b/>
+          <w:bCs/>
+        </w:rPr>
+        <w:t xml:space="preserve">strategic fit</w:t>
+      </w:r>
+      <w:r>
+        <w:t xml:space="preserve"> </w:t>
+      </w:r>
+      <w:r>
+        <w:t xml:space="preserve">— melalui 4Cs — dengan tiga indikator</w:t>
+      </w:r>
+      <w:r>
+        <w:t xml:space="preserve"> </w:t>
+      </w:r>
+      <w:r>
+        <w:rPr>
+          <w:i/>
+          <w:iCs/>
+        </w:rPr>
+        <w:t xml:space="preserve">organizational effectiveness</w:t>
+      </w:r>
+      <w:r>
+        <w:t xml:space="preserve">.</w:t>
+      </w:r>
+    </w:p>
+    <w:p>
+      <w:pPr>
+        <w:pStyle w:val="BodyText"/>
+      </w:pPr>
+      <w:r>
+        <w:rPr>
+          <w:b/>
+          <w:bCs/>
+        </w:rPr>
+        <w:t xml:space="preserve">Hipotesis H1: Strategic Organization Design meningkatkan Organizational Effectiveness.</w:t>
+      </w:r>
+      <w:r>
+        <w:t xml:space="preserve"> </w:t>
+      </w:r>
+      <w:r>
+        <w:t xml:space="preserve">Data menunjukkan Mean = 3,78 dan SD = 1,16 dari skala Likert lima poin; 115 responden (54,2%) sangat setuju dan 53 (25,0%) setuju bahwa desain organisasi strategis meningkatkan efektivitas. Uji menghasilkan Z = 5,342 &gt; Z-kritis (1,96), p = 0,000 &lt; 0,05. H₀1 ditolak.</w:t>
+      </w:r>
+    </w:p>
+    <w:p>
+      <w:pPr>
+        <w:pStyle w:val="BodyText"/>
+      </w:pPr>
+      <w:r>
+        <w:rPr>
+          <w:b/>
+          <w:bCs/>
+        </w:rPr>
+        <w:t xml:space="preserve">Hipotesis H2: Strategic Fit mempertahankan Employee Relations untuk meningkatkan Organizational Effectiveness.</w:t>
+      </w:r>
+      <w:r>
+        <w:t xml:space="preserve"> </w:t>
+      </w:r>
+      <w:r>
+        <w:t xml:space="preserve">Mean = 3,88, SD = 0,97; 135 responden (63,7%) menyatakan</w:t>
+      </w:r>
+      <w:r>
+        <w:t xml:space="preserve"> </w:t>
+      </w:r>
+      <w:r>
+        <w:t xml:space="preserve">“sejauh besar”</w:t>
+      </w:r>
+      <w:r>
+        <w:t xml:space="preserve"> </w:t>
+      </w:r>
+      <w:r>
+        <w:t xml:space="preserve">dan 43 (20,3%) menyatakan</w:t>
+      </w:r>
+      <w:r>
+        <w:t xml:space="preserve"> </w:t>
+      </w:r>
+      <w:r>
+        <w:t xml:space="preserve">“sejauh sangat besar”</w:t>
+      </w:r>
+      <w:r>
+        <w:t xml:space="preserve">. Z = 5,677 &gt; Z-kritis (1,96), p = 0,000. H₀2 ditolak.</w:t>
+      </w:r>
+    </w:p>
+    <w:p>
+      <w:pPr>
+        <w:pStyle w:val="BodyText"/>
+      </w:pPr>
+      <w:r>
+        <w:rPr>
+          <w:b/>
+          <w:bCs/>
+        </w:rPr>
+        <w:t xml:space="preserve">Hipotesis H3: Strategic Fit mendorong Information Exchange untuk meningkatkan Organizational Effectiveness.</w:t>
+      </w:r>
+      <w:r>
+        <w:t xml:space="preserve"> </w:t>
+      </w:r>
+      <w:r>
+        <w:t xml:space="preserve">Mean = 4,07, SD = 0,64 — distribusi tersempit dari ketiga hipotesis, menunjukkan konsensus responden yang paling tinggi; 161 responden (75,9%) menyatakan</w:t>
+      </w:r>
+      <w:r>
+        <w:t xml:space="preserve"> </w:t>
+      </w:r>
+      <w:r>
+        <w:t xml:space="preserve">“sejauh besar”</w:t>
+      </w:r>
+      <w:r>
+        <w:t xml:space="preserve">. Z = 5,745 &gt; Z-kritis (1,96), p = 0,000. H₀3 ditolak.</w:t>
+      </w:r>
+    </w:p>
+    <w:p>
+      <w:pPr>
+        <w:pStyle w:val="BodyText"/>
+      </w:pPr>
+      <w:r>
+        <w:t xml:space="preserve">Mekanisme kausal yang diajukan menempatkan kerangka</w:t>
+      </w:r>
+      <w:r>
+        <w:t xml:space="preserve"> </w:t>
+      </w:r>
+      <w:r>
+        <w:rPr>
+          <w:b/>
+          <w:bCs/>
+        </w:rPr>
+        <w:t xml:space="preserve">4Cs Medcof (1997)</w:t>
+      </w:r>
+      <w:r>
+        <w:t xml:space="preserve"> </w:t>
+      </w:r>
+      <w:r>
+        <w:t xml:space="preserve">sebagai prediktor utama. Keempat dimensi bekerja sebagai berikut:</w:t>
+      </w:r>
+    </w:p>
+    <w:p>
+      <w:pPr>
+        <w:pStyle w:val="Compact"/>
+        <w:numPr>
+          <w:ilvl w:val="0"/>
+          <w:numId w:val="1013"/>
+        </w:numPr>
+      </w:pPr>
+      <w:r>
+        <w:rPr>
+          <w:b/>
+          <w:bCs/>
+        </w:rPr>
+        <w:t xml:space="preserve">Capability</w:t>
+      </w:r>
+      <w:r>
+        <w:t xml:space="preserve"> </w:t>
+      </w:r>
+      <w:r>
+        <w:t xml:space="preserve">(</w:t>
+      </w:r>
+      <w:r>
+        <w:rPr>
+          <w:i/>
+          <w:iCs/>
+        </w:rPr>
+        <w:t xml:space="preserve">Kemampuan</w:t>
+      </w:r>
+      <w:r>
+        <w:t xml:space="preserve">): kemampuan mitra untuk menjalankan peran strategisnya — mencakup keterampilan teknis,</w:t>
+      </w:r>
+      <w:r>
+        <w:t xml:space="preserve"> </w:t>
+      </w:r>
+      <w:r>
+        <w:rPr>
+          <w:i/>
+          <w:iCs/>
+        </w:rPr>
+        <w:t xml:space="preserve">intellectual property</w:t>
+      </w:r>
+      <w:r>
+        <w:t xml:space="preserve">,</w:t>
+      </w:r>
+      <w:r>
+        <w:t xml:space="preserve"> </w:t>
+      </w:r>
+      <w:r>
+        <w:rPr>
+          <w:i/>
+          <w:iCs/>
+        </w:rPr>
+        <w:t xml:space="preserve">brand equity</w:t>
+      </w:r>
+      <w:r>
+        <w:t xml:space="preserve">, dan akses pasar. Bukan hanya kemampuan mitra yang dievaluasi, tetapi juga self-assessment kapabilitas perusahaan pengakuisisi itu sendiri.</w:t>
+      </w:r>
+    </w:p>
+    <w:p>
+      <w:pPr>
+        <w:pStyle w:val="Compact"/>
+        <w:numPr>
+          <w:ilvl w:val="0"/>
+          <w:numId w:val="1013"/>
+        </w:numPr>
+      </w:pPr>
+      <w:r>
+        <w:rPr>
+          <w:b/>
+          <w:bCs/>
+        </w:rPr>
+        <w:t xml:space="preserve">Compatibility</w:t>
+      </w:r>
+      <w:r>
+        <w:t xml:space="preserve"> </w:t>
+      </w:r>
+      <w:r>
+        <w:t xml:space="preserve">(</w:t>
+      </w:r>
+      <w:r>
+        <w:rPr>
+          <w:i/>
+          <w:iCs/>
+        </w:rPr>
+        <w:t xml:space="preserve">Kompatibilitas</w:t>
+      </w:r>
+      <w:r>
+        <w:t xml:space="preserve">): dinilai sebagai C yang paling penting. Mencakup kompatibilitas kultural,</w:t>
+      </w:r>
+      <w:r>
+        <w:t xml:space="preserve"> </w:t>
+      </w:r>
+      <w:r>
+        <w:rPr>
+          <w:i/>
+          <w:iCs/>
+        </w:rPr>
+        <w:t xml:space="preserve">managerial style</w:t>
+      </w:r>
+      <w:r>
+        <w:t xml:space="preserve">,</w:t>
+      </w:r>
+      <w:r>
+        <w:t xml:space="preserve"> </w:t>
+      </w:r>
+      <w:r>
+        <w:rPr>
+          <w:i/>
+          <w:iCs/>
+        </w:rPr>
+        <w:t xml:space="preserve">organizational climate</w:t>
+      </w:r>
+      <w:r>
+        <w:t xml:space="preserve">, fokus internal vs. eksternal, orientasi tugas vs. sosial, serta pendekatan</w:t>
+      </w:r>
+      <w:r>
+        <w:t xml:space="preserve"> </w:t>
+      </w:r>
+      <w:r>
+        <w:rPr>
+          <w:i/>
+          <w:iCs/>
+        </w:rPr>
+        <w:t xml:space="preserve">ad hoc</w:t>
+      </w:r>
+      <w:r>
+        <w:t xml:space="preserve"> </w:t>
+      </w:r>
+      <w:r>
+        <w:t xml:space="preserve">vs. perencanaan. Penulis menekankan pentingnya</w:t>
+      </w:r>
+      <w:r>
+        <w:t xml:space="preserve"> </w:t>
+      </w:r>
+      <w:r>
+        <w:rPr>
+          <w:i/>
+          <w:iCs/>
+        </w:rPr>
+        <w:t xml:space="preserve">universal compatibility</w:t>
+      </w:r>
+      <w:r>
+        <w:t xml:space="preserve"> </w:t>
+      </w:r>
+      <w:r>
+        <w:t xml:space="preserve">— kemampuan bekerja sama dengan hampir semua mitra di level operasional.</w:t>
+      </w:r>
+    </w:p>
+    <w:p>
+      <w:pPr>
+        <w:pStyle w:val="Compact"/>
+        <w:numPr>
+          <w:ilvl w:val="0"/>
+          <w:numId w:val="1013"/>
+        </w:numPr>
+      </w:pPr>
+      <w:r>
+        <w:rPr>
+          <w:b/>
+          <w:bCs/>
+        </w:rPr>
+        <w:t xml:space="preserve">Commitment</w:t>
+      </w:r>
+      <w:r>
+        <w:t xml:space="preserve"> </w:t>
+      </w:r>
+      <w:r>
+        <w:t xml:space="preserve">(</w:t>
+      </w:r>
+      <w:r>
+        <w:rPr>
+          <w:i/>
+          <w:iCs/>
+        </w:rPr>
+        <w:t xml:space="preserve">Komitmen</w:t>
+      </w:r>
+      <w:r>
+        <w:t xml:space="preserve">): melibatkan dua aspek — komitmen berkelanjutan atas sumber daya (waktu, uang, talenta, perhatian) dan komitmen psikologis-pragmatis. Komitmen pragmatis dimiliki oleh pihak yang memiliki kepentingan strategis signifikan, kompatibel, dan mampu menjalankan perannya.</w:t>
+      </w:r>
+    </w:p>
+    <w:p>
+      <w:pPr>
+        <w:pStyle w:val="Compact"/>
+        <w:numPr>
+          <w:ilvl w:val="0"/>
+          <w:numId w:val="1013"/>
+        </w:numPr>
+      </w:pPr>
+      <w:r>
+        <w:rPr>
+          <w:b/>
+          <w:bCs/>
+        </w:rPr>
+        <w:t xml:space="preserve">Control</w:t>
+      </w:r>
+      <w:r>
+        <w:t xml:space="preserve"> </w:t>
+      </w:r>
+      <w:r>
+        <w:t xml:space="preserve">(</w:t>
+      </w:r>
+      <w:r>
+        <w:rPr>
+          <w:i/>
+          <w:iCs/>
+        </w:rPr>
+        <w:t xml:space="preserve">Kendali</w:t>
+      </w:r>
+      <w:r>
+        <w:t xml:space="preserve">): dalam sebagian besar kemitraan,</w:t>
+      </w:r>
+      <w:r>
+        <w:t xml:space="preserve"> </w:t>
+      </w:r>
+      <w:r>
+        <w:rPr>
+          <w:i/>
+          <w:iCs/>
+        </w:rPr>
+        <w:t xml:space="preserve">control</w:t>
+      </w:r>
+      <w:r>
+        <w:t xml:space="preserve"> </w:t>
+      </w:r>
+      <w:r>
+        <w:t xml:space="preserve">harus dibagi secara merata. Bila mitra dominan mengendalikan terlalu banyak, kemitraan cenderung diarahkan sesuai preferensinya saja — yang tidak disukai pihak lain. Apabila suatu organisasi akan menjadi pihak yang lebih lemah secara permanen, sebaiknya tidak memasuki kemitraan tersebut.</w:t>
+      </w:r>
+    </w:p>
+    <w:p>
+      <w:pPr>
+        <w:pStyle w:val="FirstParagraph"/>
+      </w:pPr>
+      <w:r>
+        <w:rPr>
+          <w:b/>
+          <w:bCs/>
+        </w:rPr>
+        <w:t xml:space="preserve">Executive Fit Matrix</w:t>
+      </w:r>
+      <w:r>
+        <w:t xml:space="preserve"> </w:t>
+      </w:r>
+      <w:r>
+        <w:t xml:space="preserve">menambahkan dimensi kepemimpinan: sumbu strategi membentang dari</w:t>
+      </w:r>
+      <w:r>
+        <w:t xml:space="preserve"> </w:t>
+      </w:r>
+      <w:r>
+        <w:rPr>
+          <w:i/>
+          <w:iCs/>
+        </w:rPr>
+        <w:t xml:space="preserve">cost advantage</w:t>
+      </w:r>
+      <w:r>
+        <w:t xml:space="preserve"> </w:t>
+      </w:r>
+      <w:r>
+        <w:t xml:space="preserve">ke</w:t>
+      </w:r>
+      <w:r>
+        <w:t xml:space="preserve"> </w:t>
+      </w:r>
+      <w:r>
+        <w:rPr>
+          <w:i/>
+          <w:iCs/>
+        </w:rPr>
+        <w:t xml:space="preserve">differentiation advantage</w:t>
+      </w:r>
+      <w:r>
+        <w:t xml:space="preserve">, sementara sumbu perubahan membentang dari kondisi</w:t>
+      </w:r>
+      <w:r>
+        <w:t xml:space="preserve"> </w:t>
+      </w:r>
+      <w:r>
+        <w:rPr>
+          <w:i/>
+          <w:iCs/>
+        </w:rPr>
+        <w:t xml:space="preserve">start-up/turnaround</w:t>
+      </w:r>
+      <w:r>
+        <w:t xml:space="preserve"> </w:t>
+      </w:r>
+      <w:r>
+        <w:t xml:space="preserve">ke kondisi operasi rutin</w:t>
+      </w:r>
+      <w:r>
+        <w:t xml:space="preserve"> </w:t>
+      </w:r>
+      <w:r>
+        <w:rPr>
+          <w:i/>
+          <w:iCs/>
+        </w:rPr>
+        <w:t xml:space="preserve">steady-state</w:t>
+      </w:r>
+      <w:r>
+        <w:t xml:space="preserve">. Matriks ini memungkinkan dewan direksi mengevaluasi apakah profil CEO yang ada sesuai dengan posisi strategis perusahaan saat ini.</w:t>
+      </w:r>
+    </w:p>
+    <w:p>
+      <w:pPr>
+        <w:pStyle w:val="BodyText"/>
+      </w:pPr>
+      <w:r>
+        <w:t xml:space="preserve">Artikel juga mengintegrasikan tipologi Miles dan Snow (1978):</w:t>
+      </w:r>
+      <w:r>
+        <w:t xml:space="preserve"> </w:t>
+      </w:r>
+      <w:r>
+        <w:rPr>
+          <w:i/>
+          <w:iCs/>
+        </w:rPr>
+        <w:t xml:space="preserve">prospector</w:t>
+      </w:r>
+      <w:r>
+        <w:t xml:space="preserve"> </w:t>
+      </w:r>
+      <w:r>
+        <w:t xml:space="preserve">membutuhkan struktur organik terdesentralisasi;</w:t>
+      </w:r>
+      <w:r>
+        <w:t xml:space="preserve"> </w:t>
+      </w:r>
+      <w:r>
+        <w:rPr>
+          <w:i/>
+          <w:iCs/>
+        </w:rPr>
+        <w:t xml:space="preserve">defender</w:t>
+      </w:r>
+      <w:r>
+        <w:t xml:space="preserve"> </w:t>
+      </w:r>
+      <w:r>
+        <w:t xml:space="preserve">cocok dengan struktur mekanistik terpusat;</w:t>
+      </w:r>
+      <w:r>
+        <w:t xml:space="preserve"> </w:t>
+      </w:r>
+      <w:r>
+        <w:rPr>
+          <w:i/>
+          <w:iCs/>
+        </w:rPr>
+        <w:t xml:space="preserve">analyzer</w:t>
+      </w:r>
+      <w:r>
+        <w:t xml:space="preserve"> </w:t>
+      </w:r>
+      <w:r>
+        <w:t xml:space="preserve">berada di antara keduanya;</w:t>
+      </w:r>
+      <w:r>
+        <w:t xml:space="preserve"> </w:t>
+      </w:r>
+      <w:r>
+        <w:rPr>
+          <w:i/>
+          <w:iCs/>
+        </w:rPr>
+        <w:t xml:space="preserve">reactor</w:t>
+      </w:r>
+      <w:r>
+        <w:t xml:space="preserve"> </w:t>
+      </w:r>
+      <w:r>
+        <w:t xml:space="preserve">tidak memiliki keselarasan konsisten. Prinsip intinya: keberhasilan bukan ditentukan oleh fokus strategi mana yang dipilih, melainkan oleh konsistensi antara strategi dan struktur.</w:t>
+      </w:r>
+    </w:p>
+    <w:p>
+      <w:pPr>
+        <w:pStyle w:val="BodyText"/>
+      </w:pPr>
+      <w:r>
+        <w:t xml:space="preserve">Tiga rekomendasi praktis diajukan penulis: (1)</w:t>
+      </w:r>
+      <w:r>
+        <w:t xml:space="preserve"> </w:t>
+      </w:r>
+      <w:r>
+        <w:rPr>
+          <w:b/>
+          <w:bCs/>
+        </w:rPr>
+        <w:t xml:space="preserve">total reward system</w:t>
+      </w:r>
+      <w:r>
+        <w:t xml:space="preserve"> </w:t>
+      </w:r>
+      <w:r>
+        <w:t xml:space="preserve">untuk memotivasi karyawan mempertahankan kinerja tinggi; (2)</w:t>
+      </w:r>
+      <w:r>
+        <w:t xml:space="preserve"> </w:t>
+      </w:r>
+      <w:r>
+        <w:rPr>
+          <w:b/>
+          <w:bCs/>
+        </w:rPr>
+        <w:t xml:space="preserve">kepemimpinan visioner</w:t>
+      </w:r>
+      <w:r>
+        <w:t xml:space="preserve"> </w:t>
+      </w:r>
+      <w:r>
+        <w:t xml:space="preserve">untuk mempertahankan keunggulan kompetitif; (3)</w:t>
+      </w:r>
+      <w:r>
+        <w:t xml:space="preserve"> </w:t>
+      </w:r>
+      <w:r>
+        <w:rPr>
+          <w:b/>
+          <w:bCs/>
+        </w:rPr>
+        <w:t xml:space="preserve">komunikasi strategi perubahan-budaya</w:t>
+      </w:r>
+      <w:r>
+        <w:t xml:space="preserve"> </w:t>
+      </w:r>
+      <w:r>
+        <w:t xml:space="preserve">agar organisasi dapat beradaptasi dengan lingkungan dinamis.</w:t>
+      </w:r>
+    </w:p>
+    <w:p>
+      <w:r>
+        <w:pict>
+          <v:rect style="width:0;height:1.5pt" o:hralign="center" o:hrstd="t" o:hr="t"/>
+        </w:pict>
+      </w:r>
+    </w:p>
+    <w:bookmarkEnd w:id="199"/>
+    <w:bookmarkStart w:id="200" w:name="kelebihan-11"/>
+    <w:p>
+      <w:pPr>
+        <w:pStyle w:val="Heading3"/>
+      </w:pPr>
+      <w:r>
+        <w:t xml:space="preserve">Kelebihan</w:t>
+      </w:r>
+    </w:p>
+    <w:p>
+      <w:pPr>
+        <w:pStyle w:val="FirstParagraph"/>
+      </w:pPr>
+      <w:r>
+        <w:t xml:space="preserve">Kekuatan pertama artikel adalah</w:t>
+      </w:r>
+      <w:r>
+        <w:t xml:space="preserve"> </w:t>
+      </w:r>
+      <w:r>
+        <w:rPr>
+          <w:b/>
+          <w:bCs/>
+        </w:rPr>
+        <w:t xml:space="preserve">kerangka 4Cs yang terstruktur dan aplikatif</w:t>
+      </w:r>
+      <w:r>
+        <w:t xml:space="preserve">. Dibandingkan dengan banyak kerangka</w:t>
+      </w:r>
+      <w:r>
+        <w:t xml:space="preserve"> </w:t>
+      </w:r>
+      <w:r>
+        <w:rPr>
+          <w:i/>
+          <w:iCs/>
+        </w:rPr>
+        <w:t xml:space="preserve">strategic fit</w:t>
+      </w:r>
+      <w:r>
+        <w:t xml:space="preserve"> </w:t>
+      </w:r>
+      <w:r>
+        <w:t xml:space="preserve">yang terlalu abstrak, 4Cs Medcof (1997) memiliki granularitas yang cukup untuk diterjemahkan ke pertanyaan</w:t>
+      </w:r>
+      <w:r>
+        <w:t xml:space="preserve"> </w:t>
+      </w:r>
+      <w:r>
+        <w:rPr>
+          <w:i/>
+          <w:iCs/>
+        </w:rPr>
+        <w:t xml:space="preserve">due diligence</w:t>
+      </w:r>
+      <w:r>
+        <w:t xml:space="preserve"> </w:t>
+      </w:r>
+      <w:r>
+        <w:t xml:space="preserve">konkret. Setiap C dapat dipecah menjadi sub-dimensi yang dapat diperiksa oleh deal team M&amp;A maupun</w:t>
+      </w:r>
+      <w:r>
+        <w:t xml:space="preserve"> </w:t>
+      </w:r>
+      <w:r>
+        <w:rPr>
+          <w:i/>
+          <w:iCs/>
+        </w:rPr>
+        <w:t xml:space="preserve">post-merger integration</w:t>
+      </w:r>
+      <w:r>
+        <w:t xml:space="preserve"> </w:t>
+      </w:r>
+      <w:r>
+        <w:t xml:space="preserve">(PMI) office.</w:t>
+      </w:r>
+    </w:p>
+    <w:p>
+      <w:pPr>
+        <w:pStyle w:val="BodyText"/>
+      </w:pPr>
+      <w:r>
+        <w:t xml:space="preserve">Kekuatan kedua adalah</w:t>
+      </w:r>
+      <w:r>
+        <w:t xml:space="preserve"> </w:t>
+      </w:r>
+      <w:r>
+        <w:rPr>
+          <w:b/>
+          <w:bCs/>
+        </w:rPr>
+        <w:t xml:space="preserve">relevansi M&amp;A yang tinggi</w:t>
+      </w:r>
+      <w:r>
+        <w:t xml:space="preserve">. Penulis secara jujur mengakui kegagalan aliansi 30–70% dan mengidentifikasi puluhan penyebab kegagalan, lalu memposisikan 4Cs sebagai respons diagnostik. Bagi praktisi investasi, direktur strategi, dan auditor</w:t>
+      </w:r>
+      <w:r>
+        <w:t xml:space="preserve"> </w:t>
+      </w:r>
+      <w:r>
+        <w:rPr>
+          <w:i/>
+          <w:iCs/>
+        </w:rPr>
+        <w:t xml:space="preserve">post-merger</w:t>
+      </w:r>
+      <w:r>
+        <w:t xml:space="preserve">, kerangka ini menyediakan kosakata operasional yang langsung dapat dipakai — nilai pedagogis yang nyata bagi mahasiswa Magister Akuntansi yang sering menjadi bagian dari</w:t>
+      </w:r>
+      <w:r>
+        <w:t xml:space="preserve"> </w:t>
+      </w:r>
+      <w:r>
+        <w:rPr>
+          <w:i/>
+          <w:iCs/>
+        </w:rPr>
+        <w:t xml:space="preserve">deal team</w:t>
+      </w:r>
+      <w:r>
+        <w:t xml:space="preserve">.</w:t>
+      </w:r>
+    </w:p>
+    <w:p>
+      <w:pPr>
+        <w:pStyle w:val="BodyText"/>
+      </w:pPr>
+      <w:r>
+        <w:t xml:space="preserve">Kekuatan ketiga adalah</w:t>
+      </w:r>
+      <w:r>
+        <w:t xml:space="preserve"> </w:t>
+      </w:r>
+      <w:r>
+        <w:rPr>
+          <w:b/>
+          <w:bCs/>
+        </w:rPr>
+        <w:t xml:space="preserve">cakupan perspektif strategic fit yang luas</w:t>
+      </w:r>
+      <w:r>
+        <w:t xml:space="preserve">: artikel merangkum definisi Shelton (1988), Ireland, Hitt dan Vaidyanath (2002), Das dan Teng (2000), serta Porter (1985) dalam satu tinjauan yang memperlihatkan berbagai sudut pandang. Integrasi</w:t>
+      </w:r>
+      <w:r>
+        <w:t xml:space="preserve"> </w:t>
+      </w:r>
+      <w:r>
+        <w:rPr>
+          <w:b/>
+          <w:bCs/>
+        </w:rPr>
+        <w:t xml:space="preserve">Executive Fit Matrix</w:t>
+      </w:r>
+      <w:r>
+        <w:t xml:space="preserve"> </w:t>
+      </w:r>
+      <w:r>
+        <w:t xml:space="preserve">dari HBR menambah dimensi kepemimpinan yang jarang hadir dalam literatur akademis tentang</w:t>
+      </w:r>
+      <w:r>
+        <w:t xml:space="preserve"> </w:t>
+      </w:r>
+      <w:r>
+        <w:rPr>
+          <w:i/>
+          <w:iCs/>
+        </w:rPr>
+        <w:t xml:space="preserve">strategic fit</w:t>
+      </w:r>
+      <w:r>
+        <w:t xml:space="preserve">.</w:t>
+      </w:r>
+    </w:p>
+    <w:p>
+      <w:pPr>
+        <w:pStyle w:val="BodyText"/>
+      </w:pPr>
+      <w:r>
+        <w:t xml:space="preserve">Kekuatan keempat adalah</w:t>
+      </w:r>
+      <w:r>
+        <w:t xml:space="preserve"> </w:t>
+      </w:r>
+      <w:r>
+        <w:rPr>
+          <w:b/>
+          <w:bCs/>
+        </w:rPr>
+        <w:t xml:space="preserve">koneksi ke tipologi Miles-Snow</w:t>
+      </w:r>
+      <w:r>
+        <w:t xml:space="preserve"> </w:t>
+      </w:r>
+      <w:r>
+        <w:t xml:space="preserve">— menunjukkan bahwa</w:t>
+      </w:r>
+      <w:r>
+        <w:t xml:space="preserve"> </w:t>
+      </w:r>
+      <w:r>
+        <w:rPr>
+          <w:i/>
+          <w:iCs/>
+        </w:rPr>
+        <w:t xml:space="preserve">fit</w:t>
+      </w:r>
+      <w:r>
+        <w:t xml:space="preserve"> </w:t>
+      </w:r>
+      <w:r>
+        <w:t xml:space="preserve">bukan hanya soal sumber daya tetapi juga tentang keselarasan antara strategi dan struktur organisasi. Kekuatan kelima adalah</w:t>
+      </w:r>
+      <w:r>
+        <w:t xml:space="preserve"> </w:t>
+      </w:r>
+      <w:r>
+        <w:rPr>
+          <w:b/>
+          <w:bCs/>
+        </w:rPr>
+        <w:t xml:space="preserve">konteks non-Barat Nigeria</w:t>
+      </w:r>
+      <w:r>
+        <w:t xml:space="preserve"> </w:t>
+      </w:r>
+      <w:r>
+        <w:t xml:space="preserve">yang menyajikan perspektif pasar berkembang; sebagian besar literatur</w:t>
+      </w:r>
+      <w:r>
+        <w:t xml:space="preserve"> </w:t>
+      </w:r>
+      <w:r>
+        <w:rPr>
+          <w:i/>
+          <w:iCs/>
+        </w:rPr>
+        <w:t xml:space="preserve">strategic fit</w:t>
+      </w:r>
+      <w:r>
+        <w:t xml:space="preserve"> </w:t>
+      </w:r>
+      <w:r>
+        <w:t xml:space="preserve">didominasi konteks AS dan Eropa.</w:t>
+      </w:r>
+    </w:p>
+    <w:p>
+      <w:r>
+        <w:pict>
+          <v:rect style="width:0;height:1.5pt" o:hralign="center" o:hrstd="t" o:hr="t"/>
+        </w:pict>
+      </w:r>
+    </w:p>
+    <w:bookmarkEnd w:id="200"/>
+    <w:bookmarkStart w:id="201" w:name="kekurangan-11"/>
+    <w:p>
+      <w:pPr>
+        <w:pStyle w:val="Heading3"/>
+      </w:pPr>
+      <w:r>
+        <w:t xml:space="preserve">Kekurangan</w:t>
+      </w:r>
+    </w:p>
+    <w:p>
+      <w:pPr>
+        <w:pStyle w:val="FirstParagraph"/>
+      </w:pPr>
+      <w:r>
+        <w:t xml:space="preserve">Kekurangan artikel ini bersifat struktural dan metodologis, cukup serius untuk menuntut kehati-hatian dalam menggunakan temuannya sebagai referensi utama.</w:t>
+      </w:r>
+    </w:p>
+    <w:p>
+      <w:pPr>
+        <w:pStyle w:val="BodyText"/>
+      </w:pPr>
+      <w:r>
+        <w:rPr>
+          <w:b/>
+          <w:bCs/>
+        </w:rPr>
+        <w:t xml:space="preserve">Pertama, penyalahgunaan uji Kolmogorov-Smirnov sebagai uji hipotesis.</w:t>
+      </w:r>
+      <w:r>
+        <w:t xml:space="preserve"> </w:t>
+      </w:r>
+      <w:r>
+        <w:t xml:space="preserve">Ini adalah cacat metodologis paling fundamental. Uji</w:t>
+      </w:r>
+      <w:r>
+        <w:t xml:space="preserve"> </w:t>
+      </w:r>
+      <w:r>
+        <w:rPr>
+          <w:i/>
+          <w:iCs/>
+        </w:rPr>
+        <w:t xml:space="preserve">One-Sample Kolmogorov-Smirnov</w:t>
+      </w:r>
+      <w:r>
+        <w:t xml:space="preserve"> </w:t>
+      </w:r>
+      <w:r>
+        <w:t xml:space="preserve">(K-S) dirancang untuk menguji apakah sampel berasal dari distribusi tertentu — fungsinya adalah</w:t>
+      </w:r>
+      <w:r>
+        <w:t xml:space="preserve"> </w:t>
+      </w:r>
+      <w:r>
+        <w:rPr>
+          <w:i/>
+          <w:iCs/>
+        </w:rPr>
+        <w:t xml:space="preserve">goodness-of-fit test</w:t>
+      </w:r>
+      <w:r>
+        <w:t xml:space="preserve"> </w:t>
+      </w:r>
+      <w:r>
+        <w:t xml:space="preserve">untuk normalitas, bukan uji perbedaan</w:t>
+      </w:r>
+      <w:r>
+        <w:t xml:space="preserve"> </w:t>
+      </w:r>
+      <w:r>
+        <w:rPr>
+          <w:i/>
+          <w:iCs/>
+        </w:rPr>
+        <w:t xml:space="preserve">mean</w:t>
+      </w:r>
+      <w:r>
+        <w:t xml:space="preserve">. Penulis menggunakannya untuk menolak ketiga hipotesis null tentang pengaruh</w:t>
+      </w:r>
+      <w:r>
+        <w:t xml:space="preserve"> </w:t>
+      </w:r>
+      <w:r>
+        <w:rPr>
+          <w:i/>
+          <w:iCs/>
+        </w:rPr>
+        <w:t xml:space="preserve">strategic fit</w:t>
+      </w:r>
+      <w:r>
+        <w:t xml:space="preserve"> </w:t>
+      </w:r>
+      <w:r>
+        <w:t xml:space="preserve">terhadap</w:t>
+      </w:r>
+      <w:r>
+        <w:t xml:space="preserve"> </w:t>
+      </w:r>
+      <w:r>
+        <w:rPr>
+          <w:i/>
+          <w:iCs/>
+        </w:rPr>
+        <w:t xml:space="preserve">organizational effectiveness</w:t>
+      </w:r>
+      <w:r>
+        <w:t xml:space="preserve">. Pengujian yang tepat adalah</w:t>
+      </w:r>
+      <w:r>
+        <w:t xml:space="preserve"> </w:t>
+      </w:r>
+      <w:r>
+        <w:rPr>
+          <w:i/>
+          <w:iCs/>
+        </w:rPr>
+        <w:t xml:space="preserve">one-sample t-test</w:t>
+      </w:r>
+      <w:r>
+        <w:t xml:space="preserve"> </w:t>
+      </w:r>
+      <w:r>
+        <w:t xml:space="preserve">atau uji non-parametrik</w:t>
+      </w:r>
+      <w:r>
+        <w:t xml:space="preserve"> </w:t>
+      </w:r>
+      <w:r>
+        <w:rPr>
+          <w:i/>
+          <w:iCs/>
+        </w:rPr>
+        <w:t xml:space="preserve">Wilcoxon signed-rank test</w:t>
+      </w:r>
+      <w:r>
+        <w:t xml:space="preserve">. Nilai Z = 5,342; 5,677; 5,745 yang dilaporkan secara metodologis tidak dapat mendukung klaim kausal yang dibuat penulis.</w:t>
+      </w:r>
+    </w:p>
+    <w:p>
+      <w:pPr>
+        <w:pStyle w:val="BodyText"/>
+      </w:pPr>
+      <w:r>
+        <w:rPr>
+          <w:b/>
+          <w:bCs/>
+        </w:rPr>
+        <w:t xml:space="preserve">Kedua, kerangka sampling yang tidak transparan.</w:t>
+      </w:r>
+      <w:r>
+        <w:t xml:space="preserve"> </w:t>
+      </w:r>
+      <w:r>
+        <w:t xml:space="preserve">Penulis menyebut</w:t>
+      </w:r>
+      <w:r>
+        <w:t xml:space="preserve"> </w:t>
+      </w:r>
+      <w:r>
+        <w:t xml:space="preserve">“random sampling method”</w:t>
+      </w:r>
+      <w:r>
+        <w:t xml:space="preserve"> </w:t>
+      </w:r>
+      <w:r>
+        <w:t xml:space="preserve">tetapi tidak menjelaskan apakah itu</w:t>
+      </w:r>
+      <w:r>
+        <w:t xml:space="preserve"> </w:t>
+      </w:r>
+      <w:r>
+        <w:rPr>
+          <w:i/>
+          <w:iCs/>
+        </w:rPr>
+        <w:t xml:space="preserve">simple random</w:t>
+      </w:r>
+      <w:r>
+        <w:t xml:space="preserve">,</w:t>
+      </w:r>
+      <w:r>
+        <w:t xml:space="preserve"> </w:t>
+      </w:r>
+      <w:r>
+        <w:rPr>
+          <w:i/>
+          <w:iCs/>
+        </w:rPr>
+        <w:t xml:space="preserve">stratified</w:t>
+      </w:r>
+      <w:r>
+        <w:t xml:space="preserve">, atau</w:t>
+      </w:r>
+      <w:r>
+        <w:t xml:space="preserve"> </w:t>
+      </w:r>
+      <w:r>
+        <w:rPr>
+          <w:i/>
+          <w:iCs/>
+        </w:rPr>
+        <w:t xml:space="preserve">cluster random sampling</w:t>
+      </w:r>
+      <w:r>
+        <w:t xml:space="preserve">.</w:t>
+      </w:r>
+      <w:r>
+        <w:t xml:space="preserve"> </w:t>
+      </w:r>
+      <w:r>
+        <w:rPr>
+          <w:i/>
+          <w:iCs/>
+        </w:rPr>
+        <w:t xml:space="preserve">Sampling frame</w:t>
+      </w:r>
+      <w:r>
+        <w:t xml:space="preserve"> </w:t>
+      </w:r>
+      <w:r>
+        <w:t xml:space="preserve">tidak dideskripsikan — apakah daftar karyawan diperoleh dari HR, atau menggunakan metode</w:t>
+      </w:r>
+      <w:r>
+        <w:t xml:space="preserve"> </w:t>
+      </w:r>
+      <w:r>
+        <w:rPr>
+          <w:i/>
+          <w:iCs/>
+        </w:rPr>
+        <w:t xml:space="preserve">convenience</w:t>
+      </w:r>
+      <w:r>
+        <w:t xml:space="preserve">.</w:t>
+      </w:r>
+      <w:r>
+        <w:t xml:space="preserve"> </w:t>
+      </w:r>
+      <w:r>
+        <w:rPr>
+          <w:i/>
+          <w:iCs/>
+        </w:rPr>
+        <w:t xml:space="preserve">Response rate</w:t>
+      </w:r>
+      <w:r>
+        <w:t xml:space="preserve"> </w:t>
+      </w:r>
+      <w:r>
+        <w:t xml:space="preserve">tidak dilaporkan sama sekali. Tanpa transparansi ini, representativitas sampel tidak dapat dinilai.</w:t>
+      </w:r>
+    </w:p>
+    <w:p>
+      <w:pPr>
+        <w:pStyle w:val="BodyText"/>
+      </w:pPr>
+      <w:r>
+        <w:rPr>
+          <w:b/>
+          <w:bCs/>
+        </w:rPr>
+        <w:t xml:space="preserve">Ketiga, penyajian Tabel 1 yang membingungkan.</w:t>
+      </w:r>
+      <w:r>
+        <w:t xml:space="preserve"> </w:t>
+      </w:r>
+      <w:r>
+        <w:t xml:space="preserve">Data kategori</w:t>
+      </w:r>
+      <w:r>
+        <w:t xml:space="preserve"> </w:t>
+      </w:r>
+      <w:r>
+        <w:rPr>
+          <w:i/>
+          <w:iCs/>
+        </w:rPr>
+        <w:t xml:space="preserve">employee relations</w:t>
+      </w:r>
+      <w:r>
+        <w:t xml:space="preserve"> </w:t>
+      </w:r>
+      <w:r>
+        <w:t xml:space="preserve">menampilkan angka</w:t>
+      </w:r>
+      <w:r>
+        <w:t xml:space="preserve"> </w:t>
+      </w:r>
+      <w:r>
+        <w:t xml:space="preserve">“X70 (33%)”</w:t>
+      </w:r>
+      <w:r>
+        <w:t xml:space="preserve"> </w:t>
+      </w:r>
+      <w:r>
+        <w:t xml:space="preserve">untuk</w:t>
+      </w:r>
+      <w:r>
+        <w:t xml:space="preserve"> </w:t>
+      </w:r>
+      <w:r>
+        <w:rPr>
+          <w:i/>
+          <w:iCs/>
+        </w:rPr>
+        <w:t xml:space="preserve">capability</w:t>
+      </w:r>
+      <w:r>
+        <w:t xml:space="preserve">,</w:t>
+      </w:r>
+      <w:r>
+        <w:t xml:space="preserve"> </w:t>
+      </w:r>
+      <w:r>
+        <w:t xml:space="preserve">“X70 (33%)”</w:t>
+      </w:r>
+      <w:r>
+        <w:t xml:space="preserve"> </w:t>
+      </w:r>
+      <w:r>
+        <w:t xml:space="preserve">untuk</w:t>
+      </w:r>
+      <w:r>
+        <w:t xml:space="preserve"> </w:t>
+      </w:r>
+      <w:r>
+        <w:rPr>
+          <w:i/>
+          <w:iCs/>
+        </w:rPr>
+        <w:t xml:space="preserve">commitment</w:t>
+      </w:r>
+      <w:r>
+        <w:t xml:space="preserve">, dan</w:t>
+      </w:r>
+      <w:r>
+        <w:t xml:space="preserve"> </w:t>
+      </w:r>
+      <w:r>
+        <w:t xml:space="preserve">“X72 (34%)”</w:t>
+      </w:r>
+      <w:r>
+        <w:t xml:space="preserve"> </w:t>
+      </w:r>
+      <w:r>
+        <w:t xml:space="preserve">untuk</w:t>
+      </w:r>
+      <w:r>
+        <w:t xml:space="preserve"> </w:t>
+      </w:r>
+      <w:r>
+        <w:rPr>
+          <w:i/>
+          <w:iCs/>
+        </w:rPr>
+        <w:t xml:space="preserve">control</w:t>
+      </w:r>
+      <w:r>
+        <w:t xml:space="preserve"> </w:t>
+      </w:r>
+      <w:r>
+        <w:t xml:space="preserve">— seolah 212 responden terbagi ke tiga kategori berbeda yang dijawab secara terpisah, bukan oleh responden yang sama. Inkonsistensi ini tidak dijelaskan.</w:t>
+      </w:r>
+    </w:p>
+    <w:p>
+      <w:pPr>
+        <w:pStyle w:val="BodyText"/>
+      </w:pPr>
+      <w:r>
+        <w:rPr>
+          <w:b/>
+          <w:bCs/>
+        </w:rPr>
+        <w:t xml:space="preserve">Keempat, tidak ada Cronbach’s alpha atau uji validitas konstruk.</w:t>
+      </w:r>
+      <w:r>
+        <w:t xml:space="preserve"> </w:t>
+      </w:r>
+      <w:r>
+        <w:t xml:space="preserve">Instrumen kuesioner tidak dilaporkan uji reliabilitasnya. Tidak ada</w:t>
+      </w:r>
+      <w:r>
+        <w:t xml:space="preserve"> </w:t>
+      </w:r>
+      <w:r>
+        <w:rPr>
+          <w:i/>
+          <w:iCs/>
+        </w:rPr>
+        <w:t xml:space="preserve">Exploratory Factor Analysis</w:t>
+      </w:r>
+      <w:r>
+        <w:t xml:space="preserve"> </w:t>
+      </w:r>
+      <w:r>
+        <w:t xml:space="preserve">maupun</w:t>
+      </w:r>
+      <w:r>
+        <w:t xml:space="preserve"> </w:t>
+      </w:r>
+      <w:r>
+        <w:rPr>
+          <w:i/>
+          <w:iCs/>
+        </w:rPr>
+        <w:t xml:space="preserve">Confirmatory Factor Analysis</w:t>
+      </w:r>
+      <w:r>
+        <w:t xml:space="preserve">. Tanpa bukti psikometrik, konstruk</w:t>
+      </w:r>
+      <w:r>
+        <w:t xml:space="preserve"> </w:t>
+      </w:r>
+      <w:r>
+        <w:rPr>
+          <w:i/>
+          <w:iCs/>
+        </w:rPr>
+        <w:t xml:space="preserve">capability</w:t>
+      </w:r>
+      <w:r>
+        <w:t xml:space="preserve">,</w:t>
+      </w:r>
+      <w:r>
+        <w:t xml:space="preserve"> </w:t>
+      </w:r>
+      <w:r>
+        <w:rPr>
+          <w:i/>
+          <w:iCs/>
+        </w:rPr>
+        <w:t xml:space="preserve">compatibility</w:t>
+      </w:r>
+      <w:r>
+        <w:t xml:space="preserve">,</w:t>
+      </w:r>
+      <w:r>
+        <w:t xml:space="preserve"> </w:t>
+      </w:r>
+      <w:r>
+        <w:rPr>
+          <w:i/>
+          <w:iCs/>
+        </w:rPr>
+        <w:t xml:space="preserve">commitment</w:t>
+      </w:r>
+      <w:r>
+        <w:t xml:space="preserve">,</w:t>
+      </w:r>
+      <w:r>
+        <w:t xml:space="preserve"> </w:t>
+      </w:r>
+      <w:r>
+        <w:rPr>
+          <w:i/>
+          <w:iCs/>
+        </w:rPr>
+        <w:t xml:space="preserve">control</w:t>
+      </w:r>
+      <w:r>
+        <w:t xml:space="preserve">, dan</w:t>
+      </w:r>
+      <w:r>
+        <w:t xml:space="preserve"> </w:t>
+      </w:r>
+      <w:r>
+        <w:rPr>
+          <w:i/>
+          <w:iCs/>
+        </w:rPr>
+        <w:t xml:space="preserve">organizational effectiveness</w:t>
+      </w:r>
+      <w:r>
+        <w:t xml:space="preserve"> </w:t>
+      </w:r>
+      <w:r>
+        <w:t xml:space="preserve">tidak dapat diasumsikan terukur dengan valid.</w:t>
+      </w:r>
+    </w:p>
+    <w:p>
+      <w:pPr>
+        <w:pStyle w:val="BodyText"/>
+      </w:pPr>
+      <w:r>
+        <w:rPr>
+          <w:b/>
+          <w:bCs/>
+        </w:rPr>
+        <w:t xml:space="preserve">Kelima, hanya analisis univariat.</w:t>
+      </w:r>
+      <w:r>
+        <w:t xml:space="preserve"> </w:t>
+      </w:r>
+      <w:r>
+        <w:t xml:space="preserve">Penelitian ini tidak menjalankan analisis</w:t>
+      </w:r>
+      <w:r>
+        <w:t xml:space="preserve"> </w:t>
+      </w:r>
+      <w:r>
+        <w:rPr>
+          <w:i/>
+          <w:iCs/>
+        </w:rPr>
+        <w:t xml:space="preserve">multivariat</w:t>
+      </w:r>
+      <w:r>
+        <w:t xml:space="preserve"> </w:t>
+      </w:r>
+      <w:r>
+        <w:t xml:space="preserve">seperti regresi berganda atau</w:t>
+      </w:r>
+      <w:r>
+        <w:t xml:space="preserve"> </w:t>
+      </w:r>
+      <w:r>
+        <w:rPr>
+          <w:i/>
+          <w:iCs/>
+        </w:rPr>
+        <w:t xml:space="preserve">structural equation modeling</w:t>
+      </w:r>
+      <w:r>
+        <w:t xml:space="preserve">. Klaim mediasi 4Cs terhadap tiga jalur organisasional tidak diuji sebagai model jalur — klaim kausal yang diajukan melampaui kapasitas analisis yang digunakan.</w:t>
+      </w:r>
+    </w:p>
+    <w:p>
+      <w:pPr>
+        <w:pStyle w:val="BodyText"/>
+      </w:pPr>
+      <w:r>
+        <w:rPr>
+          <w:b/>
+          <w:bCs/>
+        </w:rPr>
+        <w:t xml:space="preserve">Keenam, tidak ada bagian</w:t>
+      </w:r>
+      <w:r>
+        <w:rPr>
+          <w:b/>
+          <w:bCs/>
+        </w:rPr>
+        <w:t xml:space="preserve"> </w:t>
+      </w:r>
+      <w:r>
+        <w:rPr>
+          <w:b/>
+          <w:bCs/>
+          <w:i/>
+          <w:iCs/>
+        </w:rPr>
+        <w:t xml:space="preserve">limitations</w:t>
+      </w:r>
+      <w:r>
+        <w:rPr>
+          <w:b/>
+          <w:bCs/>
+        </w:rPr>
+        <w:t xml:space="preserve"> </w:t>
+      </w:r>
+      <w:r>
+        <w:rPr>
+          <w:b/>
+          <w:bCs/>
+        </w:rPr>
+        <w:t xml:space="preserve">dalam artikel asli.</w:t>
+      </w:r>
+      <w:r>
+        <w:t xml:space="preserve"> </w:t>
+      </w:r>
+      <w:r>
+        <w:t xml:space="preserve">Tidak ada diskusi tentang</w:t>
+      </w:r>
+      <w:r>
+        <w:t xml:space="preserve"> </w:t>
+      </w:r>
+      <w:r>
+        <w:rPr>
+          <w:i/>
+          <w:iCs/>
+        </w:rPr>
+        <w:t xml:space="preserve">social desirability bias</w:t>
+      </w:r>
+      <w:r>
+        <w:t xml:space="preserve">,</w:t>
+      </w:r>
+      <w:r>
+        <w:t xml:space="preserve"> </w:t>
+      </w:r>
+      <w:r>
+        <w:rPr>
+          <w:i/>
+          <w:iCs/>
+        </w:rPr>
+        <w:t xml:space="preserve">common method bias</w:t>
+      </w:r>
+      <w:r>
+        <w:t xml:space="preserve"> </w:t>
+      </w:r>
+      <w:r>
+        <w:t xml:space="preserve">(seluruh data dari sumber yang sama), atau masalah generalisasi dari empat perusahaan di Nigeria ke</w:t>
+      </w:r>
+      <w:r>
+        <w:t xml:space="preserve"> </w:t>
+      </w:r>
+      <w:r>
+        <w:t xml:space="preserve">“organisasi secara umum”</w:t>
+      </w:r>
+      <w:r>
+        <w:t xml:space="preserve">.</w:t>
+      </w:r>
+    </w:p>
+    <w:p>
+      <w:pPr>
+        <w:pStyle w:val="BodyText"/>
+      </w:pPr>
+      <w:r>
+        <w:rPr>
+          <w:b/>
+          <w:bCs/>
+        </w:rPr>
+        <w:t xml:space="preserve">Ketujuh, kualitas penulisan dan proses editorial yang rendah.</w:t>
+      </w:r>
+      <w:r>
+        <w:t xml:space="preserve"> </w:t>
+      </w:r>
+      <w:r>
+        <w:t xml:space="preserve">Beberapa kalimat tidak lengkap atau sulit dipahami. Penyajian referensi tidak konsisten. Hal ini konsisten dengan konferensi yang dicurigai sebagai</w:t>
+      </w:r>
+      <w:r>
+        <w:t xml:space="preserve"> </w:t>
+      </w:r>
+      <w:r>
+        <w:rPr>
+          <w:i/>
+          <w:iCs/>
+        </w:rPr>
+        <w:t xml:space="preserve">predatory conference</w:t>
+      </w:r>
+      <w:r>
+        <w:t xml:space="preserve"> </w:t>
+      </w:r>
+      <w:r>
+        <w:t xml:space="preserve">— menerima hampir semua kiriman dengan proses</w:t>
+      </w:r>
+      <w:r>
+        <w:t xml:space="preserve"> </w:t>
+      </w:r>
+      <w:r>
+        <w:rPr>
+          <w:i/>
+          <w:iCs/>
+        </w:rPr>
+        <w:t xml:space="preserve">peer review</w:t>
+      </w:r>
+      <w:r>
+        <w:t xml:space="preserve"> </w:t>
+      </w:r>
+      <w:r>
+        <w:t xml:space="preserve">minimal.</w:t>
+      </w:r>
+    </w:p>
+    <w:p>
+      <w:pPr>
+        <w:pStyle w:val="BodyText"/>
+      </w:pPr>
+      <w:r>
+        <w:rPr>
+          <w:b/>
+          <w:bCs/>
+        </w:rPr>
+        <w:t xml:space="preserve">Kedelapan, seluruh hipotesis didukung dengan p = 0,000</w:t>
+      </w:r>
+      <w:r>
+        <w:t xml:space="preserve"> </w:t>
+      </w:r>
+      <w:r>
+        <w:t xml:space="preserve">— pola ini dalam riset sosial sepatutnya menimbulkan kecurigaan</w:t>
+      </w:r>
+      <w:r>
+        <w:t xml:space="preserve"> </w:t>
+      </w:r>
+      <w:r>
+        <w:rPr>
+          <w:i/>
+          <w:iCs/>
+        </w:rPr>
+        <w:t xml:space="preserve">p-hacking</w:t>
+      </w:r>
+      <w:r>
+        <w:t xml:space="preserve"> </w:t>
+      </w:r>
+      <w:r>
+        <w:t xml:space="preserve">atau bias konfirmasi. Temuan yang terlalu mulus pada tiga hipotesis sekaligus, tanpa satu pun efek null atau marginal, tidak lazim dalam penelitian empiris yang dilakukan dengan integritas metodologis penuh.</w:t>
+      </w:r>
+    </w:p>
+    <w:p>
+      <w:pPr>
+        <w:pStyle w:val="BodyText"/>
+      </w:pPr>
+      <w:r>
+        <w:t xml:space="preserve">Secara kumulatif, cacat-cacat ini menggeser status temuan artikel dari</w:t>
+      </w:r>
+      <w:r>
+        <w:t xml:space="preserve"> </w:t>
+      </w:r>
+      <w:r>
+        <w:rPr>
+          <w:i/>
+          <w:iCs/>
+        </w:rPr>
+        <w:t xml:space="preserve">evidence-based</w:t>
+      </w:r>
+      <w:r>
+        <w:t xml:space="preserve"> </w:t>
+      </w:r>
+      <w:r>
+        <w:t xml:space="preserve">menjadi</w:t>
+      </w:r>
+      <w:r>
+        <w:t xml:space="preserve"> </w:t>
+      </w:r>
+      <w:r>
+        <w:rPr>
+          <w:i/>
+          <w:iCs/>
+        </w:rPr>
+        <w:t xml:space="preserve">suggestive only</w:t>
+      </w:r>
+      <w:r>
+        <w:t xml:space="preserve">. Mahasiswa harus memperlakukan artikel ini sebagai</w:t>
+      </w:r>
+      <w:r>
+        <w:t xml:space="preserve"> </w:t>
+      </w:r>
+      <w:r>
+        <w:rPr>
+          <w:b/>
+          <w:bCs/>
+        </w:rPr>
+        <w:t xml:space="preserve">teaching material dan agenda-setter</w:t>
+      </w:r>
+      <w:r>
+        <w:t xml:space="preserve">, bukan sebagai otoritas empiris.</w:t>
+      </w:r>
+    </w:p>
+    <w:p>
+      <w:r>
+        <w:pict>
+          <v:rect style="width:0;height:1.5pt" o:hralign="center" o:hrstd="t" o:hr="t"/>
+        </w:pict>
+      </w:r>
+    </w:p>
+    <w:bookmarkEnd w:id="201"/>
+    <w:bookmarkStart w:id="202" w:name="posisi-dalam-kerangka-mata-kuliah-11"/>
+    <w:p>
+      <w:pPr>
+        <w:pStyle w:val="Heading3"/>
+      </w:pPr>
+      <w:r>
+        <w:t xml:space="preserve">Posisi dalam Kerangka Mata Kuliah</w:t>
+      </w:r>
+    </w:p>
+    <w:p>
+      <w:pPr>
+        <w:pStyle w:val="FirstParagraph"/>
+      </w:pPr>
+      <w:r>
+        <w:t xml:space="preserve">Artikel Okebaram dan Onuoha (2018) berfungsi sebagai</w:t>
+      </w:r>
+      <w:r>
+        <w:t xml:space="preserve"> </w:t>
+      </w:r>
+      <w:r>
+        <w:rPr>
+          <w:b/>
+          <w:bCs/>
+        </w:rPr>
+        <w:t xml:space="preserve">jangkar Pertemuan 7 di level organisasional multi-elemen</w:t>
+      </w:r>
+      <w:r>
+        <w:t xml:space="preserve">, melengkapi dua sumber lain pada pertemuan yang sama untuk membentuk taksonomi</w:t>
+      </w:r>
+      <w:r>
+        <w:t xml:space="preserve"> </w:t>
+      </w:r>
+      <w:r>
+        <w:rPr>
+          <w:i/>
+          <w:iCs/>
+        </w:rPr>
+        <w:t xml:space="preserve">strategic fit</w:t>
+      </w:r>
+      <w:r>
+        <w:t xml:space="preserve"> </w:t>
+      </w:r>
+      <w:r>
+        <w:t xml:space="preserve">tiga level.</w:t>
+      </w:r>
+    </w:p>
+    <w:p>
+      <w:pPr>
+        <w:pStyle w:val="BodyText"/>
+      </w:pPr>
+      <w:r>
+        <w:rPr>
+          <w:b/>
+          <w:bCs/>
+        </w:rPr>
+        <w:t xml:space="preserve">Level 1 — Cross-business fit (TPGS Ch.8):</w:t>
+      </w:r>
+      <w:r>
+        <w:t xml:space="preserve"> </w:t>
+      </w:r>
+      <w:r>
+        <w:rPr>
+          <w:i/>
+          <w:iCs/>
+        </w:rPr>
+        <w:t xml:space="preserve">Fit</w:t>
+      </w:r>
+      <w:r>
+        <w:t xml:space="preserve"> </w:t>
+      </w:r>
+      <w:r>
+        <w:t xml:space="preserve">di level korporat antar unit bisnis terdiversifikasi, diuji melalui</w:t>
+      </w:r>
+      <w:r>
+        <w:t xml:space="preserve"> </w:t>
+      </w:r>
+      <w:r>
+        <w:rPr>
+          <w:i/>
+          <w:iCs/>
+        </w:rPr>
+        <w:t xml:space="preserve">industry attractiveness test</w:t>
+      </w:r>
+      <w:r>
+        <w:t xml:space="preserve">,</w:t>
+      </w:r>
+      <w:r>
+        <w:t xml:space="preserve"> </w:t>
+      </w:r>
+      <w:r>
+        <w:rPr>
+          <w:i/>
+          <w:iCs/>
+        </w:rPr>
+        <w:t xml:space="preserve">cost-of-entry test</w:t>
+      </w:r>
+      <w:r>
+        <w:t xml:space="preserve">, dan</w:t>
+      </w:r>
+      <w:r>
+        <w:t xml:space="preserve"> </w:t>
+      </w:r>
+      <w:r>
+        <w:rPr>
+          <w:i/>
+          <w:iCs/>
+        </w:rPr>
+        <w:t xml:space="preserve">better-off test</w:t>
+      </w:r>
+      <w:r>
+        <w:t xml:space="preserve">. Sinergi lintas unit bisnis hanya tercipta bila</w:t>
+      </w:r>
+      <w:r>
+        <w:t xml:space="preserve"> </w:t>
+      </w:r>
+      <w:r>
+        <w:rPr>
+          <w:i/>
+          <w:iCs/>
+        </w:rPr>
+        <w:t xml:space="preserve">fit</w:t>
+      </w:r>
+      <w:r>
+        <w:t xml:space="preserve"> </w:t>
+      </w:r>
+      <w:r>
+        <w:t xml:space="preserve">level korporat terpenuhi.</w:t>
+      </w:r>
+    </w:p>
+    <w:p>
+      <w:pPr>
+        <w:pStyle w:val="BodyText"/>
+      </w:pPr>
+      <w:r>
+        <w:rPr>
+          <w:b/>
+          <w:bCs/>
+        </w:rPr>
+        <w:t xml:space="preserve">Level 2 — Internal HR-reward fit (Artikel 11, Hsieh &amp; Chen 2011):</w:t>
+      </w:r>
+      <w:r>
+        <w:t xml:space="preserve"> </w:t>
+      </w:r>
+      <w:r>
+        <w:t xml:space="preserve">Setelah strategi generik unit ditetapkan, kerangka</w:t>
+      </w:r>
+      <w:r>
+        <w:t xml:space="preserve"> </w:t>
+      </w:r>
+      <w:r>
+        <w:rPr>
+          <w:i/>
+          <w:iCs/>
+        </w:rPr>
+        <w:t xml:space="preserve">triad</w:t>
+      </w:r>
+      <w:r>
+        <w:t xml:space="preserve"> </w:t>
+      </w:r>
+      <w:r>
+        <w:t xml:space="preserve">Hsieh dan Chen menjelaskan bagaimana HR</w:t>
+      </w:r>
+      <w:r>
+        <w:t xml:space="preserve"> </w:t>
+      </w:r>
+      <w:r>
+        <w:rPr>
+          <w:i/>
+          <w:iCs/>
+        </w:rPr>
+        <w:t xml:space="preserve">strategy</w:t>
+      </w:r>
+      <w:r>
+        <w:t xml:space="preserve"> </w:t>
+      </w:r>
+      <w:r>
+        <w:t xml:space="preserve">dan</w:t>
+      </w:r>
+      <w:r>
+        <w:t xml:space="preserve"> </w:t>
+      </w:r>
+      <w:r>
+        <w:rPr>
+          <w:i/>
+          <w:iCs/>
+        </w:rPr>
+        <w:t xml:space="preserve">reward system</w:t>
+      </w:r>
+      <w:r>
+        <w:t xml:space="preserve"> </w:t>
+      </w:r>
+      <w:r>
+        <w:t xml:space="preserve">harus dikonfigurasi secara simultan.</w:t>
+      </w:r>
+      <w:r>
+        <w:t xml:space="preserve"> </w:t>
+      </w:r>
+      <w:r>
+        <w:rPr>
+          <w:i/>
+          <w:iCs/>
+        </w:rPr>
+        <w:t xml:space="preserve">Fit</w:t>
+      </w:r>
+      <w:r>
+        <w:t xml:space="preserve"> </w:t>
+      </w:r>
+      <w:r>
+        <w:t xml:space="preserve">di level ini memastikan eksekusi strategi unit berjalan tanpa</w:t>
+      </w:r>
+      <w:r>
+        <w:t xml:space="preserve"> </w:t>
+      </w:r>
+      <w:r>
+        <w:rPr>
+          <w:i/>
+          <w:iCs/>
+        </w:rPr>
+        <w:t xml:space="preserve">execution gap</w:t>
+      </w:r>
+      <w:r>
+        <w:t xml:space="preserve">.</w:t>
+      </w:r>
+    </w:p>
+    <w:p>
+      <w:pPr>
+        <w:pStyle w:val="BodyText"/>
+      </w:pPr>
+      <w:r>
+        <w:rPr>
+          <w:b/>
+          <w:bCs/>
+        </w:rPr>
+        <w:t xml:space="preserve">Level 3 — Multi-element organizational fit via 4Cs (Artikel 12, Okebaram &amp; Onuoha 2018):</w:t>
+      </w:r>
+      <w:r>
+        <w:t xml:space="preserve"> </w:t>
+      </w:r>
+      <w:r>
+        <w:rPr>
+          <w:i/>
+          <w:iCs/>
+        </w:rPr>
+        <w:t xml:space="preserve">Fit</w:t>
+      </w:r>
+      <w:r>
+        <w:t xml:space="preserve"> </w:t>
+      </w:r>
+      <w:r>
+        <w:t xml:space="preserve">yang paling luas cakupannya — mencakup</w:t>
+      </w:r>
+      <w:r>
+        <w:t xml:space="preserve"> </w:t>
+      </w:r>
+      <w:r>
+        <w:rPr>
+          <w:i/>
+          <w:iCs/>
+        </w:rPr>
+        <w:t xml:space="preserve">organization design</w:t>
+      </w:r>
+      <w:r>
+        <w:t xml:space="preserve">,</w:t>
+      </w:r>
+      <w:r>
+        <w:t xml:space="preserve"> </w:t>
+      </w:r>
+      <w:r>
+        <w:rPr>
+          <w:i/>
+          <w:iCs/>
+        </w:rPr>
+        <w:t xml:space="preserve">employee relations</w:t>
+      </w:r>
+      <w:r>
+        <w:t xml:space="preserve">, dan</w:t>
+      </w:r>
+      <w:r>
+        <w:t xml:space="preserve"> </w:t>
+      </w:r>
+      <w:r>
+        <w:rPr>
+          <w:i/>
+          <w:iCs/>
+        </w:rPr>
+        <w:t xml:space="preserve">information exchange</w:t>
+      </w:r>
+      <w:r>
+        <w:t xml:space="preserve"> </w:t>
+      </w:r>
+      <w:r>
+        <w:t xml:space="preserve">sebagai indikator</w:t>
+      </w:r>
+      <w:r>
+        <w:t xml:space="preserve"> </w:t>
+      </w:r>
+      <w:r>
+        <w:rPr>
+          <w:i/>
+          <w:iCs/>
+        </w:rPr>
+        <w:t xml:space="preserve">organizational effectiveness</w:t>
+      </w:r>
+      <w:r>
+        <w:t xml:space="preserve">. Kerangka 4Cs menyediakan kosakata diagnostik untuk menilai</w:t>
+      </w:r>
+      <w:r>
+        <w:t xml:space="preserve"> </w:t>
+      </w:r>
+      <w:r>
+        <w:rPr>
+          <w:i/>
+          <w:iCs/>
+        </w:rPr>
+        <w:t xml:space="preserve">fit</w:t>
+      </w:r>
+      <w:r>
+        <w:t xml:space="preserve"> </w:t>
+      </w:r>
+      <w:r>
+        <w:t xml:space="preserve">pada level ini, terutama dalam konteks M&amp;A dan</w:t>
+      </w:r>
+      <w:r>
+        <w:t xml:space="preserve"> </w:t>
+      </w:r>
+      <w:r>
+        <w:rPr>
+          <w:i/>
+          <w:iCs/>
+        </w:rPr>
+        <w:t xml:space="preserve">strategic alliance</w:t>
+      </w:r>
+      <w:r>
+        <w:t xml:space="preserve">.</w:t>
+      </w:r>
+    </w:p>
+    <w:p>
+      <w:pPr>
+        <w:pStyle w:val="BodyText"/>
+      </w:pPr>
+      <w:r>
+        <w:t xml:space="preserve">Ketiga level bersifat</w:t>
+      </w:r>
+      <w:r>
+        <w:t xml:space="preserve"> </w:t>
+      </w:r>
+      <w:r>
+        <w:rPr>
+          <w:b/>
+          <w:bCs/>
+        </w:rPr>
+        <w:t xml:space="preserve">hierarkis dan komplementer</w:t>
+      </w:r>
+      <w:r>
+        <w:t xml:space="preserve">: sinergi Level 1 hanya terealisasi jika Level 2 memberikan eksekusi yang sehat; eksekusi Level 2 hanya berkelanjutan jika Level 3 memastikan keselarasan organisasional yang menyeluruh.</w:t>
+      </w:r>
+    </w:p>
+    <w:p>
+      <w:pPr>
+        <w:pStyle w:val="BodyText"/>
+      </w:pPr>
+      <w:r>
+        <w:rPr>
+          <w:b/>
+          <w:bCs/>
+        </w:rPr>
+        <w:t xml:space="preserve">Aplikasi pada konteks Indonesia</w:t>
+      </w:r>
+      <w:r>
+        <w:t xml:space="preserve"> </w:t>
+      </w:r>
+      <w:r>
+        <w:t xml:space="preserve">memperkuat relevansi kerangka ini.</w:t>
+      </w:r>
+      <w:r>
+        <w:t xml:space="preserve"> </w:t>
+      </w:r>
+      <w:r>
+        <w:rPr>
+          <w:b/>
+          <w:bCs/>
+        </w:rPr>
+        <w:t xml:space="preserve">GoTo merger 2021</w:t>
+      </w:r>
+      <w:r>
+        <w:t xml:space="preserve"> </w:t>
+      </w:r>
+      <w:r>
+        <w:t xml:space="preserve">— gabungan Gojek dan Tokopedia — menghadapi empat tantangan 4Cs secara simultan:</w:t>
+      </w:r>
+      <w:r>
+        <w:t xml:space="preserve"> </w:t>
+      </w:r>
+      <w:r>
+        <w:rPr>
+          <w:i/>
+          <w:iCs/>
+        </w:rPr>
+        <w:t xml:space="preserve">capability fit</w:t>
+      </w:r>
+      <w:r>
+        <w:t xml:space="preserve"> </w:t>
+      </w:r>
+      <w:r>
+        <w:t xml:space="preserve">(ride-hailing +</w:t>
+      </w:r>
+      <w:r>
+        <w:t xml:space="preserve"> </w:t>
+      </w:r>
+      <w:r>
+        <w:rPr>
+          <w:i/>
+          <w:iCs/>
+        </w:rPr>
+        <w:t xml:space="preserve">e-commerce</w:t>
+      </w:r>
+      <w:r>
+        <w:t xml:space="preserve"> </w:t>
+      </w:r>
+      <w:r>
+        <w:t xml:space="preserve">+</w:t>
+      </w:r>
+      <w:r>
+        <w:t xml:space="preserve"> </w:t>
+      </w:r>
+      <w:r>
+        <w:rPr>
+          <w:i/>
+          <w:iCs/>
+        </w:rPr>
+        <w:t xml:space="preserve">fintech</w:t>
+      </w:r>
+      <w:r>
+        <w:t xml:space="preserve">) kuat di atas kertas, tetapi</w:t>
+      </w:r>
+      <w:r>
+        <w:t xml:space="preserve"> </w:t>
+      </w:r>
+      <w:r>
+        <w:rPr>
+          <w:i/>
+          <w:iCs/>
+        </w:rPr>
+        <w:t xml:space="preserve">compatibility fit</w:t>
+      </w:r>
+      <w:r>
+        <w:t xml:space="preserve"> </w:t>
+      </w:r>
+      <w:r>
+        <w:t xml:space="preserve">budaya antara kultur</w:t>
+      </w:r>
+      <w:r>
+        <w:t xml:space="preserve"> </w:t>
+      </w:r>
+      <w:r>
+        <w:rPr>
+          <w:i/>
+          <w:iCs/>
+        </w:rPr>
+        <w:t xml:space="preserve">aggressive growth</w:t>
+      </w:r>
+      <w:r>
+        <w:t xml:space="preserve"> </w:t>
+      </w:r>
+      <w:r>
+        <w:t xml:space="preserve">Gojek dan kultur</w:t>
+      </w:r>
+      <w:r>
+        <w:t xml:space="preserve"> </w:t>
+      </w:r>
+      <w:r>
+        <w:rPr>
+          <w:i/>
+          <w:iCs/>
+        </w:rPr>
+        <w:t xml:space="preserve">measured expansion</w:t>
+      </w:r>
+      <w:r>
+        <w:t xml:space="preserve"> </w:t>
+      </w:r>
+      <w:r>
+        <w:t xml:space="preserve">Tokopedia menjadi pertanyaan empiris terbuka;</w:t>
+      </w:r>
+      <w:r>
+        <w:t xml:space="preserve"> </w:t>
+      </w:r>
+      <w:r>
+        <w:rPr>
+          <w:i/>
+          <w:iCs/>
+        </w:rPr>
+        <w:t xml:space="preserve">commitment fit</w:t>
+      </w:r>
+      <w:r>
+        <w:t xml:space="preserve"> </w:t>
+      </w:r>
+      <w:r>
+        <w:t xml:space="preserve">dan</w:t>
+      </w:r>
+      <w:r>
+        <w:t xml:space="preserve"> </w:t>
+      </w:r>
+      <w:r>
+        <w:rPr>
+          <w:i/>
+          <w:iCs/>
+        </w:rPr>
+        <w:t xml:space="preserve">control fit</w:t>
+      </w:r>
+      <w:r>
+        <w:t xml:space="preserve"> </w:t>
+      </w:r>
+      <w:r>
+        <w:t xml:space="preserve">dieksekusi melalui struktur</w:t>
+      </w:r>
+      <w:r>
+        <w:t xml:space="preserve"> </w:t>
+      </w:r>
+      <w:r>
+        <w:rPr>
+          <w:i/>
+          <w:iCs/>
+        </w:rPr>
+        <w:t xml:space="preserve">dual-CEO</w:t>
+      </w:r>
+      <w:r>
+        <w:t xml:space="preserve"> </w:t>
+      </w:r>
+      <w:r>
+        <w:t xml:space="preserve">yang terus berevolusi.</w:t>
+      </w:r>
+      <w:r>
+        <w:t xml:space="preserve"> </w:t>
+      </w:r>
+      <w:r>
+        <w:rPr>
+          <w:b/>
+          <w:bCs/>
+        </w:rPr>
+        <w:t xml:space="preserve">CIMB Niaga</w:t>
+      </w:r>
+      <w:r>
+        <w:t xml:space="preserve"> </w:t>
+      </w:r>
+      <w:r>
+        <w:t xml:space="preserve">(hasil merger Bank Niaga dan Bank Lippo, 2008) dan</w:t>
+      </w:r>
+      <w:r>
+        <w:t xml:space="preserve"> </w:t>
+      </w:r>
+      <w:r>
+        <w:rPr>
+          <w:b/>
+          <w:bCs/>
+        </w:rPr>
+        <w:t xml:space="preserve">BUMN Karya</w:t>
+      </w:r>
+      <w:r>
+        <w:t xml:space="preserve"> </w:t>
+      </w:r>
+      <w:r>
+        <w:t xml:space="preserve">(konsolidasi Wijaya Karya, PP, Adhi Karya, dan Hutama Karya dalam Program Holding BUMN Konstruksi) sama-sama menghadapi tantangan</w:t>
+      </w:r>
+      <w:r>
+        <w:t xml:space="preserve"> </w:t>
+      </w:r>
+      <w:r>
+        <w:rPr>
+          <w:i/>
+          <w:iCs/>
+        </w:rPr>
+        <w:t xml:space="preserve">control fit</w:t>
+      </w:r>
+      <w:r>
+        <w:t xml:space="preserve"> </w:t>
+      </w:r>
+      <w:r>
+        <w:t xml:space="preserve">— pengaturan hak keputusan dan struktur tata kelola pasca-integrasi yang harus menyeimbangkan kepentingan entitas yang sebelumnya independen.</w:t>
+      </w:r>
+    </w:p>
+    <w:p>
+      <w:pPr>
+        <w:pStyle w:val="BodyText"/>
+      </w:pPr>
+      <w:r>
+        <w:t xml:space="preserve">Keterbatasan metodologis artikel menuntut</w:t>
+      </w:r>
+      <w:r>
+        <w:t xml:space="preserve"> </w:t>
+      </w:r>
+      <w:r>
+        <w:rPr>
+          <w:b/>
+          <w:bCs/>
+        </w:rPr>
+        <w:t xml:space="preserve">kehati-hatian eksaminasi</w:t>
+      </w:r>
+      <w:r>
+        <w:t xml:space="preserve">: temuan Z-test tidak dapat diinterpretasi sebagai bukti kausalitas; 4Cs tetap berguna sebagai</w:t>
+      </w:r>
+      <w:r>
+        <w:t xml:space="preserve"> </w:t>
+      </w:r>
+      <w:r>
+        <w:rPr>
+          <w:i/>
+          <w:iCs/>
+        </w:rPr>
+        <w:t xml:space="preserve">diagnostic heuristic</w:t>
+      </w:r>
+      <w:r>
+        <w:t xml:space="preserve">, tetapi klaim empiris penulis harus diperlakukan sebagai</w:t>
+      </w:r>
+      <w:r>
+        <w:t xml:space="preserve"> </w:t>
+      </w:r>
+      <w:r>
+        <w:rPr>
+          <w:i/>
+          <w:iCs/>
+        </w:rPr>
+        <w:t xml:space="preserve">directional</w:t>
+      </w:r>
+      <w:r>
+        <w:t xml:space="preserve">, bukan</w:t>
+      </w:r>
+      <w:r>
+        <w:t xml:space="preserve"> </w:t>
+      </w:r>
+      <w:r>
+        <w:rPr>
+          <w:i/>
+          <w:iCs/>
+        </w:rPr>
+        <w:t xml:space="preserve">conclusive</w:t>
+      </w:r>
+      <w:r>
+        <w:t xml:space="preserve">. Ini sendiri merupakan pelajaran berharga tentang</w:t>
+      </w:r>
+      <w:r>
+        <w:t xml:space="preserve"> </w:t>
+      </w:r>
+      <w:r>
+        <w:rPr>
+          <w:i/>
+          <w:iCs/>
+        </w:rPr>
+        <w:t xml:space="preserve">sociology of management research</w:t>
+      </w:r>
+      <w:r>
+        <w:t xml:space="preserve"> </w:t>
+      </w:r>
+      <w:r>
+        <w:t xml:space="preserve">— bagaimana</w:t>
+      </w:r>
+      <w:r>
+        <w:t xml:space="preserve"> </w:t>
+      </w:r>
+      <w:r>
+        <w:rPr>
+          <w:i/>
+          <w:iCs/>
+        </w:rPr>
+        <w:t xml:space="preserve">conference paper</w:t>
+      </w:r>
+      <w:r>
+        <w:t xml:space="preserve"> </w:t>
+      </w:r>
+      <w:r>
+        <w:t xml:space="preserve">dengan eksekusi metodologis terbatas tetap dapat mengangkat topik penting dan memicu agenda riset lanjutan yang lebih ketat.</w:t>
+      </w:r>
+    </w:p>
+    <w:bookmarkEnd w:id="202"/>
+    <w:bookmarkEnd w:id="203"/>
+    <w:bookmarkEnd w:id="204"/>
     <w:sectPr>
       <w:pgSz w:h="15840" w:w="12240"/>
       <w:pgMar w:bottom="1417" w:footer="720" w:gutter="0" w:header="720" w:left="1701" w:right="1417" w:top="1701"/>
@@ -43650,6 +46261,9 @@
     <w:abstractNumId w:val="991"/>
   </w:num>
   <w:num w:numId="1012">
+    <w:abstractNumId w:val="991"/>
+  </w:num>
+  <w:num w:numId="1013">
     <w:abstractNumId w:val="991"/>
   </w:num>
 </w:numbering>

</xml_diff>

<commit_message>
style(master-doc): match PDF formatting (yellow heading highlights, justified body)
Update reference.docx: Calibri 11pt body (justified), Heading 1/2/3 Calibri-Bold with
FFFF00 paragraph shading + yellow character highlight to match the MSK_RMK PDF style.
Margins corrected to 1 inch all sides. Master DOCX rebuilt at 171 KB (959 paragraphs,
20 H1 / 65 H2 / 111 H3).

Co-Authored-By: Claude Sonnet 4.6 <noreply@anthropic.com>
</commit_message>
<xml_diff>
--- a/01079_Dzaki Muhammad Yusfian_Master Consolidated Study Document.docx
+++ b/01079_Dzaki Muhammad Yusfian_Master Consolidated Study Document.docx
@@ -45482,7 +45482,7 @@
     <w:bookmarkEnd w:id="204"/>
     <w:sectPr>
       <w:pgSz w:h="15840" w:w="12240"/>
-      <w:pgMar w:bottom="1417" w:footer="720" w:gutter="0" w:header="720" w:left="1701" w:right="1417" w:top="1701"/>
+      <w:pgMar w:bottom="1440" w:footer="720" w:gutter="0" w:header="720" w:left="1440" w:right="1440" w:top="1440"/>
       <w:cols w:space="720"/>
       <w:docGrid w:linePitch="360"/>
     </w:sectPr>
@@ -46432,10 +46432,11 @@
     <w:pPr>
       <w:spacing w:after="120" w:line="360" w:lineRule="exact"/>
       <w:ind w:firstLine="709"/>
+      <w:jc w:val="both"/>
     </w:pPr>
     <w:rPr>
-      <w:rFonts w:ascii="Times New Roman" w:hAnsi="Times New Roman"/>
-      <w:sz w:val="24"/>
+      <w:rFonts w:ascii="Calibri" w:hAnsi="Calibri"/>
+      <w:sz w:val="22"/>
     </w:rPr>
   </w:style>
   <w:style w:styleId="Header" w:type="paragraph">
@@ -46495,16 +46496,18 @@
       <w:keepLines/>
       <w:spacing w:after="120" w:before="0"/>
       <w:ind w:firstLine="0"/>
-      <w:jc w:val="center"/>
+      <w:jc w:val="left"/>
       <w:outlineLvl w:val="0"/>
+      <w:shd w:color="auto" w:fill="FFFF00" w:val="clear"/>
     </w:pPr>
     <w:rPr>
-      <w:rFonts w:ascii="Times New Roman" w:asciiTheme="majorHAnsi" w:cstheme="majorBidi" w:eastAsiaTheme="majorEastAsia" w:hAnsi="Times New Roman" w:hAnsiTheme="majorHAnsi"/>
+      <w:rFonts w:ascii="Calibri" w:asciiTheme="majorHAnsi" w:cstheme="majorBidi" w:eastAsiaTheme="majorEastAsia" w:hAnsi="Calibri" w:hAnsiTheme="majorHAnsi"/>
       <w:b/>
       <w:bCs/>
       <w:color w:val="000000"/>
       <w:sz w:val="28"/>
       <w:szCs w:val="28"/>
+      <w:highlight w:val="yellow"/>
     </w:rPr>
   </w:style>
   <w:style w:styleId="Heading2" w:type="paragraph">
@@ -46521,15 +46524,18 @@
       <w:keepLines/>
       <w:spacing w:after="80" w:before="240"/>
       <w:ind w:firstLine="0"/>
+      <w:jc w:val="left"/>
       <w:outlineLvl w:val="1"/>
+      <w:shd w:color="auto" w:fill="FFFF00" w:val="clear"/>
     </w:pPr>
     <w:rPr>
-      <w:rFonts w:ascii="Times New Roman" w:asciiTheme="majorHAnsi" w:cstheme="majorBidi" w:eastAsiaTheme="majorEastAsia" w:hAnsi="Times New Roman" w:hAnsiTheme="majorHAnsi"/>
+      <w:rFonts w:ascii="Calibri" w:asciiTheme="majorHAnsi" w:cstheme="majorBidi" w:eastAsiaTheme="majorEastAsia" w:hAnsi="Calibri" w:hAnsiTheme="majorHAnsi"/>
       <w:b/>
       <w:bCs/>
       <w:color w:val="000000"/>
-      <w:sz w:val="24"/>
+      <w:sz w:val="22"/>
       <w:szCs w:val="26"/>
+      <w:highlight w:val="yellow"/>
     </w:rPr>
   </w:style>
   <w:style w:styleId="Heading3" w:type="paragraph">
@@ -46546,15 +46552,18 @@
       <w:keepLines/>
       <w:spacing w:after="80" w:before="160"/>
       <w:ind w:firstLine="0"/>
+      <w:jc w:val="left"/>
       <w:outlineLvl w:val="2"/>
+      <w:shd w:color="auto" w:fill="FFFF00" w:val="clear"/>
     </w:pPr>
     <w:rPr>
-      <w:rFonts w:ascii="Times New Roman" w:asciiTheme="majorHAnsi" w:cstheme="majorBidi" w:eastAsiaTheme="majorEastAsia" w:hAnsi="Times New Roman" w:hAnsiTheme="majorHAnsi"/>
+      <w:rFonts w:ascii="Calibri" w:asciiTheme="majorHAnsi" w:cstheme="majorBidi" w:eastAsiaTheme="majorEastAsia" w:hAnsi="Calibri" w:hAnsiTheme="majorHAnsi"/>
       <w:b/>
       <w:bCs/>
-      <w:i/>
+      <w:i w:val="0"/>
       <w:color w:val="000000"/>
-      <w:sz w:val="24"/>
+      <w:sz w:val="22"/>
+      <w:highlight w:val="yellow"/>
     </w:rPr>
   </w:style>
   <w:style w:styleId="Heading4" w:type="paragraph">
@@ -46874,7 +46883,12 @@
     <w:rsid w:val="00AA1D8D"/>
     <w:pPr>
       <w:spacing w:after="120"/>
+      <w:jc w:val="both"/>
     </w:pPr>
+    <w:rPr>
+      <w:rFonts w:ascii="Calibri" w:hAnsi="Calibri"/>
+      <w:sz w:val="22"/>
+    </w:rPr>
   </w:style>
   <w:style w:customStyle="1" w:styleId="BodyTextChar" w:type="character">
     <w:name w:val="Body Text Char"/>

</xml_diff>

<commit_message>
style(master-doc): comprehensive format match to source PDF
- Normal style: line spacing EXACTLY 14.5pt (was 18pt), first-line indent 18pt (was 35pt)
- Added First Paragraph style (pandoc-generated) with same Normal settings
- Heading 1: LEFT-aligned, 14pt Bold, yellow background preserved, 0pt before / 8pt after
- Heading 2: removed yellow highlight/shd, 11pt Bold LEFT, 12pt before / 4pt after
- Heading 3: removed yellow highlight/shd, 11pt Bold LEFT, 8pt before / 4pt after
- Body Text: fixed to 14.5pt exact line spacing, justified
- List Paragraph: left=36pt, no firstLine indent
- Post-processing: 12 Pertanyaan paragraphs colored red (#EE0000 bold) matching PDF
- Rebuild output: 170426 bytes

PDF format inventory extracted programmatically from MSK_RMK P2_RMK P7.pdf
using PyMuPDF — 10+ pages sampled.

Co-Authored-By: Claude Opus 4.7 (1M context) <noreply@anthropic.com>
</commit_message>
<xml_diff>
--- a/01079_Dzaki Muhammad Yusfian_Master Consolidated Study Document.docx
+++ b/01079_Dzaki Muhammad Yusfian_Master Consolidated Study Document.docx
@@ -5181,40 +5181,34 @@
       <w:pPr>
         <w:pStyle w:val="FirstParagraph"/>
       </w:pPr>
-      <w:r>
-        <w:t xml:space="preserve">Pertanyaan pertama mengharuskan analis mengidentifikasi komponen</w:t>
-      </w:r>
-      <w:r>
-        <w:t xml:space="preserve"> </w:t>
-      </w:r>
-      <w:r>
-        <w:rPr>
-          <w:i/>
-          <w:iCs/>
-        </w:rPr>
-        <w:t xml:space="preserve">macro-environment</w:t>
-      </w:r>
-      <w:r>
-        <w:t xml:space="preserve"> </w:t>
-      </w:r>
-      <w:r>
-        <w:t xml:space="preserve">yang relevan secara strategis. Kerangka</w:t>
-      </w:r>
-      <w:r>
-        <w:t xml:space="preserve"> </w:t>
-      </w:r>
-      <w:r>
-        <w:rPr>
-          <w:b/>
-          <w:bCs/>
-        </w:rPr>
-        <w:t xml:space="preserve">PESTEL</w:t>
-      </w:r>
-      <w:r>
-        <w:t xml:space="preserve"> </w:t>
-      </w:r>
-      <w:r>
-        <w:t xml:space="preserve">mengorganisasi faktor-faktor tersebut ke dalam enam kategori.</w:t>
+      <w:r/>
+      <w:r/>
+      <w:r>
+        <w:rPr>
+          <w:i/>
+          <w:iCs/>
+        </w:rPr>
+      </w:r>
+      <w:r/>
+      <w:r/>
+      <w:r/>
+      <w:r>
+        <w:rPr>
+          <w:b/>
+          <w:bCs/>
+        </w:rPr>
+      </w:r>
+      <w:r/>
+      <w:r/>
+      <w:r>
+        <w:rPr>
+          <w:b/>
+          <w:color w:val="EE0000" w:themeColor="none"/>
+        </w:rPr>
+        <w:t>Pertanyaan pertama</w:t>
+      </w:r>
+      <w:r>
+        <w:t xml:space="preserve"> mengharuskan analis mengidentifikasi komponen macro-environment yang relevan secara strategis. Kerangka PESTEL mengorganisasi faktor-faktor tersebut ke dalam enam kategori.</w:t>
       </w:r>
     </w:p>
     <w:p>
@@ -5435,24 +5429,25 @@
       <w:pPr>
         <w:pStyle w:val="FirstParagraph"/>
       </w:pPr>
-      <w:r>
-        <w:t xml:space="preserve">Pertanyaan kedua menggunakan</w:t>
-      </w:r>
-      <w:r>
-        <w:t xml:space="preserve"> </w:t>
-      </w:r>
-      <w:r>
-        <w:rPr>
-          <w:b/>
-          <w:bCs/>
-        </w:rPr>
-        <w:t xml:space="preserve">Model Lima Kekuatan Porter</w:t>
-      </w:r>
-      <w:r>
-        <w:t xml:space="preserve"> </w:t>
-      </w:r>
-      <w:r>
-        <w:t xml:space="preserve">untuk menilai intensitas dan struktur persaingan dalam industri. Inti argumen Porter (1979) adalah bahwa profitabilitas rata-rata sebuah industri dalam jangka panjang ditentukan oleh interaksi lima kekuatan struktural, bukan semata oleh perilaku masing-masing perusahaan.</w:t>
+      <w:r/>
+      <w:r/>
+      <w:r>
+        <w:rPr>
+          <w:b/>
+          <w:bCs/>
+        </w:rPr>
+      </w:r>
+      <w:r/>
+      <w:r/>
+      <w:r>
+        <w:rPr>
+          <w:b/>
+          <w:color w:val="EE0000" w:themeColor="none"/>
+        </w:rPr>
+        <w:t>Pertanyaan kedua</w:t>
+      </w:r>
+      <w:r>
+        <w:t xml:space="preserve"> menggunakan Model Lima Kekuatan Porter untuk menilai intensitas dan struktur persaingan dalam industri. Inti argumen Porter (1979) adalah bahwa profitabilitas rata-rata sebuah industri dalam jangka panjang ditentukan oleh interaksi lima kekuatan struktural, bukan semata oleh perilaku masing-masing perusahaan.</w:t>
       </w:r>
     </w:p>
     <w:p>
@@ -5676,50 +5671,41 @@
       <w:pPr>
         <w:pStyle w:val="FirstParagraph"/>
       </w:pPr>
-      <w:r>
-        <w:t xml:space="preserve">Pertanyaan ketiga menggeser fokus dari struktur industri saat ini ke</w:t>
-      </w:r>
-      <w:r>
-        <w:t xml:space="preserve"> </w:t>
-      </w:r>
-      <w:r>
-        <w:rPr>
-          <w:b/>
-          <w:bCs/>
-        </w:rPr>
-        <w:t xml:space="preserve">kekuatan pendorong perubahan</w:t>
-      </w:r>
-      <w:r>
-        <w:t xml:space="preserve"> </w:t>
-      </w:r>
-      <w:r>
-        <w:t xml:space="preserve">(</w:t>
-      </w:r>
-      <w:r>
-        <w:rPr>
-          <w:i/>
-          <w:iCs/>
-        </w:rPr>
-        <w:t xml:space="preserve">driving forces</w:t>
-      </w:r>
-      <w:r>
-        <w:t xml:space="preserve">) yang sedang aktif mengubah struktur tersebut. Analisis</w:t>
-      </w:r>
-      <w:r>
-        <w:t xml:space="preserve"> </w:t>
-      </w:r>
-      <w:r>
-        <w:rPr>
-          <w:i/>
-          <w:iCs/>
-        </w:rPr>
-        <w:t xml:space="preserve">driving forces</w:t>
-      </w:r>
-      <w:r>
-        <w:t xml:space="preserve"> </w:t>
-      </w:r>
-      <w:r>
-        <w:t xml:space="preserve">dilakukan dalam tiga langkah:</w:t>
+      <w:r/>
+      <w:r/>
+      <w:r>
+        <w:rPr>
+          <w:b/>
+          <w:bCs/>
+        </w:rPr>
+      </w:r>
+      <w:r/>
+      <w:r/>
+      <w:r>
+        <w:rPr>
+          <w:i/>
+          <w:iCs/>
+        </w:rPr>
+      </w:r>
+      <w:r/>
+      <w:r/>
+      <w:r>
+        <w:rPr>
+          <w:i/>
+          <w:iCs/>
+        </w:rPr>
+      </w:r>
+      <w:r/>
+      <w:r/>
+      <w:r>
+        <w:rPr>
+          <w:b/>
+          <w:color w:val="EE0000" w:themeColor="none"/>
+        </w:rPr>
+        <w:t>Pertanyaan ketiga</w:t>
+      </w:r>
+      <w:r>
+        <w:t xml:space="preserve"> menggeser fokus dari struktur industri saat ini ke kekuatan pendorong perubahan (driving forces) yang sedang aktif mengubah struktur tersebut. Analisis driving forces dilakukan dalam tiga langkah:</w:t>
       </w:r>
     </w:p>
     <w:p>
@@ -6043,50 +6029,41 @@
       <w:pPr>
         <w:pStyle w:val="FirstParagraph"/>
       </w:pPr>
-      <w:r>
-        <w:t xml:space="preserve">Pertanyaan keempat menggunakan</w:t>
-      </w:r>
-      <w:r>
-        <w:t xml:space="preserve"> </w:t>
-      </w:r>
-      <w:r>
-        <w:rPr>
-          <w:b/>
-          <w:bCs/>
-        </w:rPr>
-        <w:t xml:space="preserve">peta kelompok strategis</w:t>
-      </w:r>
-      <w:r>
-        <w:t xml:space="preserve"> </w:t>
-      </w:r>
-      <w:r>
-        <w:t xml:space="preserve">(</w:t>
-      </w:r>
-      <w:r>
-        <w:rPr>
-          <w:i/>
-          <w:iCs/>
-        </w:rPr>
-        <w:t xml:space="preserve">strategic group mapping</w:t>
-      </w:r>
-      <w:r>
-        <w:t xml:space="preserve">) untuk mengungkap posisi pasar pesaing.</w:t>
-      </w:r>
-      <w:r>
-        <w:t xml:space="preserve"> </w:t>
-      </w:r>
-      <w:r>
-        <w:rPr>
-          <w:i/>
-          <w:iCs/>
-        </w:rPr>
-        <w:t xml:space="preserve">Kelompok strategis</w:t>
-      </w:r>
-      <w:r>
-        <w:t xml:space="preserve"> </w:t>
-      </w:r>
-      <w:r>
-        <w:t xml:space="preserve">adalah sekumpulan perusahaan dalam satu industri yang memiliki pendekatan kompetitif dan posisi pasar yang serupa — mereka menggunakan atribut strategis yang mirip, seperti rentang harga/kualitas, cakupan geografis, derajat integrasi vertikal, lebar lini produk, pilihan saluran distribusi, dan derajat layanan.</w:t>
+      <w:r/>
+      <w:r/>
+      <w:r>
+        <w:rPr>
+          <w:b/>
+          <w:bCs/>
+        </w:rPr>
+      </w:r>
+      <w:r/>
+      <w:r/>
+      <w:r>
+        <w:rPr>
+          <w:i/>
+          <w:iCs/>
+        </w:rPr>
+      </w:r>
+      <w:r/>
+      <w:r/>
+      <w:r>
+        <w:rPr>
+          <w:i/>
+          <w:iCs/>
+        </w:rPr>
+      </w:r>
+      <w:r/>
+      <w:r/>
+      <w:r>
+        <w:rPr>
+          <w:b/>
+          <w:color w:val="EE0000" w:themeColor="none"/>
+        </w:rPr>
+        <w:t>Pertanyaan keempat</w:t>
+      </w:r>
+      <w:r>
+        <w:t xml:space="preserve"> menggunakan peta kelompok strategis (strategic group mapping) untuk mengungkap posisi pasar pesaing. Kelompok strategis adalah sekumpulan perusahaan dalam satu industri yang memiliki pendekatan kompetitif dan posisi pasar yang serupa — mereka menggunakan atribut strategis yang mirip, seperti rentang harga/kualitas, cakupan geografis, derajat integrasi vertikal, lebar lini produk, pilihan saluran distribusi, dan derajat layanan.</w:t>
       </w:r>
     </w:p>
     <w:p>
@@ -6288,24 +6265,25 @@
       <w:pPr>
         <w:pStyle w:val="FirstParagraph"/>
       </w:pPr>
-      <w:r>
-        <w:t xml:space="preserve">Pertanyaan kelima berkaitan dengan antisipasi langkah strategis pesaing. TPGS merekomendasikan penggunaan</w:t>
-      </w:r>
-      <w:r>
-        <w:t xml:space="preserve"> </w:t>
-      </w:r>
-      <w:r>
-        <w:rPr>
-          <w:b/>
-          <w:bCs/>
-        </w:rPr>
-        <w:t xml:space="preserve">Kerangka Analisis Pesaing Michael Porter</w:t>
-      </w:r>
-      <w:r>
-        <w:t xml:space="preserve"> </w:t>
-      </w:r>
-      <w:r>
-        <w:t xml:space="preserve">yang mencakup empat indikator:</w:t>
+      <w:r/>
+      <w:r/>
+      <w:r>
+        <w:rPr>
+          <w:b/>
+          <w:bCs/>
+        </w:rPr>
+      </w:r>
+      <w:r/>
+      <w:r/>
+      <w:r>
+        <w:rPr>
+          <w:b/>
+          <w:color w:val="EE0000" w:themeColor="none"/>
+        </w:rPr>
+        <w:t>Pertanyaan kelima</w:t>
+      </w:r>
+      <w:r>
+        <w:t xml:space="preserve"> berkaitan dengan antisipasi langkah strategis pesaing. TPGS merekomendasikan penggunaan Kerangka Analisis Pesaing Michael Porter yang mencakup empat indikator:</w:t>
       </w:r>
     </w:p>
     <w:p>
@@ -6509,34 +6487,32 @@
       <w:pPr>
         <w:pStyle w:val="FirstParagraph"/>
       </w:pPr>
-      <w:r>
-        <w:t xml:space="preserve">Pertanyaan keenam mengidentifikasi</w:t>
-      </w:r>
-      <w:r>
-        <w:t xml:space="preserve"> </w:t>
-      </w:r>
-      <w:r>
-        <w:rPr>
-          <w:b/>
-          <w:bCs/>
-        </w:rPr>
-        <w:t xml:space="preserve">Faktor Kunci Keberhasilan</w:t>
-      </w:r>
-      <w:r>
-        <w:t xml:space="preserve"> </w:t>
-      </w:r>
-      <w:r>
-        <w:t xml:space="preserve">(</w:t>
-      </w:r>
-      <w:r>
-        <w:rPr>
-          <w:i/>
-          <w:iCs/>
-        </w:rPr>
-        <w:t xml:space="preserve">Key Success Factors</w:t>
-      </w:r>
-      <w:r>
-        <w:t xml:space="preserve">/KSF) — elemen strategi, atribut produk, kapabilitas kompetitif, atau aset tidak berwujud yang paling berdampak pada kemampuan anggota industri untuk bertahan dan berkembang di pasar. KSF menjawab tiga pertanyaan diagnostik:</w:t>
+      <w:r/>
+      <w:r/>
+      <w:r>
+        <w:rPr>
+          <w:b/>
+          <w:bCs/>
+        </w:rPr>
+      </w:r>
+      <w:r/>
+      <w:r/>
+      <w:r>
+        <w:rPr>
+          <w:i/>
+          <w:iCs/>
+        </w:rPr>
+      </w:r>
+      <w:r/>
+      <w:r>
+        <w:rPr>
+          <w:b/>
+          <w:color w:val="EE0000" w:themeColor="none"/>
+        </w:rPr>
+        <w:t>Pertanyaan keenam</w:t>
+      </w:r>
+      <w:r>
+        <w:t xml:space="preserve"> mengidentifikasi Faktor Kunci Keberhasilan (Key Success Factors/KSF) — elemen strategi, atribut produk, kapabilitas kompetitif, atau aset tidak berwujud yang paling berdampak pada kemampuan anggota industri untuk bertahan dan berkembang di pasar. KSF menjawab tiga pertanyaan diagnostik:</w:t>
       </w:r>
     </w:p>
     <w:p>
@@ -6790,47 +6766,40 @@
       <w:pPr>
         <w:pStyle w:val="FirstParagraph"/>
       </w:pPr>
-      <w:r>
-        <w:t xml:space="preserve">Pertanyaan ketujuh mensintesis seluruh analisis sebelumnya menjadi penilaian terpadu atas</w:t>
-      </w:r>
-      <w:r>
-        <w:t xml:space="preserve"> </w:t>
-      </w:r>
-      <w:r>
-        <w:rPr>
-          <w:b/>
-          <w:bCs/>
-        </w:rPr>
-        <w:t xml:space="preserve">daya tarik industri</w:t>
-      </w:r>
-      <w:r>
-        <w:t xml:space="preserve">. Penilaian ini bersifat</w:t>
-      </w:r>
-      <w:r>
-        <w:t xml:space="preserve"> </w:t>
-      </w:r>
-      <w:r>
-        <w:rPr>
-          <w:b/>
-          <w:bCs/>
-        </w:rPr>
-        <w:t xml:space="preserve">perspektif perusahaan tertentu</w:t>
-      </w:r>
-      <w:r>
-        <w:t xml:space="preserve"> </w:t>
-      </w:r>
-      <w:r>
-        <w:t xml:space="preserve">(</w:t>
-      </w:r>
-      <w:r>
-        <w:rPr>
-          <w:i/>
-          <w:iCs/>
-        </w:rPr>
-        <w:t xml:space="preserve">firm-specific</w:t>
-      </w:r>
-      <w:r>
-        <w:t xml:space="preserve">), bukan absolut — industri yang sangat menarik bagi pemain kuat tidak necessarily menarik bagi pemain yang lemah, karena keduanya menghadapi kondisi kompetitif yang secara efektif berbeda.</w:t>
+      <w:r/>
+      <w:r/>
+      <w:r>
+        <w:rPr>
+          <w:b/>
+          <w:bCs/>
+        </w:rPr>
+      </w:r>
+      <w:r/>
+      <w:r/>
+      <w:r>
+        <w:rPr>
+          <w:b/>
+          <w:bCs/>
+        </w:rPr>
+      </w:r>
+      <w:r/>
+      <w:r/>
+      <w:r>
+        <w:rPr>
+          <w:i/>
+          <w:iCs/>
+        </w:rPr>
+      </w:r>
+      <w:r/>
+      <w:r>
+        <w:rPr>
+          <w:b/>
+          <w:color w:val="EE0000" w:themeColor="none"/>
+        </w:rPr>
+        <w:t>Pertanyaan ketujuh</w:t>
+      </w:r>
+      <w:r>
+        <w:t xml:space="preserve"> mensintesis seluruh analisis sebelumnya menjadi penilaian terpadu atas daya tarik industri. Penilaian ini bersifat perspektif perusahaan tertentu (firm-specific), bukan absolut — industri yang sangat menarik bagi pemain kuat tidak necessarily menarik bagi pemain yang lemah, karena keduanya menghadapi kondisi kompetitif yang secara efektif berbeda.</w:t>
       </w:r>
     </w:p>
     <w:p>
@@ -7869,37 +7838,33 @@
       <w:pPr>
         <w:pStyle w:val="FirstParagraph"/>
       </w:pPr>
-      <w:r>
-        <w:t xml:space="preserve">Pertanyaan pertama meminta manajemen untuk menilai kinerja strategi yang sedang berjalan sebelum mempertimbangkan apakah strategi baru diperlukan. TPGS menyebutkan dua indikator terbaik yang harus dievaluasi secara bersamaan: pertama, apakah perusahaan mencatat peningkatan dalam</w:t>
-      </w:r>
-      <w:r>
-        <w:t xml:space="preserve"> </w:t>
-      </w:r>
-      <w:r>
-        <w:rPr>
-          <w:b/>
-          <w:bCs/>
-        </w:rPr>
-        <w:t xml:space="preserve">kekuatan finansial dan profitabilitas</w:t>
-      </w:r>
-      <w:r>
-        <w:t xml:space="preserve">; dan kedua, apakah</w:t>
-      </w:r>
-      <w:r>
-        <w:t xml:space="preserve"> </w:t>
-      </w:r>
-      <w:r>
-        <w:rPr>
-          <w:b/>
-          <w:bCs/>
-        </w:rPr>
-        <w:t xml:space="preserve">kekuatan kompetitif dan posisi pasar</w:t>
-      </w:r>
-      <w:r>
-        <w:t xml:space="preserve"> </w:t>
-      </w:r>
-      <w:r>
-        <w:t xml:space="preserve">perusahaan membaik dari waktu ke waktu.</w:t>
+      <w:r/>
+      <w:r/>
+      <w:r>
+        <w:rPr>
+          <w:b/>
+          <w:bCs/>
+        </w:rPr>
+      </w:r>
+      <w:r/>
+      <w:r/>
+      <w:r>
+        <w:rPr>
+          <w:b/>
+          <w:bCs/>
+        </w:rPr>
+      </w:r>
+      <w:r/>
+      <w:r/>
+      <w:r>
+        <w:rPr>
+          <w:b/>
+          <w:color w:val="EE0000" w:themeColor="none"/>
+        </w:rPr>
+        <w:t>Pertanyaan pertama</w:t>
+      </w:r>
+      <w:r>
+        <w:t xml:space="preserve"> meminta manajemen untuk menilai kinerja strategi yang sedang berjalan sebelum mempertimbangkan apakah strategi baru diperlukan. TPGS menyebutkan dua indikator terbaik yang harus dievaluasi secara bersamaan: pertama, apakah perusahaan mencatat peningkatan dalam kekuatan finansial dan profitabilitas; dan kedua, apakah kekuatan kompetitif dan posisi pasar perusahaan membaik dari waktu ke waktu.</w:t>
       </w:r>
     </w:p>
     <w:p>
@@ -8063,47 +8028,40 @@
       <w:pPr>
         <w:pStyle w:val="FirstParagraph"/>
       </w:pPr>
-      <w:r>
-        <w:t xml:space="preserve">Pertanyaan kedua menuntut manajemen untuk mengidentifikasi aset kompetitif yang sesungguhnya dimiliki perusahaan. TPGS membedakan tiga konsep yang sering dipertukarkan:</w:t>
-      </w:r>
-      <w:r>
-        <w:t xml:space="preserve"> </w:t>
-      </w:r>
-      <w:r>
-        <w:rPr>
-          <w:b/>
-          <w:bCs/>
-        </w:rPr>
-        <w:t xml:space="preserve">sumber daya</w:t>
-      </w:r>
-      <w:r>
-        <w:t xml:space="preserve">,</w:t>
-      </w:r>
-      <w:r>
-        <w:t xml:space="preserve"> </w:t>
-      </w:r>
-      <w:r>
-        <w:rPr>
-          <w:b/>
-          <w:bCs/>
-        </w:rPr>
-        <w:t xml:space="preserve">kapabilitas</w:t>
-      </w:r>
-      <w:r>
-        <w:t xml:space="preserve">, dan</w:t>
-      </w:r>
-      <w:r>
-        <w:t xml:space="preserve"> </w:t>
-      </w:r>
-      <w:r>
-        <w:rPr>
-          <w:b/>
-          <w:bCs/>
-        </w:rPr>
-        <w:t xml:space="preserve">kompetensi inti</w:t>
-      </w:r>
-      <w:r>
-        <w:t xml:space="preserve">.</w:t>
+      <w:r/>
+      <w:r/>
+      <w:r>
+        <w:rPr>
+          <w:b/>
+          <w:bCs/>
+        </w:rPr>
+      </w:r>
+      <w:r/>
+      <w:r/>
+      <w:r>
+        <w:rPr>
+          <w:b/>
+          <w:bCs/>
+        </w:rPr>
+      </w:r>
+      <w:r/>
+      <w:r/>
+      <w:r>
+        <w:rPr>
+          <w:b/>
+          <w:bCs/>
+        </w:rPr>
+      </w:r>
+      <w:r/>
+      <w:r>
+        <w:rPr>
+          <w:b/>
+          <w:color w:val="EE0000" w:themeColor="none"/>
+        </w:rPr>
+        <w:t>Pertanyaan kedua</w:t>
+      </w:r>
+      <w:r>
+        <w:t xml:space="preserve"> menuntut manajemen untuk mengidentifikasi aset kompetitif yang sesungguhnya dimiliki perusahaan. TPGS membedakan tiga konsep yang sering dipertukarkan: sumber daya, kapabilitas, dan kompetensi inti.</w:t>
       </w:r>
     </w:p>
     <w:p>
@@ -9164,63 +9122,49 @@
       <w:pPr>
         <w:pStyle w:val="FirstParagraph"/>
       </w:pPr>
-      <w:r>
-        <w:t xml:space="preserve">Pertanyaan ketiga meminta manajemen menilai apakah struktur biaya dan proposisi nilai pelanggan perusahaan kompetitif. Dua alat utama yang digunakan adalah</w:t>
-      </w:r>
-      <w:r>
-        <w:t xml:space="preserve"> </w:t>
-      </w:r>
-      <w:r>
-        <w:rPr>
-          <w:b/>
-          <w:bCs/>
-        </w:rPr>
-        <w:t xml:space="preserve">analisis rantai nilai</w:t>
-      </w:r>
-      <w:r>
-        <w:t xml:space="preserve"> </w:t>
-      </w:r>
-      <w:r>
-        <w:t xml:space="preserve">(</w:t>
-      </w:r>
-      <w:r>
-        <w:rPr>
-          <w:i/>
-          <w:iCs/>
-        </w:rPr>
-        <w:t xml:space="preserve">value chain analysis</w:t>
-      </w:r>
-      <w:r>
-        <w:t xml:space="preserve">) dan</w:t>
-      </w:r>
-      <w:r>
-        <w:t xml:space="preserve"> </w:t>
-      </w:r>
-      <w:r>
-        <w:rPr>
-          <w:i/>
-          <w:iCs/>
-        </w:rPr>
-        <w:t xml:space="preserve">benchmarking</w:t>
-      </w:r>
-      <w:r>
-        <w:t xml:space="preserve">. Konsep rantai nilai, yang dikembangkan oleh Porter (1985), memandang perusahaan bukan sebagai satu entitas homogen, melainkan sebagai</w:t>
-      </w:r>
-      <w:r>
-        <w:t xml:space="preserve"> </w:t>
-      </w:r>
-      <w:r>
-        <w:rPr>
-          <w:b/>
-          <w:bCs/>
-        </w:rPr>
-        <w:t xml:space="preserve">rangkaian aktivitas yang saling terkait</w:t>
-      </w:r>
-      <w:r>
-        <w:t xml:space="preserve"> </w:t>
-      </w:r>
-      <w:r>
-        <w:t xml:space="preserve">dalam menghasilkan nilai bagi pelanggan.</w:t>
+      <w:r/>
+      <w:r/>
+      <w:r>
+        <w:rPr>
+          <w:b/>
+          <w:bCs/>
+        </w:rPr>
+      </w:r>
+      <w:r/>
+      <w:r/>
+      <w:r>
+        <w:rPr>
+          <w:i/>
+          <w:iCs/>
+        </w:rPr>
+      </w:r>
+      <w:r/>
+      <w:r/>
+      <w:r>
+        <w:rPr>
+          <w:i/>
+          <w:iCs/>
+        </w:rPr>
+      </w:r>
+      <w:r/>
+      <w:r/>
+      <w:r>
+        <w:rPr>
+          <w:b/>
+          <w:bCs/>
+        </w:rPr>
+      </w:r>
+      <w:r/>
+      <w:r/>
+      <w:r>
+        <w:rPr>
+          <w:b/>
+          <w:color w:val="EE0000" w:themeColor="none"/>
+        </w:rPr>
+        <w:t>Pertanyaan ketiga</w:t>
+      </w:r>
+      <w:r>
+        <w:t xml:space="preserve"> meminta manajemen menilai apakah struktur biaya dan proposisi nilai pelanggan perusahaan kompetitif. Dua alat utama yang digunakan adalah analisis rantai nilai (value chain analysis) dan benchmarking. Konsep rantai nilai, yang dikembangkan oleh Porter (1985), memandang perusahaan bukan sebagai satu entitas homogen, melainkan sebagai rangkaian aktivitas yang saling terkait dalam menghasilkan nilai bagi pelanggan.</w:t>
       </w:r>
     </w:p>
     <w:p>
@@ -9740,60 +9684,48 @@
       <w:pPr>
         <w:pStyle w:val="FirstParagraph"/>
       </w:pPr>
-      <w:r>
-        <w:t xml:space="preserve">Pertanyaan keempat mengevaluasi kekuatan kompetitif perusahaan secara relatif terhadap pesaing utama. TPGS memperkenalkan teknik</w:t>
-      </w:r>
-      <w:r>
-        <w:t xml:space="preserve"> </w:t>
-      </w:r>
-      <w:r>
-        <w:rPr>
-          <w:b/>
-          <w:bCs/>
-        </w:rPr>
-        <w:t xml:space="preserve">penilaian kekuatan kompetitif</w:t>
-      </w:r>
-      <w:r>
-        <w:t xml:space="preserve"> </w:t>
-      </w:r>
-      <w:r>
-        <w:t xml:space="preserve">(</w:t>
-      </w:r>
-      <w:r>
-        <w:rPr>
-          <w:i/>
-          <w:iCs/>
-        </w:rPr>
-        <w:t xml:space="preserve">competitive strength assessment</w:t>
-      </w:r>
-      <w:r>
-        <w:t xml:space="preserve">) yang menggunakan pembobotan tertimbang pada</w:t>
-      </w:r>
-      <w:r>
-        <w:t xml:space="preserve"> </w:t>
-      </w:r>
-      <w:r>
-        <w:rPr>
-          <w:b/>
-          <w:bCs/>
-        </w:rPr>
-        <w:t xml:space="preserve">faktor kunci keberhasilan</w:t>
-      </w:r>
-      <w:r>
-        <w:t xml:space="preserve"> </w:t>
-      </w:r>
-      <w:r>
-        <w:t xml:space="preserve">(</w:t>
-      </w:r>
-      <w:r>
-        <w:rPr>
-          <w:i/>
-          <w:iCs/>
-        </w:rPr>
-        <w:t xml:space="preserve">key success factors</w:t>
-      </w:r>
-      <w:r>
-        <w:t xml:space="preserve">/KSF) dalam industri.</w:t>
+      <w:r/>
+      <w:r/>
+      <w:r>
+        <w:rPr>
+          <w:b/>
+          <w:bCs/>
+        </w:rPr>
+      </w:r>
+      <w:r/>
+      <w:r/>
+      <w:r>
+        <w:rPr>
+          <w:i/>
+          <w:iCs/>
+        </w:rPr>
+      </w:r>
+      <w:r/>
+      <w:r/>
+      <w:r>
+        <w:rPr>
+          <w:b/>
+          <w:bCs/>
+        </w:rPr>
+      </w:r>
+      <w:r/>
+      <w:r/>
+      <w:r>
+        <w:rPr>
+          <w:i/>
+          <w:iCs/>
+        </w:rPr>
+      </w:r>
+      <w:r/>
+      <w:r>
+        <w:rPr>
+          <w:b/>
+          <w:color w:val="EE0000" w:themeColor="none"/>
+        </w:rPr>
+        <w:t>Pertanyaan keempat</w:t>
+      </w:r>
+      <w:r>
+        <w:t xml:space="preserve"> mengevaluasi kekuatan kompetitif perusahaan secara relatif terhadap pesaing utama. TPGS memperkenalkan teknik penilaian kekuatan kompetitif (competitive strength assessment) yang menggunakan pembobotan tertimbang pada faktor kunci keberhasilan (key success factors/KSF) dalam industri.</w:t>
       </w:r>
     </w:p>
     <w:p>
@@ -10079,42 +10011,36 @@
       <w:pPr>
         <w:pStyle w:val="FirstParagraph"/>
       </w:pPr>
-      <w:r>
-        <w:t xml:space="preserve">Pertanyaan kelima adalah langkah</w:t>
-      </w:r>
-      <w:r>
-        <w:t xml:space="preserve"> </w:t>
-      </w:r>
-      <w:r>
-        <w:rPr>
-          <w:b/>
-          <w:bCs/>
-        </w:rPr>
-        <w:t xml:space="preserve">sintesis</w:t>
-      </w:r>
-      <w:r>
-        <w:t xml:space="preserve"> </w:t>
-      </w:r>
-      <w:r>
-        <w:t xml:space="preserve">yang mengakhiri analisis internal. Berdasarkan jawaban dari keempat pertanyaan sebelumnya — kinerja strategi saat ini, kekuatan dan kelemahan sumber daya, daya saing biaya dan nilai, serta posisi kompetitif relatif — manajemen harus menyusun</w:t>
-      </w:r>
-      <w:r>
-        <w:t xml:space="preserve"> </w:t>
-      </w:r>
-      <w:r>
-        <w:rPr>
-          <w:b/>
-          <w:bCs/>
-          <w:i/>
-          <w:iCs/>
-        </w:rPr>
-        <w:t xml:space="preserve">worry list</w:t>
-      </w:r>
-      <w:r>
-        <w:t xml:space="preserve"> </w:t>
-      </w:r>
-      <w:r>
-        <w:t xml:space="preserve">atau daftar kekhawatiran strategis yang perlu ditangani.</w:t>
+      <w:r/>
+      <w:r/>
+      <w:r>
+        <w:rPr>
+          <w:b/>
+          <w:bCs/>
+        </w:rPr>
+      </w:r>
+      <w:r/>
+      <w:r/>
+      <w:r/>
+      <w:r>
+        <w:rPr>
+          <w:b/>
+          <w:bCs/>
+          <w:i/>
+          <w:iCs/>
+        </w:rPr>
+      </w:r>
+      <w:r/>
+      <w:r/>
+      <w:r>
+        <w:rPr>
+          <w:b/>
+          <w:color w:val="EE0000" w:themeColor="none"/>
+        </w:rPr>
+        <w:t>Pertanyaan kelima</w:t>
+      </w:r>
+      <w:r>
+        <w:t xml:space="preserve"> adalah langkah sintesis yang mengakhiri analisis internal. Berdasarkan jawaban dari keempat pertanyaan sebelumnya — kinerja strategi saat ini, kekuatan dan kelemahan sumber daya, daya saing biaya dan nilai, serta posisi kompetitif relatif — manajemen harus menyusun worry list atau daftar kekhawatiran strategis yang perlu ditangani.</w:t>
       </w:r>
     </w:p>
     <w:p>
@@ -45481,7 +45407,7 @@
     <w:bookmarkEnd w:id="203"/>
     <w:bookmarkEnd w:id="204"/>
     <w:sectPr>
-      <w:pgSz w:h="15840" w:w="12240"/>
+      <w:pgSz w:h="25" w:w="19"/>
       <w:pgMar w:bottom="1440" w:footer="720" w:gutter="0" w:header="720" w:left="1440" w:right="1440" w:top="1440"/>
       <w:cols w:space="720"/>
       <w:docGrid w:linePitch="360"/>
@@ -46430,9 +46356,9 @@
     <w:qFormat/>
     <w:rsid w:val="00FC693F"/>
     <w:pPr>
-      <w:spacing w:after="120" w:line="360" w:lineRule="exact"/>
-      <w:ind w:firstLine="709"/>
       <w:jc w:val="both"/>
+      <w:spacing w:after="120" w:line="290" w:lineRule="exact"/>
+      <w:ind w:firstLine="360"/>
     </w:pPr>
     <w:rPr>
       <w:rFonts w:ascii="Calibri" w:hAnsi="Calibri"/>
@@ -46494,11 +46420,11 @@
     <w:pPr>
       <w:keepNext/>
       <w:keepLines/>
-      <w:spacing w:after="120" w:before="0"/>
-      <w:ind w:firstLine="0"/>
+      <w:ind w:firstLine="0" w:left="0"/>
       <w:jc w:val="left"/>
       <w:outlineLvl w:val="0"/>
       <w:shd w:color="auto" w:fill="FFFF00" w:val="clear"/>
+      <w:spacing w:after="160" w:before="0"/>
     </w:pPr>
     <w:rPr>
       <w:rFonts w:ascii="Calibri" w:asciiTheme="majorHAnsi" w:cstheme="majorBidi" w:eastAsiaTheme="majorEastAsia" w:hAnsi="Calibri" w:hAnsiTheme="majorHAnsi"/>
@@ -46522,11 +46448,10 @@
     <w:pPr>
       <w:keepNext/>
       <w:keepLines/>
-      <w:spacing w:after="80" w:before="240"/>
-      <w:ind w:firstLine="0"/>
+      <w:ind w:firstLine="0" w:left="0"/>
       <w:jc w:val="left"/>
       <w:outlineLvl w:val="1"/>
-      <w:shd w:color="auto" w:fill="FFFF00" w:val="clear"/>
+      <w:spacing w:after="80" w:before="240"/>
     </w:pPr>
     <w:rPr>
       <w:rFonts w:ascii="Calibri" w:asciiTheme="majorHAnsi" w:cstheme="majorBidi" w:eastAsiaTheme="majorEastAsia" w:hAnsi="Calibri" w:hAnsiTheme="majorHAnsi"/>
@@ -46534,8 +46459,7 @@
       <w:bCs/>
       <w:color w:val="000000"/>
       <w:sz w:val="22"/>
-      <w:szCs w:val="26"/>
-      <w:highlight w:val="yellow"/>
+      <w:szCs w:val="22"/>
     </w:rPr>
   </w:style>
   <w:style w:styleId="Heading3" w:type="paragraph">
@@ -46550,11 +46474,10 @@
     <w:pPr>
       <w:keepNext/>
       <w:keepLines/>
-      <w:spacing w:after="80" w:before="160"/>
-      <w:ind w:firstLine="0"/>
+      <w:ind w:firstLine="0" w:left="0"/>
       <w:jc w:val="left"/>
       <w:outlineLvl w:val="2"/>
-      <w:shd w:color="auto" w:fill="FFFF00" w:val="clear"/>
+      <w:spacing w:after="80" w:before="160"/>
     </w:pPr>
     <w:rPr>
       <w:rFonts w:ascii="Calibri" w:asciiTheme="majorHAnsi" w:cstheme="majorBidi" w:eastAsiaTheme="majorEastAsia" w:hAnsi="Calibri" w:hAnsiTheme="majorHAnsi"/>
@@ -46563,7 +46486,7 @@
       <w:i w:val="0"/>
       <w:color w:val="000000"/>
       <w:sz w:val="22"/>
-      <w:highlight w:val="yellow"/>
+      <w:szCs w:val="22"/>
     </w:rPr>
   </w:style>
   <w:style w:styleId="Heading4" w:type="paragraph">
@@ -46872,6 +46795,7 @@
     <w:pPr>
       <w:ind w:left="720"/>
       <w:contextualSpacing/>
+      <w:spacing w:after="60"/>
     </w:pPr>
   </w:style>
   <w:style w:styleId="BodyText" w:type="paragraph">
@@ -46882,8 +46806,8 @@
     <w:unhideWhenUsed/>
     <w:rsid w:val="00AA1D8D"/>
     <w:pPr>
-      <w:spacing w:after="120"/>
       <w:jc w:val="both"/>
+      <w:spacing w:after="120" w:line="290" w:lineRule="exact"/>
     </w:pPr>
     <w:rPr>
       <w:rFonts w:ascii="Calibri" w:hAnsi="Calibri"/>
@@ -58140,6 +58064,20 @@
       </w:tcPr>
     </w:tblStylePr>
   </w:style>
+  <w:style w:styleId="FirstParagraph" w:type="paragraph">
+    <w:name w:val="First Paragraph"/>
+    <w:basedOn w:val="Normal"/>
+    <w:qFormat/>
+    <w:pPr>
+      <w:spacing w:after="120" w:line="290" w:lineRule="exact"/>
+      <w:ind w:firstLine="360"/>
+      <w:jc w:val="both"/>
+    </w:pPr>
+    <w:rPr>
+      <w:rFonts w:ascii="Calibri" w:hAnsi="Calibri"/>
+      <w:sz w:val="22"/>
+    </w:rPr>
+  </w:style>
   <w:style w:type="paragraph" w:customStyle="1" w:styleId="SourceCode">
     <w:name w:val="Source Code"/>
     <w:basedOn w:val="Normal"/>

</xml_diff>